<commit_message>
Ajustes de hallazgos por parte de repositorio
</commit_message>
<xml_diff>
--- a/fuentes/CFA1_12150024_DU.docx
+++ b/fuentes/CFA1_12150024_DU.docx
@@ -505,7 +505,7 @@
           <w:r>
             <w:fldChar w:fldCharType="separate"/>
           </w:r>
-          <w:hyperlink w:anchor="_Toc210637651" w:history="1">
+          <w:hyperlink w:anchor="_Toc211353640" w:history="1">
             <w:r>
               <w:rPr>
                 <w:rStyle w:val="Hipervnculo"/>
@@ -532,7 +532,7 @@
                 <w:noProof/>
                 <w:webHidden/>
               </w:rPr>
-              <w:instrText xml:space="preserve"> PAGEREF _Toc210637651 \h </w:instrText>
+              <w:instrText xml:space="preserve"> PAGEREF _Toc211353640 \h </w:instrText>
             </w:r>
             <w:r>
               <w:rPr>
@@ -578,7 +578,7 @@
               <w:lang w:eastAsia="es-MX"/>
             </w:rPr>
           </w:pPr>
-          <w:hyperlink w:anchor="_Toc210637652" w:history="1">
+          <w:hyperlink w:anchor="_Toc211353641" w:history="1">
             <w:r>
               <w:rPr>
                 <w:rStyle w:val="Hipervnculo"/>
@@ -622,7 +622,7 @@
                 <w:noProof/>
                 <w:webHidden/>
               </w:rPr>
-              <w:instrText xml:space="preserve"> PAGEREF _Toc210637652 \h </w:instrText>
+              <w:instrText xml:space="preserve"> PAGEREF _Toc211353641 \h </w:instrText>
             </w:r>
             <w:r>
               <w:rPr>
@@ -664,7 +664,7 @@
               <w:lang w:eastAsia="es-MX"/>
             </w:rPr>
           </w:pPr>
-          <w:hyperlink w:anchor="_Toc210637653" w:history="1">
+          <w:hyperlink w:anchor="_Toc211353642" w:history="1">
             <w:r>
               <w:rPr>
                 <w:rStyle w:val="Hipervnculo"/>
@@ -708,7 +708,7 @@
                 <w:noProof/>
                 <w:webHidden/>
               </w:rPr>
-              <w:instrText xml:space="preserve"> PAGEREF _Toc210637653 \h </w:instrText>
+              <w:instrText xml:space="preserve"> PAGEREF _Toc211353642 \h </w:instrText>
             </w:r>
             <w:r>
               <w:rPr>
@@ -750,7 +750,7 @@
               <w:lang w:eastAsia="es-MX"/>
             </w:rPr>
           </w:pPr>
-          <w:hyperlink w:anchor="_Toc210637654" w:history="1">
+          <w:hyperlink w:anchor="_Toc211353643" w:history="1">
             <w:r>
               <w:rPr>
                 <w:rStyle w:val="Hipervnculo"/>
@@ -794,7 +794,7 @@
                 <w:noProof/>
                 <w:webHidden/>
               </w:rPr>
-              <w:instrText xml:space="preserve"> PAGEREF _Toc210637654 \h </w:instrText>
+              <w:instrText xml:space="preserve"> PAGEREF _Toc211353643 \h </w:instrText>
             </w:r>
             <w:r>
               <w:rPr>
@@ -840,7 +840,7 @@
               <w:lang w:eastAsia="es-MX"/>
             </w:rPr>
           </w:pPr>
-          <w:hyperlink w:anchor="_Toc210637655" w:history="1">
+          <w:hyperlink w:anchor="_Toc211353644" w:history="1">
             <w:r>
               <w:rPr>
                 <w:rStyle w:val="Hipervnculo"/>
@@ -884,7 +884,7 @@
                 <w:noProof/>
                 <w:webHidden/>
               </w:rPr>
-              <w:instrText xml:space="preserve"> PAGEREF _Toc210637655 \h </w:instrText>
+              <w:instrText xml:space="preserve"> PAGEREF _Toc211353644 \h </w:instrText>
             </w:r>
             <w:r>
               <w:rPr>
@@ -926,7 +926,7 @@
               <w:lang w:eastAsia="es-MX"/>
             </w:rPr>
           </w:pPr>
-          <w:hyperlink w:anchor="_Toc210637656" w:history="1">
+          <w:hyperlink w:anchor="_Toc211353645" w:history="1">
             <w:r>
               <w:rPr>
                 <w:rStyle w:val="Hipervnculo"/>
@@ -953,7 +953,7 @@
                 <w:noProof/>
                 <w:webHidden/>
               </w:rPr>
-              <w:instrText xml:space="preserve"> PAGEREF _Toc210637656 \h </w:instrText>
+              <w:instrText xml:space="preserve"> PAGEREF _Toc211353645 \h </w:instrText>
             </w:r>
             <w:r>
               <w:rPr>
@@ -995,7 +995,7 @@
               <w:lang w:eastAsia="es-MX"/>
             </w:rPr>
           </w:pPr>
-          <w:hyperlink w:anchor="_Toc210637657" w:history="1">
+          <w:hyperlink w:anchor="_Toc211353646" w:history="1">
             <w:r>
               <w:rPr>
                 <w:rStyle w:val="Hipervnculo"/>
@@ -1022,7 +1022,7 @@
                 <w:noProof/>
                 <w:webHidden/>
               </w:rPr>
-              <w:instrText xml:space="preserve"> PAGEREF _Toc210637657 \h </w:instrText>
+              <w:instrText xml:space="preserve"> PAGEREF _Toc211353646 \h </w:instrText>
             </w:r>
             <w:r>
               <w:rPr>
@@ -1064,7 +1064,7 @@
               <w:lang w:eastAsia="es-MX"/>
             </w:rPr>
           </w:pPr>
-          <w:hyperlink w:anchor="_Toc210637658" w:history="1">
+          <w:hyperlink w:anchor="_Toc211353647" w:history="1">
             <w:r>
               <w:rPr>
                 <w:rStyle w:val="Hipervnculo"/>
@@ -1091,7 +1091,7 @@
                 <w:noProof/>
                 <w:webHidden/>
               </w:rPr>
-              <w:instrText xml:space="preserve"> PAGEREF _Toc210637658 \h </w:instrText>
+              <w:instrText xml:space="preserve"> PAGEREF _Toc211353647 \h </w:instrText>
             </w:r>
             <w:r>
               <w:rPr>
@@ -1137,7 +1137,7 @@
               <w:lang w:eastAsia="es-MX"/>
             </w:rPr>
           </w:pPr>
-          <w:hyperlink w:anchor="_Toc210637659" w:history="1">
+          <w:hyperlink w:anchor="_Toc211353648" w:history="1">
             <w:r>
               <w:rPr>
                 <w:rStyle w:val="Hipervnculo"/>
@@ -1181,7 +1181,7 @@
                 <w:noProof/>
                 <w:webHidden/>
               </w:rPr>
-              <w:instrText xml:space="preserve"> PAGEREF _Toc210637659 \h </w:instrText>
+              <w:instrText xml:space="preserve"> PAGEREF _Toc211353648 \h </w:instrText>
             </w:r>
             <w:r>
               <w:rPr>
@@ -1223,7 +1223,7 @@
               <w:lang w:eastAsia="es-MX"/>
             </w:rPr>
           </w:pPr>
-          <w:hyperlink w:anchor="_Toc210637660" w:history="1">
+          <w:hyperlink w:anchor="_Toc211353649" w:history="1">
             <w:r>
               <w:rPr>
                 <w:rStyle w:val="Hipervnculo"/>
@@ -1250,7 +1250,7 @@
                 <w:noProof/>
                 <w:webHidden/>
               </w:rPr>
-              <w:instrText xml:space="preserve"> PAGEREF _Toc210637660 \h </w:instrText>
+              <w:instrText xml:space="preserve"> PAGEREF _Toc211353649 \h </w:instrText>
             </w:r>
             <w:r>
               <w:rPr>
@@ -1292,7 +1292,7 @@
               <w:lang w:eastAsia="es-MX"/>
             </w:rPr>
           </w:pPr>
-          <w:hyperlink w:anchor="_Toc210637661" w:history="1">
+          <w:hyperlink w:anchor="_Toc211353650" w:history="1">
             <w:r>
               <w:rPr>
                 <w:rStyle w:val="Hipervnculo"/>
@@ -1319,7 +1319,7 @@
                 <w:noProof/>
                 <w:webHidden/>
               </w:rPr>
-              <w:instrText xml:space="preserve"> PAGEREF _Toc210637661 \h </w:instrText>
+              <w:instrText xml:space="preserve"> PAGEREF _Toc211353650 \h </w:instrText>
             </w:r>
             <w:r>
               <w:rPr>
@@ -1361,7 +1361,7 @@
               <w:lang w:eastAsia="es-MX"/>
             </w:rPr>
           </w:pPr>
-          <w:hyperlink w:anchor="_Toc210637662" w:history="1">
+          <w:hyperlink w:anchor="_Toc211353651" w:history="1">
             <w:r>
               <w:rPr>
                 <w:rStyle w:val="Hipervnculo"/>
@@ -1388,7 +1388,7 @@
                 <w:noProof/>
                 <w:webHidden/>
               </w:rPr>
-              <w:instrText xml:space="preserve"> PAGEREF _Toc210637662 \h </w:instrText>
+              <w:instrText xml:space="preserve"> PAGEREF _Toc211353651 \h </w:instrText>
             </w:r>
             <w:r>
               <w:rPr>
@@ -1430,37 +1430,13 @@
               <w:lang w:eastAsia="es-MX"/>
             </w:rPr>
           </w:pPr>
-          <w:hyperlink w:anchor="_Toc210637663" w:history="1">
-            <w:r>
-              <w:rPr>
-                <w:rStyle w:val="Hipervnculo"/>
-                <w:bCs/>
-                <w:noProof/>
-              </w:rPr>
-              <w:t xml:space="preserve">Fuente: </w:t>
-            </w:r>
+          <w:hyperlink w:anchor="_Toc211353652" w:history="1">
             <w:r>
               <w:rPr>
                 <w:rStyle w:val="Hipervnculo"/>
                 <w:noProof/>
               </w:rPr>
-              <w:t xml:space="preserve">tomado y adaptado de Tipos de almacenes: Características y diferencias, por </w:t>
-            </w:r>
-            <w:r>
-              <w:rPr>
-                <w:rStyle w:val="Hipervnculo"/>
-                <w:bCs/>
-                <w:noProof/>
-                <w:spacing w:val="20"/>
-              </w:rPr>
-              <w:t>AR Racking</w:t>
-            </w:r>
-            <w:r>
-              <w:rPr>
-                <w:rStyle w:val="Hipervnculo"/>
-                <w:noProof/>
-              </w:rPr>
-              <w:t>, 2025.</w:t>
+              <w:t>3.4 Funciones</w:t>
             </w:r>
             <w:r>
               <w:rPr>
@@ -1481,246 +1457,7 @@
                 <w:noProof/>
                 <w:webHidden/>
               </w:rPr>
-              <w:instrText xml:space="preserve"> PAGEREF _Toc210637663 \h </w:instrText>
-            </w:r>
-            <w:r>
-              <w:rPr>
-                <w:noProof/>
-                <w:webHidden/>
-              </w:rPr>
-            </w:r>
-            <w:r>
-              <w:rPr>
-                <w:noProof/>
-                <w:webHidden/>
-              </w:rPr>
-              <w:fldChar w:fldCharType="separate"/>
-            </w:r>
-            <w:r>
-              <w:rPr>
-                <w:noProof/>
-                <w:webHidden/>
-              </w:rPr>
-              <w:t>28</w:t>
-            </w:r>
-            <w:r>
-              <w:rPr>
-                <w:noProof/>
-                <w:webHidden/>
-              </w:rPr>
-              <w:fldChar w:fldCharType="end"/>
-            </w:r>
-          </w:hyperlink>
-        </w:p>
-        <w:p>
-          <w:pPr>
-            <w:pStyle w:val="TDC2"/>
-            <w:rPr>
-              <w:rFonts w:eastAsiaTheme="minorEastAsia"/>
-              <w:noProof/>
-              <w:sz w:val="24"/>
-              <w:szCs w:val="24"/>
-              <w:lang w:eastAsia="es-MX"/>
-            </w:rPr>
-          </w:pPr>
-          <w:hyperlink w:anchor="_Toc210637664" w:history="1">
-            <w:r>
-              <w:rPr>
-                <w:rStyle w:val="Hipervnculo"/>
-                <w:bCs/>
-                <w:noProof/>
-              </w:rPr>
-              <w:t xml:space="preserve">Fuente: </w:t>
-            </w:r>
-            <w:r>
-              <w:rPr>
-                <w:rStyle w:val="Hipervnculo"/>
-                <w:noProof/>
-              </w:rPr>
-              <w:t>SENA; 2025.</w:t>
-            </w:r>
-            <w:r>
-              <w:rPr>
-                <w:noProof/>
-                <w:webHidden/>
-              </w:rPr>
-              <w:tab/>
-            </w:r>
-            <w:r>
-              <w:rPr>
-                <w:noProof/>
-                <w:webHidden/>
-              </w:rPr>
-              <w:fldChar w:fldCharType="begin"/>
-            </w:r>
-            <w:r>
-              <w:rPr>
-                <w:noProof/>
-                <w:webHidden/>
-              </w:rPr>
-              <w:instrText xml:space="preserve"> PAGEREF _Toc210637664 \h </w:instrText>
-            </w:r>
-            <w:r>
-              <w:rPr>
-                <w:noProof/>
-                <w:webHidden/>
-              </w:rPr>
-            </w:r>
-            <w:r>
-              <w:rPr>
-                <w:noProof/>
-                <w:webHidden/>
-              </w:rPr>
-              <w:fldChar w:fldCharType="separate"/>
-            </w:r>
-            <w:r>
-              <w:rPr>
-                <w:noProof/>
-                <w:webHidden/>
-              </w:rPr>
-              <w:t>29</w:t>
-            </w:r>
-            <w:r>
-              <w:rPr>
-                <w:noProof/>
-                <w:webHidden/>
-              </w:rPr>
-              <w:fldChar w:fldCharType="end"/>
-            </w:r>
-          </w:hyperlink>
-        </w:p>
-        <w:p>
-          <w:pPr>
-            <w:pStyle w:val="TDC2"/>
-            <w:rPr>
-              <w:rFonts w:eastAsiaTheme="minorEastAsia"/>
-              <w:noProof/>
-              <w:sz w:val="24"/>
-              <w:szCs w:val="24"/>
-              <w:lang w:eastAsia="es-MX"/>
-            </w:rPr>
-          </w:pPr>
-          <w:hyperlink w:anchor="_Toc210637665" w:history="1">
-            <w:r>
-              <w:rPr>
-                <w:rStyle w:val="Hipervnculo"/>
-                <w:bCs/>
-                <w:noProof/>
-              </w:rPr>
-              <w:t xml:space="preserve">Fuente: </w:t>
-            </w:r>
-            <w:r>
-              <w:rPr>
-                <w:rStyle w:val="Hipervnculo"/>
-                <w:noProof/>
-              </w:rPr>
-              <w:t xml:space="preserve">tomado y adaptado de Tipos de almacenes: Características y diferencias, por </w:t>
-            </w:r>
-            <w:r>
-              <w:rPr>
-                <w:rStyle w:val="Hipervnculo"/>
-                <w:bCs/>
-                <w:noProof/>
-                <w:spacing w:val="20"/>
-              </w:rPr>
-              <w:t>AR Racking</w:t>
-            </w:r>
-            <w:r>
-              <w:rPr>
-                <w:rStyle w:val="Hipervnculo"/>
-                <w:noProof/>
-              </w:rPr>
-              <w:t>, 2025.</w:t>
-            </w:r>
-            <w:r>
-              <w:rPr>
-                <w:noProof/>
-                <w:webHidden/>
-              </w:rPr>
-              <w:tab/>
-            </w:r>
-            <w:r>
-              <w:rPr>
-                <w:noProof/>
-                <w:webHidden/>
-              </w:rPr>
-              <w:fldChar w:fldCharType="begin"/>
-            </w:r>
-            <w:r>
-              <w:rPr>
-                <w:noProof/>
-                <w:webHidden/>
-              </w:rPr>
-              <w:instrText xml:space="preserve"> PAGEREF _Toc210637665 \h </w:instrText>
-            </w:r>
-            <w:r>
-              <w:rPr>
-                <w:noProof/>
-                <w:webHidden/>
-              </w:rPr>
-            </w:r>
-            <w:r>
-              <w:rPr>
-                <w:noProof/>
-                <w:webHidden/>
-              </w:rPr>
-              <w:fldChar w:fldCharType="separate"/>
-            </w:r>
-            <w:r>
-              <w:rPr>
-                <w:noProof/>
-                <w:webHidden/>
-              </w:rPr>
-              <w:t>30</w:t>
-            </w:r>
-            <w:r>
-              <w:rPr>
-                <w:noProof/>
-                <w:webHidden/>
-              </w:rPr>
-              <w:fldChar w:fldCharType="end"/>
-            </w:r>
-          </w:hyperlink>
-        </w:p>
-        <w:p>
-          <w:pPr>
-            <w:pStyle w:val="TDC2"/>
-            <w:rPr>
-              <w:rFonts w:eastAsiaTheme="minorEastAsia"/>
-              <w:noProof/>
-              <w:sz w:val="24"/>
-              <w:szCs w:val="24"/>
-              <w:lang w:eastAsia="es-MX"/>
-            </w:rPr>
-          </w:pPr>
-          <w:hyperlink w:anchor="_Toc210637666" w:history="1">
-            <w:r>
-              <w:rPr>
-                <w:rStyle w:val="Hipervnculo"/>
-                <w:noProof/>
-              </w:rPr>
-              <w:t>3.4 Funciones</w:t>
-            </w:r>
-            <w:r>
-              <w:rPr>
-                <w:noProof/>
-                <w:webHidden/>
-              </w:rPr>
-              <w:tab/>
-            </w:r>
-            <w:r>
-              <w:rPr>
-                <w:noProof/>
-                <w:webHidden/>
-              </w:rPr>
-              <w:fldChar w:fldCharType="begin"/>
-            </w:r>
-            <w:r>
-              <w:rPr>
-                <w:noProof/>
-                <w:webHidden/>
-              </w:rPr>
-              <w:instrText xml:space="preserve"> PAGEREF _Toc210637666 \h </w:instrText>
+              <w:instrText xml:space="preserve"> PAGEREF _Toc211353652 \h </w:instrText>
             </w:r>
             <w:r>
               <w:rPr>
@@ -1766,7 +1503,7 @@
               <w:lang w:eastAsia="es-MX"/>
             </w:rPr>
           </w:pPr>
-          <w:hyperlink w:anchor="_Toc210637667" w:history="1">
+          <w:hyperlink w:anchor="_Toc211353653" w:history="1">
             <w:r>
               <w:rPr>
                 <w:rStyle w:val="Hipervnculo"/>
@@ -1810,7 +1547,7 @@
                 <w:noProof/>
                 <w:webHidden/>
               </w:rPr>
-              <w:instrText xml:space="preserve"> PAGEREF _Toc210637667 \h </w:instrText>
+              <w:instrText xml:space="preserve"> PAGEREF _Toc211353653 \h </w:instrText>
             </w:r>
             <w:r>
               <w:rPr>
@@ -1852,13 +1589,13 @@
               <w:lang w:eastAsia="es-MX"/>
             </w:rPr>
           </w:pPr>
-          <w:hyperlink w:anchor="_Toc210637668" w:history="1">
+          <w:hyperlink w:anchor="_Toc211353654" w:history="1">
             <w:r>
               <w:rPr>
                 <w:rStyle w:val="Hipervnculo"/>
                 <w:noProof/>
               </w:rPr>
-              <w:t>4.2 Etapas</w:t>
+              <w:t>4.1 Concepto</w:t>
             </w:r>
             <w:r>
               <w:rPr>
@@ -1879,7 +1616,7 @@
                 <w:noProof/>
                 <w:webHidden/>
               </w:rPr>
-              <w:instrText xml:space="preserve"> PAGEREF _Toc210637668 \h </w:instrText>
+              <w:instrText xml:space="preserve"> PAGEREF _Toc211353654 \h </w:instrText>
             </w:r>
             <w:r>
               <w:rPr>
@@ -1899,7 +1636,7 @@
                 <w:noProof/>
                 <w:webHidden/>
               </w:rPr>
-              <w:t>34</w:t>
+              <w:t>33</w:t>
             </w:r>
             <w:r>
               <w:rPr>
@@ -1921,21 +1658,13 @@
               <w:lang w:eastAsia="es-MX"/>
             </w:rPr>
           </w:pPr>
-          <w:hyperlink w:anchor="_Toc210637669" w:history="1">
-            <w:r>
-              <w:rPr>
-                <w:rStyle w:val="Hipervnculo"/>
-                <w:bCs/>
-                <w:noProof/>
-              </w:rPr>
-              <w:t xml:space="preserve">Fuente: </w:t>
-            </w:r>
+          <w:hyperlink w:anchor="_Toc211353655" w:history="1">
             <w:r>
               <w:rPr>
                 <w:rStyle w:val="Hipervnculo"/>
                 <w:noProof/>
               </w:rPr>
-              <w:t>SENA, 2025.</w:t>
+              <w:t>4.2 Etapas</w:t>
             </w:r>
             <w:r>
               <w:rPr>
@@ -1956,7 +1685,7 @@
                 <w:noProof/>
                 <w:webHidden/>
               </w:rPr>
-              <w:instrText xml:space="preserve"> PAGEREF _Toc210637669 \h </w:instrText>
+              <w:instrText xml:space="preserve"> PAGEREF _Toc211353655 \h </w:instrText>
             </w:r>
             <w:r>
               <w:rPr>
@@ -1976,7 +1705,7 @@
                 <w:noProof/>
                 <w:webHidden/>
               </w:rPr>
-              <w:t>35</w:t>
+              <w:t>34</w:t>
             </w:r>
             <w:r>
               <w:rPr>
@@ -1998,13 +1727,21 @@
               <w:lang w:eastAsia="es-MX"/>
             </w:rPr>
           </w:pPr>
-          <w:hyperlink w:anchor="_Toc210637670" w:history="1">
+          <w:hyperlink w:anchor="_Toc211353656" w:history="1">
+            <w:r>
+              <w:rPr>
+                <w:rStyle w:val="Hipervnculo"/>
+                <w:bCs/>
+                <w:noProof/>
+              </w:rPr>
+              <w:t xml:space="preserve">Fuente: </w:t>
+            </w:r>
             <w:r>
               <w:rPr>
                 <w:rStyle w:val="Hipervnculo"/>
                 <w:noProof/>
               </w:rPr>
-              <w:t>4.3 Herramientas tecnológicas</w:t>
+              <w:t>SENA, 2025.</w:t>
             </w:r>
             <w:r>
               <w:rPr>
@@ -2025,7 +1762,7 @@
                 <w:noProof/>
                 <w:webHidden/>
               </w:rPr>
-              <w:instrText xml:space="preserve"> PAGEREF _Toc210637670 \h </w:instrText>
+              <w:instrText xml:space="preserve"> PAGEREF _Toc211353656 \h </w:instrText>
             </w:r>
             <w:r>
               <w:rPr>
@@ -2045,7 +1782,76 @@
                 <w:noProof/>
                 <w:webHidden/>
               </w:rPr>
-              <w:t>35</w:t>
+              <w:t>36</w:t>
+            </w:r>
+            <w:r>
+              <w:rPr>
+                <w:noProof/>
+                <w:webHidden/>
+              </w:rPr>
+              <w:fldChar w:fldCharType="end"/>
+            </w:r>
+          </w:hyperlink>
+        </w:p>
+        <w:p>
+          <w:pPr>
+            <w:pStyle w:val="TDC2"/>
+            <w:rPr>
+              <w:rFonts w:eastAsiaTheme="minorEastAsia"/>
+              <w:noProof/>
+              <w:sz w:val="24"/>
+              <w:szCs w:val="24"/>
+              <w:lang w:eastAsia="es-MX"/>
+            </w:rPr>
+          </w:pPr>
+          <w:hyperlink w:anchor="_Toc211353657" w:history="1">
+            <w:r>
+              <w:rPr>
+                <w:rStyle w:val="Hipervnculo"/>
+                <w:noProof/>
+              </w:rPr>
+              <w:t>4.3 Herramientas tecnológicas</w:t>
+            </w:r>
+            <w:r>
+              <w:rPr>
+                <w:noProof/>
+                <w:webHidden/>
+              </w:rPr>
+              <w:tab/>
+            </w:r>
+            <w:r>
+              <w:rPr>
+                <w:noProof/>
+                <w:webHidden/>
+              </w:rPr>
+              <w:fldChar w:fldCharType="begin"/>
+            </w:r>
+            <w:r>
+              <w:rPr>
+                <w:noProof/>
+                <w:webHidden/>
+              </w:rPr>
+              <w:instrText xml:space="preserve"> PAGEREF _Toc211353657 \h </w:instrText>
+            </w:r>
+            <w:r>
+              <w:rPr>
+                <w:noProof/>
+                <w:webHidden/>
+              </w:rPr>
+            </w:r>
+            <w:r>
+              <w:rPr>
+                <w:noProof/>
+                <w:webHidden/>
+              </w:rPr>
+              <w:fldChar w:fldCharType="separate"/>
+            </w:r>
+            <w:r>
+              <w:rPr>
+                <w:noProof/>
+                <w:webHidden/>
+              </w:rPr>
+              <w:t>36</w:t>
             </w:r>
             <w:r>
               <w:rPr>
@@ -2071,7 +1877,7 @@
               <w:lang w:eastAsia="es-MX"/>
             </w:rPr>
           </w:pPr>
-          <w:hyperlink w:anchor="_Toc210637671" w:history="1">
+          <w:hyperlink w:anchor="_Toc211353658" w:history="1">
             <w:r>
               <w:rPr>
                 <w:rStyle w:val="Hipervnculo"/>
@@ -2115,7 +1921,7 @@
                 <w:noProof/>
                 <w:webHidden/>
               </w:rPr>
-              <w:instrText xml:space="preserve"> PAGEREF _Toc210637671 \h </w:instrText>
+              <w:instrText xml:space="preserve"> PAGEREF _Toc211353658 \h </w:instrText>
             </w:r>
             <w:r>
               <w:rPr>
@@ -2157,7 +1963,7 @@
               <w:lang w:eastAsia="es-MX"/>
             </w:rPr>
           </w:pPr>
-          <w:hyperlink w:anchor="_Toc210637672" w:history="1">
+          <w:hyperlink w:anchor="_Toc211353659" w:history="1">
             <w:r>
               <w:rPr>
                 <w:rStyle w:val="Hipervnculo"/>
@@ -2184,7 +1990,7 @@
                 <w:noProof/>
                 <w:webHidden/>
               </w:rPr>
-              <w:instrText xml:space="preserve"> PAGEREF _Toc210637672 \h </w:instrText>
+              <w:instrText xml:space="preserve"> PAGEREF _Toc211353659 \h </w:instrText>
             </w:r>
             <w:r>
               <w:rPr>
@@ -2204,7 +2010,7 @@
                 <w:noProof/>
                 <w:webHidden/>
               </w:rPr>
-              <w:t>38</w:t>
+              <w:t>39</w:t>
             </w:r>
             <w:r>
               <w:rPr>
@@ -2226,7 +2032,7 @@
               <w:lang w:eastAsia="es-MX"/>
             </w:rPr>
           </w:pPr>
-          <w:hyperlink w:anchor="_Toc210637673" w:history="1">
+          <w:hyperlink w:anchor="_Toc211353660" w:history="1">
             <w:r>
               <w:rPr>
                 <w:rStyle w:val="Hipervnculo"/>
@@ -2253,7 +2059,7 @@
                 <w:noProof/>
                 <w:webHidden/>
               </w:rPr>
-              <w:instrText xml:space="preserve"> PAGEREF _Toc210637673 \h </w:instrText>
+              <w:instrText xml:space="preserve"> PAGEREF _Toc211353660 \h </w:instrText>
             </w:r>
             <w:r>
               <w:rPr>
@@ -2273,7 +2079,7 @@
                 <w:noProof/>
                 <w:webHidden/>
               </w:rPr>
-              <w:t>38</w:t>
+              <w:t>39</w:t>
             </w:r>
             <w:r>
               <w:rPr>
@@ -2295,7 +2101,7 @@
               <w:lang w:eastAsia="es-MX"/>
             </w:rPr>
           </w:pPr>
-          <w:hyperlink w:anchor="_Toc210637674" w:history="1">
+          <w:hyperlink w:anchor="_Toc211353661" w:history="1">
             <w:r>
               <w:rPr>
                 <w:rStyle w:val="Hipervnculo"/>
@@ -2330,7 +2136,7 @@
                 <w:noProof/>
                 <w:webHidden/>
               </w:rPr>
-              <w:instrText xml:space="preserve"> PAGEREF _Toc210637674 \h </w:instrText>
+              <w:instrText xml:space="preserve"> PAGEREF _Toc211353661 \h </w:instrText>
             </w:r>
             <w:r>
               <w:rPr>
@@ -2350,7 +2156,7 @@
                 <w:noProof/>
                 <w:webHidden/>
               </w:rPr>
-              <w:t>39</w:t>
+              <w:t>40</w:t>
             </w:r>
             <w:r>
               <w:rPr>
@@ -2372,7 +2178,7 @@
               <w:lang w:eastAsia="es-MX"/>
             </w:rPr>
           </w:pPr>
-          <w:hyperlink w:anchor="_Toc210637675" w:history="1">
+          <w:hyperlink w:anchor="_Toc211353662" w:history="1">
             <w:r>
               <w:rPr>
                 <w:rStyle w:val="Hipervnculo"/>
@@ -2399,7 +2205,7 @@
                 <w:noProof/>
                 <w:webHidden/>
               </w:rPr>
-              <w:instrText xml:space="preserve"> PAGEREF _Toc210637675 \h </w:instrText>
+              <w:instrText xml:space="preserve"> PAGEREF _Toc211353662 \h </w:instrText>
             </w:r>
             <w:r>
               <w:rPr>
@@ -2419,7 +2225,7 @@
                 <w:noProof/>
                 <w:webHidden/>
               </w:rPr>
-              <w:t>39</w:t>
+              <w:t>40</w:t>
             </w:r>
             <w:r>
               <w:rPr>
@@ -2444,7 +2250,7 @@
               <w:lang w:eastAsia="es-MX"/>
             </w:rPr>
           </w:pPr>
-          <w:hyperlink w:anchor="_Toc210637676" w:history="1">
+          <w:hyperlink w:anchor="_Toc211353663" w:history="1">
             <w:r>
               <w:rPr>
                 <w:rStyle w:val="Hipervnculo"/>
@@ -2471,7 +2277,7 @@
                 <w:noProof/>
                 <w:webHidden/>
               </w:rPr>
-              <w:instrText xml:space="preserve"> PAGEREF _Toc210637676 \h </w:instrText>
+              <w:instrText xml:space="preserve"> PAGEREF _Toc211353663 \h </w:instrText>
             </w:r>
             <w:r>
               <w:rPr>
@@ -2491,7 +2297,7 @@
                 <w:noProof/>
                 <w:webHidden/>
               </w:rPr>
-              <w:t>41</w:t>
+              <w:t>42</w:t>
             </w:r>
             <w:r>
               <w:rPr>
@@ -2516,7 +2322,7 @@
               <w:lang w:eastAsia="es-MX"/>
             </w:rPr>
           </w:pPr>
-          <w:hyperlink w:anchor="_Toc210637677" w:history="1">
+          <w:hyperlink w:anchor="_Toc211353664" w:history="1">
             <w:r>
               <w:rPr>
                 <w:rStyle w:val="Hipervnculo"/>
@@ -2543,7 +2349,7 @@
                 <w:noProof/>
                 <w:webHidden/>
               </w:rPr>
-              <w:instrText xml:space="preserve"> PAGEREF _Toc210637677 \h </w:instrText>
+              <w:instrText xml:space="preserve"> PAGEREF _Toc211353664 \h </w:instrText>
             </w:r>
             <w:r>
               <w:rPr>
@@ -2563,7 +2369,7 @@
                 <w:noProof/>
                 <w:webHidden/>
               </w:rPr>
-              <w:t>42</w:t>
+              <w:t>43</w:t>
             </w:r>
             <w:r>
               <w:rPr>
@@ -2588,7 +2394,7 @@
               <w:lang w:eastAsia="es-MX"/>
             </w:rPr>
           </w:pPr>
-          <w:hyperlink w:anchor="_Toc210637678" w:history="1">
+          <w:hyperlink w:anchor="_Toc211353665" w:history="1">
             <w:r>
               <w:rPr>
                 <w:rStyle w:val="Hipervnculo"/>
@@ -2615,7 +2421,7 @@
                 <w:noProof/>
                 <w:webHidden/>
               </w:rPr>
-              <w:instrText xml:space="preserve"> PAGEREF _Toc210637678 \h </w:instrText>
+              <w:instrText xml:space="preserve"> PAGEREF _Toc211353665 \h </w:instrText>
             </w:r>
             <w:r>
               <w:rPr>
@@ -2635,7 +2441,7 @@
                 <w:noProof/>
                 <w:webHidden/>
               </w:rPr>
-              <w:t>44</w:t>
+              <w:t>45</w:t>
             </w:r>
             <w:r>
               <w:rPr>
@@ -2660,7 +2466,7 @@
               <w:lang w:eastAsia="es-MX"/>
             </w:rPr>
           </w:pPr>
-          <w:hyperlink w:anchor="_Toc210637679" w:history="1">
+          <w:hyperlink w:anchor="_Toc211353666" w:history="1">
             <w:r>
               <w:rPr>
                 <w:rStyle w:val="Hipervnculo"/>
@@ -2687,7 +2493,7 @@
                 <w:noProof/>
                 <w:webHidden/>
               </w:rPr>
-              <w:instrText xml:space="preserve"> PAGEREF _Toc210637679 \h </w:instrText>
+              <w:instrText xml:space="preserve"> PAGEREF _Toc211353666 \h </w:instrText>
             </w:r>
             <w:r>
               <w:rPr>
@@ -2707,7 +2513,7 @@
                 <w:noProof/>
                 <w:webHidden/>
               </w:rPr>
-              <w:t>45</w:t>
+              <w:t>46</w:t>
             </w:r>
             <w:r>
               <w:rPr>
@@ -2732,7 +2538,7 @@
               <w:lang w:eastAsia="es-MX"/>
             </w:rPr>
           </w:pPr>
-          <w:hyperlink w:anchor="_Toc210637680" w:history="1">
+          <w:hyperlink w:anchor="_Toc211353667" w:history="1">
             <w:r>
               <w:rPr>
                 <w:rStyle w:val="Hipervnculo"/>
@@ -2759,7 +2565,7 @@
                 <w:noProof/>
                 <w:webHidden/>
               </w:rPr>
-              <w:instrText xml:space="preserve"> PAGEREF _Toc210637680 \h </w:instrText>
+              <w:instrText xml:space="preserve"> PAGEREF _Toc211353667 \h </w:instrText>
             </w:r>
             <w:r>
               <w:rPr>
@@ -2779,7 +2585,7 @@
                 <w:noProof/>
                 <w:webHidden/>
               </w:rPr>
-              <w:t>46</w:t>
+              <w:t>47</w:t>
             </w:r>
             <w:r>
               <w:rPr>
@@ -2816,7 +2622,7 @@
       <w:pPr>
         <w:pStyle w:val="Titulosgenerales"/>
       </w:pPr>
-      <w:bookmarkStart w:id="0" w:name="_Toc210637651"/>
+      <w:bookmarkStart w:id="0" w:name="_Toc211353640"/>
       <w:r>
         <w:lastRenderedPageBreak/>
         <w:t>Introducción</w:t>
@@ -2900,9 +2706,9 @@
           <w:lang w:val="es-419"/>
         </w:rPr>
         <w:drawing>
-          <wp:inline distT="0" distB="0" distL="0" distR="0" wp14:anchorId="598CAE7F" wp14:editId="5AF61AF6">
-            <wp:extent cx="5015221" cy="2820936"/>
-            <wp:effectExtent l="0" t="0" r="1905" b="0"/>
+          <wp:inline distT="0" distB="0" distL="0" distR="0" wp14:anchorId="598CAE7F" wp14:editId="38D579F9">
+            <wp:extent cx="5695078" cy="3203339"/>
+            <wp:effectExtent l="0" t="0" r="0" b="0"/>
             <wp:docPr id="1946371712" name="Imagen 1">
               <a:extLst xmlns:a="http://schemas.openxmlformats.org/drawingml/2006/main">
                 <a:ext uri="{C183D7F6-B498-43B3-948B-1728B52AA6E4}">
@@ -2935,7 +2741,7 @@
                   <pic:spPr>
                     <a:xfrm>
                       <a:off x="0" y="0"/>
-                      <a:ext cx="5049365" cy="2840141"/>
+                      <a:ext cx="5765831" cy="3243136"/>
                     </a:xfrm>
                     <a:prstGeom prst="rect">
                       <a:avLst/>
@@ -2946,6 +2752,33 @@
             </a:graphic>
           </wp:inline>
         </w:drawing>
+      </w:r>
+    </w:p>
+    <w:p>
+      <w:pPr>
+        <w:rPr>
+          <w:sz w:val="24"/>
+          <w:szCs w:val="24"/>
+          <w:lang w:val="es-419"/>
+        </w:rPr>
+      </w:pPr>
+      <w:r>
+        <w:rPr>
+          <w:b/>
+          <w:bCs/>
+          <w:sz w:val="24"/>
+          <w:szCs w:val="24"/>
+          <w:lang w:val="es-419"/>
+        </w:rPr>
+        <w:t>Fuente:</w:t>
+      </w:r>
+      <w:r>
+        <w:rPr>
+          <w:sz w:val="24"/>
+          <w:szCs w:val="24"/>
+          <w:lang w:val="es-419"/>
+        </w:rPr>
+        <w:t xml:space="preserve"> SENA, 2025.</w:t>
       </w:r>
     </w:p>
     <w:p>
@@ -3049,12 +2882,15 @@
           </w:p>
           <w:p>
             <w:r>
-              <w:t>Inicia con el flujo de bienes, eje central que garantiza la eficiencia en la cadena de suministro; proceso ordenado que abarca desde la recepción de mercancías hasta su despacho, cumpliendo con normativas. En este recorrido, se explorará el concepto de bienes y los tipos existentes, entendidos como aquellos elementos tangibles o intangibles que satisfacen necesidades humanas.</w:t>
+              <w:t xml:space="preserve">Inicia con el flujo de bienes, eje central que garantiza la eficiencia en la cadena de suministro; proceso ordenado que abarca desde la recepción de mercancías hasta su despacho, cumpliendo con normativas. En este recorrido, se explorará el concepto </w:t>
+            </w:r>
+            <w:r>
+              <w:lastRenderedPageBreak/>
+              <w:t>de bienes y los tipos existentes, entendidos como aquellos elementos tangibles o intangibles que satisfacen necesidades humanas.</w:t>
             </w:r>
           </w:p>
           <w:p>
             <w:r>
-              <w:lastRenderedPageBreak/>
               <w:t>Además, el almacén surge como un eslabón clave en este proceso, siendo el espacio físico o virtual donde los bienes se guardan, protegen y distribuyen. Existen diferentes tipos de almacenes, cada uno con características y funciones específicas, adaptadas a las necesidades logísticas de las organizaciones. La correcta gestión del almacén optimiza tiempos y reduce costos.</w:t>
             </w:r>
           </w:p>
@@ -3123,7 +2959,7 @@
       <w:pPr>
         <w:pStyle w:val="Ttulo1"/>
       </w:pPr>
-      <w:bookmarkStart w:id="1" w:name="_Toc210637652"/>
+      <w:bookmarkStart w:id="1" w:name="_Toc211353641"/>
       <w:r>
         <w:lastRenderedPageBreak/>
         <w:t>Flujo de bienes</w:t>
@@ -3160,7 +2996,7 @@
           <w:rFonts w:eastAsia="Times New Roman"/>
         </w:rPr>
       </w:pPr>
-      <w:bookmarkStart w:id="2" w:name="_Toc210637653"/>
+      <w:bookmarkStart w:id="2" w:name="_Toc211353642"/>
       <w:r>
         <w:t>Concepto</w:t>
       </w:r>
@@ -3252,7 +3088,7 @@
           <w:lang w:val="es-419" w:eastAsia="es-CO"/>
         </w:rPr>
         <w:drawing>
-          <wp:inline distT="0" distB="0" distL="0" distR="0" wp14:anchorId="32BE8FD0" wp14:editId="48121830">
+          <wp:inline distT="0" distB="0" distL="0" distR="0" wp14:anchorId="32BE8FD0" wp14:editId="2EF2D993">
             <wp:extent cx="3024837" cy="5430130"/>
             <wp:effectExtent l="0" t="0" r="0" b="5715"/>
             <wp:docPr id="1228074457" name="Imagen 1" descr="En la figura 1 se presentan los elementos clave en el flujo de bienes, tales como: movimiento físico de mercanciías, gestión documental y trazabilidad y optimización de estacio y recursos."/>
@@ -3644,7 +3480,7 @@
           <w:numId w:val="7"/>
         </w:numPr>
       </w:pPr>
-      <w:bookmarkStart w:id="3" w:name="_Toc210637654"/>
+      <w:bookmarkStart w:id="3" w:name="_Toc211353643"/>
       <w:r>
         <w:t>Normativa</w:t>
       </w:r>
@@ -3679,9 +3515,9 @@
         <w:tblDescription w:val="En la tabla 1 se describe la normativa del flujo de bienes de almacén de acuerdo a aspectos como, la seguridad y salud laboral y la calidad y gestión."/>
       </w:tblPr>
       <w:tblGrid>
-        <w:gridCol w:w="1838"/>
-        <w:gridCol w:w="3093"/>
-        <w:gridCol w:w="5031"/>
+        <w:gridCol w:w="1836"/>
+        <w:gridCol w:w="3117"/>
+        <w:gridCol w:w="5009"/>
       </w:tblGrid>
       <w:tr>
         <w:trPr>
@@ -4098,7 +3934,55 @@
                 <w:color w:val="000000"/>
                 <w:szCs w:val="28"/>
               </w:rPr>
-              <w:t xml:space="preserve">Directiva Europea 89/391/CEE (Prevención de </w:t>
+              <w:t>Directiva Europea 89</w:t>
+            </w:r>
+            <w:r>
+              <w:rPr>
+                <w:rFonts w:eastAsia="Times New Roman"/>
+                <w:color w:val="000000"/>
+                <w:szCs w:val="28"/>
+              </w:rPr>
+              <w:t xml:space="preserve"> </w:t>
+            </w:r>
+            <w:r>
+              <w:rPr>
+                <w:rFonts w:eastAsia="Times New Roman"/>
+                <w:color w:val="000000"/>
+                <w:szCs w:val="28"/>
+              </w:rPr>
+              <w:t>/</w:t>
+            </w:r>
+            <w:r>
+              <w:rPr>
+                <w:rFonts w:eastAsia="Times New Roman"/>
+                <w:color w:val="000000"/>
+                <w:szCs w:val="28"/>
+              </w:rPr>
+              <w:t xml:space="preserve"> </w:t>
+            </w:r>
+            <w:r>
+              <w:rPr>
+                <w:rFonts w:eastAsia="Times New Roman"/>
+                <w:color w:val="000000"/>
+                <w:szCs w:val="28"/>
+              </w:rPr>
+              <w:t>391</w:t>
+            </w:r>
+            <w:r>
+              <w:rPr>
+                <w:rFonts w:eastAsia="Times New Roman"/>
+                <w:color w:val="000000"/>
+                <w:szCs w:val="28"/>
+              </w:rPr>
+              <w:t xml:space="preserve"> </w:t>
+            </w:r>
+            <w:r>
+              <w:rPr>
+                <w:rFonts w:eastAsia="Times New Roman"/>
+                <w:color w:val="000000"/>
+                <w:szCs w:val="28"/>
+              </w:rPr>
+              <w:t xml:space="preserve">/CEE (Prevención de </w:t>
             </w:r>
             <w:r>
               <w:rPr>
@@ -4711,7 +4595,7 @@
           <w:lang w:val="es-419"/>
         </w:rPr>
       </w:pPr>
-      <w:bookmarkStart w:id="4" w:name="_Toc210637655"/>
+      <w:bookmarkStart w:id="4" w:name="_Toc211353644"/>
       <w:r>
         <w:rPr>
           <w:rStyle w:val="Extranjerismo"/>
@@ -4738,7 +4622,7 @@
       <w:pPr>
         <w:pStyle w:val="Ttulo2"/>
       </w:pPr>
-      <w:bookmarkStart w:id="5" w:name="_Toc210637656"/>
+      <w:bookmarkStart w:id="5" w:name="_Toc211353645"/>
       <w:r>
         <w:t>2.1 Concepto</w:t>
       </w:r>
@@ -5110,7 +4994,7 @@
       <w:pPr>
         <w:pStyle w:val="Ttulo2"/>
       </w:pPr>
-      <w:bookmarkStart w:id="6" w:name="_Toc210637657"/>
+      <w:bookmarkStart w:id="6" w:name="_Toc211353646"/>
       <w:r>
         <w:lastRenderedPageBreak/>
         <w:t>2.2 Tipos</w:t>
@@ -5158,7 +5042,19 @@
         <w:rPr>
           <w:lang w:val="es-419" w:eastAsia="es-CO"/>
         </w:rPr>
-        <w:t>Optimizar el almacenamiento asignando espacios específicos según los requerimientos, como refrigeración o medidas de seguridad.</w:t>
+        <w:t>Optimizar el almacenamiento</w:t>
+      </w:r>
+      <w:r>
+        <w:rPr>
+          <w:lang w:val="es-419" w:eastAsia="es-CO"/>
+        </w:rPr>
+        <w:t>,</w:t>
+      </w:r>
+      <w:r>
+        <w:rPr>
+          <w:lang w:val="es-419" w:eastAsia="es-CO"/>
+        </w:rPr>
+        <w:t xml:space="preserve"> asignando espacios específicos según los requerimientos, como refrigeración o medidas de seguridad.</w:t>
       </w:r>
     </w:p>
     <w:p>
@@ -5176,7 +5072,19 @@
         <w:rPr>
           <w:lang w:val="es-419" w:eastAsia="es-CO"/>
         </w:rPr>
-        <w:t>Mejorar el transporte eligiendo los vehículos y rutas más apropiados para cada tipo de carga.</w:t>
+        <w:t>Mejorar el transporte</w:t>
+      </w:r>
+      <w:r>
+        <w:rPr>
+          <w:lang w:val="es-419" w:eastAsia="es-CO"/>
+        </w:rPr>
+        <w:t>,</w:t>
+      </w:r>
+      <w:r>
+        <w:rPr>
+          <w:lang w:val="es-419" w:eastAsia="es-CO"/>
+        </w:rPr>
+        <w:t xml:space="preserve"> eligiendo los vehículos y rutas más apropiados para cada tipo de carga.</w:t>
       </w:r>
     </w:p>
     <w:p>
@@ -8178,7 +8086,7 @@
       <w:pPr>
         <w:pStyle w:val="Ttulo2"/>
       </w:pPr>
-      <w:bookmarkStart w:id="7" w:name="_Toc210637658"/>
+      <w:bookmarkStart w:id="7" w:name="_Toc211353647"/>
       <w:r>
         <w:t>2.3 Fichas técnicas</w:t>
       </w:r>
@@ -8487,6 +8395,12 @@
         </w:rPr>
         <w:t>Estructura general para las fichas técnicas</w:t>
       </w:r>
+      <w:r>
+        <w:rPr>
+          <w:lang w:val="es-419" w:eastAsia="es-CO"/>
+        </w:rPr>
+        <w:t xml:space="preserve"> de bienes</w:t>
+      </w:r>
     </w:p>
     <w:tbl>
       <w:tblPr>
@@ -8611,6 +8525,14 @@
               </w:rPr>
               <w:t>Código/Nombre comercial</w:t>
             </w:r>
+            <w:r>
+              <w:rPr>
+                <w:rFonts w:eastAsia="Times New Roman" w:cs="Calibri"/>
+                <w:color w:val="000000"/>
+                <w:szCs w:val="28"/>
+              </w:rPr>
+              <w:t>.</w:t>
+            </w:r>
           </w:p>
         </w:tc>
         <w:tc>
@@ -8652,6 +8574,14 @@
               </w:rPr>
               <w:t>Fabricante/Proveedor</w:t>
             </w:r>
+            <w:r>
+              <w:rPr>
+                <w:rFonts w:eastAsia="Times New Roman" w:cs="Calibri"/>
+                <w:color w:val="000000"/>
+                <w:szCs w:val="28"/>
+              </w:rPr>
+              <w:t>.</w:t>
+            </w:r>
           </w:p>
         </w:tc>
         <w:tc>
@@ -8691,6 +8621,16 @@
                 <w:szCs w:val="28"/>
               </w:rPr>
               <w:t>2. Características físicas</w:t>
+            </w:r>
+            <w:r>
+              <w:rPr>
+                <w:rFonts w:eastAsia="Times New Roman" w:cs="Calibri"/>
+                <w:b/>
+                <w:bCs/>
+                <w:color w:val="000000"/>
+                <w:szCs w:val="28"/>
+              </w:rPr>
+              <w:t>.</w:t>
             </w:r>
           </w:p>
         </w:tc>
@@ -8733,6 +8673,14 @@
               </w:rPr>
               <w:t>Dimensiones/Peso</w:t>
             </w:r>
+            <w:r>
+              <w:rPr>
+                <w:rFonts w:eastAsia="Times New Roman" w:cs="Calibri"/>
+                <w:color w:val="000000"/>
+                <w:szCs w:val="28"/>
+              </w:rPr>
+              <w:t>.</w:t>
+            </w:r>
           </w:p>
         </w:tc>
         <w:tc>
@@ -8853,6 +8801,14 @@
               <w:lastRenderedPageBreak/>
               <w:t>Equipos requeridos</w:t>
             </w:r>
+            <w:r>
+              <w:rPr>
+                <w:rFonts w:eastAsia="Times New Roman" w:cs="Calibri"/>
+                <w:color w:val="000000"/>
+                <w:szCs w:val="28"/>
+              </w:rPr>
+              <w:t>.</w:t>
+            </w:r>
           </w:p>
         </w:tc>
         <w:tc>
@@ -8894,6 +8850,14 @@
               </w:rPr>
               <w:t>Limitaciones operativas</w:t>
             </w:r>
+            <w:r>
+              <w:rPr>
+                <w:rFonts w:eastAsia="Times New Roman" w:cs="Calibri"/>
+                <w:color w:val="000000"/>
+                <w:szCs w:val="28"/>
+              </w:rPr>
+              <w:t>.</w:t>
+            </w:r>
           </w:p>
         </w:tc>
         <w:tc>
@@ -8933,6 +8897,16 @@
                 <w:szCs w:val="28"/>
               </w:rPr>
               <w:t>4. Almacenamiento</w:t>
+            </w:r>
+            <w:r>
+              <w:rPr>
+                <w:rFonts w:eastAsia="Times New Roman" w:cs="Calibri"/>
+                <w:b/>
+                <w:bCs/>
+                <w:color w:val="000000"/>
+                <w:szCs w:val="28"/>
+              </w:rPr>
+              <w:t>.</w:t>
             </w:r>
           </w:p>
         </w:tc>
@@ -8975,6 +8949,14 @@
               </w:rPr>
               <w:t>Configuración óptima</w:t>
             </w:r>
+            <w:r>
+              <w:rPr>
+                <w:rFonts w:eastAsia="Times New Roman" w:cs="Calibri"/>
+                <w:color w:val="000000"/>
+                <w:szCs w:val="28"/>
+              </w:rPr>
+              <w:t>.</w:t>
+            </w:r>
           </w:p>
         </w:tc>
         <w:tc>
@@ -9012,6 +8994,14 @@
                 <w:szCs w:val="28"/>
               </w:rPr>
               <w:t>Condiciones ambientales</w:t>
+            </w:r>
+            <w:r>
+              <w:rPr>
+                <w:rFonts w:eastAsia="Times New Roman" w:cs="Calibri"/>
+                <w:color w:val="000000"/>
+                <w:szCs w:val="28"/>
+              </w:rPr>
+              <w:t>.</w:t>
             </w:r>
           </w:p>
         </w:tc>
@@ -9056,6 +9046,16 @@
               </w:rPr>
               <w:t>5. Transporte</w:t>
             </w:r>
+            <w:r>
+              <w:rPr>
+                <w:rFonts w:eastAsia="Times New Roman" w:cs="Calibri"/>
+                <w:b/>
+                <w:bCs/>
+                <w:color w:val="000000"/>
+                <w:szCs w:val="28"/>
+              </w:rPr>
+              <w:t>.</w:t>
+            </w:r>
           </w:p>
         </w:tc>
         <w:tc>
@@ -9093,6 +9093,14 @@
                 <w:szCs w:val="28"/>
               </w:rPr>
               <w:t>Medios recomendados</w:t>
+            </w:r>
+            <w:r>
+              <w:rPr>
+                <w:rFonts w:eastAsia="Times New Roman" w:cs="Calibri"/>
+                <w:color w:val="000000"/>
+                <w:szCs w:val="28"/>
+              </w:rPr>
+              <w:t>.</w:t>
             </w:r>
           </w:p>
         </w:tc>
@@ -9135,6 +9143,14 @@
               </w:rPr>
               <w:t>Restricciones legales</w:t>
             </w:r>
+            <w:r>
+              <w:rPr>
+                <w:rFonts w:eastAsia="Times New Roman" w:cs="Calibri"/>
+                <w:color w:val="000000"/>
+                <w:szCs w:val="28"/>
+              </w:rPr>
+              <w:t>.</w:t>
+            </w:r>
           </w:p>
         </w:tc>
         <w:tc>
@@ -9174,6 +9190,16 @@
                 <w:szCs w:val="28"/>
               </w:rPr>
               <w:t>6. Seguridad</w:t>
+            </w:r>
+            <w:r>
+              <w:rPr>
+                <w:rFonts w:eastAsia="Times New Roman" w:cs="Calibri"/>
+                <w:b/>
+                <w:bCs/>
+                <w:color w:val="000000"/>
+                <w:szCs w:val="28"/>
+              </w:rPr>
+              <w:t>.</w:t>
             </w:r>
           </w:p>
         </w:tc>
@@ -9216,6 +9242,14 @@
               </w:rPr>
               <w:t>EPP necesario</w:t>
             </w:r>
+            <w:r>
+              <w:rPr>
+                <w:rFonts w:eastAsia="Times New Roman" w:cs="Calibri"/>
+                <w:color w:val="000000"/>
+                <w:szCs w:val="28"/>
+              </w:rPr>
+              <w:t>.</w:t>
+            </w:r>
           </w:p>
         </w:tc>
         <w:tc>
@@ -9253,6 +9287,14 @@
                 <w:szCs w:val="28"/>
               </w:rPr>
               <w:t>Protocolos de emergencia</w:t>
+            </w:r>
+            <w:r>
+              <w:rPr>
+                <w:rFonts w:eastAsia="Times New Roman" w:cs="Calibri"/>
+                <w:color w:val="000000"/>
+                <w:szCs w:val="28"/>
+              </w:rPr>
+              <w:t>.</w:t>
             </w:r>
           </w:p>
         </w:tc>
@@ -9297,6 +9339,16 @@
               </w:rPr>
               <w:t>7. Documentación asociada</w:t>
             </w:r>
+            <w:r>
+              <w:rPr>
+                <w:rFonts w:eastAsia="Times New Roman" w:cs="Calibri"/>
+                <w:b/>
+                <w:bCs/>
+                <w:color w:val="000000"/>
+                <w:szCs w:val="28"/>
+              </w:rPr>
+              <w:t>.</w:t>
+            </w:r>
           </w:p>
         </w:tc>
         <w:tc>
@@ -9334,6 +9386,14 @@
                 <w:szCs w:val="28"/>
               </w:rPr>
               <w:t>Certificaciones</w:t>
+            </w:r>
+            <w:r>
+              <w:rPr>
+                <w:rFonts w:eastAsia="Times New Roman" w:cs="Calibri"/>
+                <w:color w:val="000000"/>
+                <w:szCs w:val="28"/>
+              </w:rPr>
+              <w:t>.</w:t>
             </w:r>
           </w:p>
         </w:tc>
@@ -9375,6 +9435,14 @@
                 <w:szCs w:val="28"/>
               </w:rPr>
               <w:t>Hojas de seguridad</w:t>
+            </w:r>
+            <w:r>
+              <w:rPr>
+                <w:rFonts w:eastAsia="Times New Roman" w:cs="Calibri"/>
+                <w:color w:val="000000"/>
+                <w:szCs w:val="28"/>
+              </w:rPr>
+              <w:t>.</w:t>
             </w:r>
           </w:p>
         </w:tc>
@@ -10069,7 +10137,7 @@
                 <w:szCs w:val="28"/>
               </w:rPr>
               <w:lastRenderedPageBreak/>
-              <w:t>Perecederos</w:t>
+              <w:t>Frágiles</w:t>
             </w:r>
           </w:p>
         </w:tc>
@@ -10861,7 +10929,7 @@
       <w:pPr>
         <w:pStyle w:val="Ttulo1"/>
       </w:pPr>
-      <w:bookmarkStart w:id="8" w:name="_Toc210637659"/>
+      <w:bookmarkStart w:id="8" w:name="_Toc211353648"/>
       <w:r>
         <w:lastRenderedPageBreak/>
         <w:t>Almacén</w:t>
@@ -10898,7 +10966,7 @@
       <w:pPr>
         <w:pStyle w:val="Ttulo2"/>
       </w:pPr>
-      <w:bookmarkStart w:id="9" w:name="_Toc210637660"/>
+      <w:bookmarkStart w:id="9" w:name="_Toc211353649"/>
       <w:r>
         <w:t>3.1 Concepto</w:t>
       </w:r>
@@ -10940,7 +11008,7 @@
       <w:pPr>
         <w:pStyle w:val="Ttulo2"/>
       </w:pPr>
-      <w:bookmarkStart w:id="10" w:name="_Toc210637661"/>
+      <w:bookmarkStart w:id="10" w:name="_Toc211353650"/>
       <w:r>
         <w:t>3.2 Características</w:t>
       </w:r>
@@ -11297,7 +11365,7 @@
       <w:pPr>
         <w:pStyle w:val="Ttulo2"/>
       </w:pPr>
-      <w:bookmarkStart w:id="11" w:name="_Toc210637662"/>
+      <w:bookmarkStart w:id="11" w:name="_Toc211353651"/>
       <w:r>
         <w:lastRenderedPageBreak/>
         <w:t>3.3 Tipos</w:t>
@@ -11429,96 +11497,65 @@
     </w:p>
     <w:p>
       <w:pPr>
-        <w:pStyle w:val="Ttulo2"/>
-        <w:rPr>
-          <w:rFonts w:asciiTheme="minorHAnsi" w:eastAsiaTheme="minorHAnsi" w:hAnsiTheme="minorHAnsi" w:cstheme="minorBidi"/>
-          <w:b w:val="0"/>
-          <w:color w:val="auto"/>
-          <w:kern w:val="2"/>
+        <w:ind w:firstLine="0"/>
+        <w:rPr>
+          <w:b/>
           <w:sz w:val="24"/>
           <w:szCs w:val="24"/>
-          <w:lang w:val="es-CO" w:eastAsia="en-US"/>
-          <w14:ligatures w14:val="standardContextual"/>
-        </w:rPr>
-      </w:pPr>
-      <w:bookmarkStart w:id="12" w:name="_Toc210637663"/>
-      <w:r>
-        <w:rPr>
-          <w:rFonts w:asciiTheme="minorHAnsi" w:eastAsiaTheme="minorHAnsi" w:hAnsiTheme="minorHAnsi" w:cstheme="minorBidi"/>
-          <w:bCs/>
-          <w:color w:val="auto"/>
-          <w:kern w:val="2"/>
+        </w:rPr>
+      </w:pPr>
+      <w:r>
+        <w:rPr>
+          <w:b/>
           <w:sz w:val="24"/>
           <w:szCs w:val="24"/>
-          <w:lang w:val="es-CO" w:eastAsia="en-US"/>
-          <w14:ligatures w14:val="standardContextual"/>
-        </w:rPr>
-        <w:t xml:space="preserve">Fuente: </w:t>
-      </w:r>
-      <w:r>
-        <w:rPr>
-          <w:rFonts w:asciiTheme="minorHAnsi" w:eastAsiaTheme="minorHAnsi" w:hAnsiTheme="minorHAnsi" w:cstheme="minorBidi"/>
-          <w:b w:val="0"/>
-          <w:color w:val="auto"/>
-          <w:kern w:val="2"/>
-          <w:sz w:val="24"/>
-          <w:szCs w:val="24"/>
-          <w:lang w:val="es-CO" w:eastAsia="en-US"/>
-          <w14:ligatures w14:val="standardContextual"/>
-        </w:rPr>
-        <w:t xml:space="preserve">tomado y adaptado de Tipos de almacenes: Características y diferencias, por </w:t>
-      </w:r>
-      <w:r>
-        <w:rPr>
-          <w:rStyle w:val="Extranjerismo"/>
-          <w:b w:val="0"/>
+        </w:rPr>
+        <w:t>Fuente:</w:t>
+      </w:r>
+      <w:r>
+        <w:rPr>
           <w:bCs/>
           <w:sz w:val="24"/>
           <w:szCs w:val="24"/>
-          <w:lang w:val="es-CO" w:eastAsia="en-US"/>
-        </w:rPr>
-        <w:t xml:space="preserve">AR </w:t>
-      </w:r>
-      <w:proofErr w:type="spellStart"/>
+        </w:rPr>
+        <w:t xml:space="preserve"> </w:t>
+      </w:r>
+      <w:r>
+        <w:rPr>
+          <w:sz w:val="24"/>
+          <w:szCs w:val="24"/>
+        </w:rPr>
+        <w:t xml:space="preserve">tomado y adaptado de Tipos de almacenes: Características y diferencias, por </w:t>
+      </w:r>
       <w:r>
         <w:rPr>
           <w:rStyle w:val="Extranjerismo"/>
-          <w:b w:val="0"/>
           <w:bCs/>
           <w:sz w:val="24"/>
           <w:szCs w:val="24"/>
-          <w:lang w:val="es-CO" w:eastAsia="en-US"/>
-        </w:rPr>
-        <w:t>Racking</w:t>
-      </w:r>
-      <w:proofErr w:type="spellEnd"/>
-      <w:r>
-        <w:rPr>
-          <w:rFonts w:asciiTheme="minorHAnsi" w:eastAsiaTheme="minorHAnsi" w:hAnsiTheme="minorHAnsi" w:cstheme="minorBidi"/>
-          <w:b w:val="0"/>
-          <w:color w:val="auto"/>
-          <w:kern w:val="2"/>
+          <w:lang w:val="es-CO"/>
+        </w:rPr>
+        <w:t xml:space="preserve">AR </w:t>
+      </w:r>
+      <w:proofErr w:type="spellStart"/>
+      <w:r>
+        <w:rPr>
+          <w:rStyle w:val="Extranjerismo"/>
+          <w:bCs/>
           <w:sz w:val="24"/>
           <w:szCs w:val="24"/>
-          <w:lang w:val="es-CO" w:eastAsia="en-US"/>
-          <w14:ligatures w14:val="standardContextual"/>
-        </w:rPr>
-        <w:t>, 2025</w:t>
-      </w:r>
-      <w:r>
-        <w:rPr>
-          <w:rFonts w:asciiTheme="minorHAnsi" w:eastAsiaTheme="minorHAnsi" w:hAnsiTheme="minorHAnsi" w:cstheme="minorBidi"/>
-          <w:b w:val="0"/>
-          <w:color w:val="auto"/>
-          <w:kern w:val="2"/>
+          <w:lang w:val="es-CO"/>
+        </w:rPr>
+        <w:t>Racking</w:t>
+      </w:r>
+      <w:proofErr w:type="spellEnd"/>
+      <w:r>
+        <w:rPr>
           <w:sz w:val="24"/>
           <w:szCs w:val="24"/>
-          <w:lang w:val="es-CO" w:eastAsia="en-US"/>
-          <w14:ligatures w14:val="standardContextual"/>
-        </w:rPr>
-        <w:t>.</w:t>
-      </w:r>
-      <w:bookmarkEnd w:id="12"/>
+        </w:rPr>
+        <w:t>, 2025.</w:t>
+      </w:r>
     </w:p>
     <w:p>
       <w:pPr>
@@ -11790,46 +11827,41 @@
     </w:p>
     <w:p>
       <w:pPr>
-        <w:pStyle w:val="Ttulo2"/>
-        <w:rPr>
-          <w:rFonts w:asciiTheme="minorHAnsi" w:eastAsiaTheme="minorHAnsi" w:hAnsiTheme="minorHAnsi" w:cstheme="minorBidi"/>
-          <w:b w:val="0"/>
-          <w:color w:val="auto"/>
-          <w:kern w:val="2"/>
+        <w:ind w:firstLine="0"/>
+        <w:rPr>
           <w:sz w:val="24"/>
           <w:szCs w:val="24"/>
-          <w:lang w:val="es-CO" w:eastAsia="en-US"/>
-          <w14:ligatures w14:val="standardContextual"/>
-        </w:rPr>
-      </w:pPr>
-      <w:bookmarkStart w:id="13" w:name="_Toc210637664"/>
-      <w:r>
-        <w:rPr>
-          <w:rFonts w:asciiTheme="minorHAnsi" w:eastAsiaTheme="minorHAnsi" w:hAnsiTheme="minorHAnsi" w:cstheme="minorBidi"/>
-          <w:bCs/>
-          <w:color w:val="auto"/>
-          <w:kern w:val="2"/>
+        </w:rPr>
+      </w:pPr>
+      <w:r>
+        <w:rPr>
+          <w:b/>
           <w:sz w:val="24"/>
           <w:szCs w:val="24"/>
-          <w:lang w:val="es-CO" w:eastAsia="en-US"/>
-          <w14:ligatures w14:val="standardContextual"/>
-        </w:rPr>
-        <w:t xml:space="preserve">Fuente: </w:t>
-      </w:r>
-      <w:r>
-        <w:rPr>
-          <w:rFonts w:asciiTheme="minorHAnsi" w:eastAsiaTheme="minorHAnsi" w:hAnsiTheme="minorHAnsi" w:cstheme="minorBidi"/>
-          <w:b w:val="0"/>
-          <w:color w:val="auto"/>
-          <w:kern w:val="2"/>
+        </w:rPr>
+        <w:t>Fuente:</w:t>
+      </w:r>
+      <w:r>
+        <w:rPr>
           <w:sz w:val="24"/>
           <w:szCs w:val="24"/>
-          <w:lang w:val="es-CO" w:eastAsia="en-US"/>
-          <w14:ligatures w14:val="standardContextual"/>
-        </w:rPr>
-        <w:t>SENA; 2025.</w:t>
-      </w:r>
-      <w:bookmarkEnd w:id="13"/>
+        </w:rPr>
+        <w:t xml:space="preserve"> SENA</w:t>
+      </w:r>
+      <w:r>
+        <w:rPr>
+          <w:sz w:val="24"/>
+          <w:szCs w:val="24"/>
+        </w:rPr>
+        <w:t>,</w:t>
+      </w:r>
+      <w:r>
+        <w:rPr>
+          <w:sz w:val="24"/>
+          <w:szCs w:val="24"/>
+        </w:rPr>
+        <w:t xml:space="preserve"> 2025.</w:t>
+      </w:r>
     </w:p>
     <w:p>
       <w:pPr>
@@ -12003,7 +12035,6 @@
         <w:rPr>
           <w:sz w:val="24"/>
           <w:szCs w:val="24"/>
-          <w:lang w:val="es-419" w:eastAsia="es-CO"/>
         </w:rPr>
       </w:pPr>
       <w:r>
@@ -12012,7 +12043,6 @@
           <w:bCs/>
           <w:sz w:val="24"/>
           <w:szCs w:val="24"/>
-          <w:lang w:val="es-419" w:eastAsia="es-CO"/>
         </w:rPr>
         <w:t>Fuente:</w:t>
       </w:r>
@@ -12020,7 +12050,6 @@
         <w:rPr>
           <w:sz w:val="24"/>
           <w:szCs w:val="24"/>
-          <w:lang w:val="es-419" w:eastAsia="es-CO"/>
         </w:rPr>
         <w:t xml:space="preserve"> SENA, 2025.</w:t>
       </w:r>
@@ -12181,106 +12210,75 @@
     </w:p>
     <w:p>
       <w:pPr>
-        <w:pStyle w:val="Ttulo2"/>
-        <w:rPr>
-          <w:rFonts w:asciiTheme="minorHAnsi" w:eastAsiaTheme="minorHAnsi" w:hAnsiTheme="minorHAnsi" w:cstheme="minorBidi"/>
-          <w:b w:val="0"/>
-          <w:color w:val="auto"/>
-          <w:kern w:val="2"/>
+        <w:ind w:firstLine="0"/>
+        <w:rPr>
+          <w:b/>
           <w:sz w:val="24"/>
           <w:szCs w:val="24"/>
-          <w:lang w:val="es-CO" w:eastAsia="en-US"/>
-          <w14:ligatures w14:val="standardContextual"/>
-        </w:rPr>
-      </w:pPr>
-      <w:bookmarkStart w:id="14" w:name="_Toc210637665"/>
-      <w:r>
-        <w:rPr>
-          <w:rFonts w:asciiTheme="minorHAnsi" w:eastAsiaTheme="minorHAnsi" w:hAnsiTheme="minorHAnsi" w:cstheme="minorBidi"/>
-          <w:bCs/>
-          <w:color w:val="auto"/>
-          <w:kern w:val="2"/>
+        </w:rPr>
+      </w:pPr>
+      <w:r>
+        <w:rPr>
+          <w:b/>
           <w:sz w:val="24"/>
           <w:szCs w:val="24"/>
-          <w:lang w:val="es-CO" w:eastAsia="en-US"/>
-          <w14:ligatures w14:val="standardContextual"/>
-        </w:rPr>
-        <w:t xml:space="preserve">Fuente: </w:t>
-      </w:r>
-      <w:r>
-        <w:rPr>
-          <w:rFonts w:asciiTheme="minorHAnsi" w:eastAsiaTheme="minorHAnsi" w:hAnsiTheme="minorHAnsi" w:cstheme="minorBidi"/>
-          <w:b w:val="0"/>
-          <w:color w:val="auto"/>
-          <w:kern w:val="2"/>
-          <w:sz w:val="24"/>
-          <w:szCs w:val="24"/>
-          <w:lang w:val="es-CO" w:eastAsia="en-US"/>
-          <w14:ligatures w14:val="standardContextual"/>
-        </w:rPr>
-        <w:t xml:space="preserve">tomado y adaptado de Tipos de almacenes: Características y diferencias, por </w:t>
-      </w:r>
-      <w:r>
-        <w:rPr>
-          <w:rStyle w:val="Extranjerismo"/>
-          <w:b w:val="0"/>
+        </w:rPr>
+        <w:t>Fuente:</w:t>
+      </w:r>
+      <w:r>
+        <w:rPr>
           <w:bCs/>
           <w:sz w:val="24"/>
           <w:szCs w:val="24"/>
-          <w:lang w:val="es-CO" w:eastAsia="en-US"/>
-        </w:rPr>
-        <w:t xml:space="preserve">AR </w:t>
-      </w:r>
-      <w:proofErr w:type="spellStart"/>
+        </w:rPr>
+        <w:t xml:space="preserve"> </w:t>
+      </w:r>
+      <w:r>
+        <w:rPr>
+          <w:sz w:val="24"/>
+          <w:szCs w:val="24"/>
+        </w:rPr>
+        <w:t xml:space="preserve">tomado y adaptado de Tipos de almacenes: Características y diferencias, por </w:t>
+      </w:r>
       <w:r>
         <w:rPr>
           <w:rStyle w:val="Extranjerismo"/>
-          <w:b w:val="0"/>
           <w:bCs/>
           <w:sz w:val="24"/>
           <w:szCs w:val="24"/>
-          <w:lang w:val="es-CO" w:eastAsia="en-US"/>
-        </w:rPr>
-        <w:t>Racking</w:t>
-      </w:r>
-      <w:proofErr w:type="spellEnd"/>
-      <w:r>
-        <w:rPr>
-          <w:rFonts w:asciiTheme="minorHAnsi" w:eastAsiaTheme="minorHAnsi" w:hAnsiTheme="minorHAnsi" w:cstheme="minorBidi"/>
-          <w:b w:val="0"/>
-          <w:color w:val="auto"/>
-          <w:kern w:val="2"/>
+          <w:lang w:val="es-CO"/>
+        </w:rPr>
+        <w:t xml:space="preserve">AR </w:t>
+      </w:r>
+      <w:proofErr w:type="spellStart"/>
+      <w:r>
+        <w:rPr>
+          <w:rStyle w:val="Extranjerismo"/>
+          <w:bCs/>
           <w:sz w:val="24"/>
           <w:szCs w:val="24"/>
-          <w:lang w:val="es-CO" w:eastAsia="en-US"/>
-          <w14:ligatures w14:val="standardContextual"/>
-        </w:rPr>
-        <w:t>, 2025</w:t>
-      </w:r>
-      <w:r>
-        <w:rPr>
-          <w:rFonts w:asciiTheme="minorHAnsi" w:eastAsiaTheme="minorHAnsi" w:hAnsiTheme="minorHAnsi" w:cstheme="minorBidi"/>
-          <w:b w:val="0"/>
-          <w:color w:val="auto"/>
-          <w:kern w:val="2"/>
+          <w:lang w:val="es-CO"/>
+        </w:rPr>
+        <w:t>Racking</w:t>
+      </w:r>
+      <w:proofErr w:type="spellEnd"/>
+      <w:r>
+        <w:rPr>
           <w:sz w:val="24"/>
           <w:szCs w:val="24"/>
-          <w:lang w:val="es-CO" w:eastAsia="en-US"/>
-          <w14:ligatures w14:val="standardContextual"/>
-        </w:rPr>
-        <w:t>.</w:t>
-      </w:r>
-      <w:bookmarkEnd w:id="14"/>
+        </w:rPr>
+        <w:t>, 2025.</w:t>
+      </w:r>
     </w:p>
     <w:p>
       <w:pPr>
         <w:pStyle w:val="Ttulo2"/>
       </w:pPr>
-      <w:bookmarkStart w:id="15" w:name="_Toc210637666"/>
+      <w:bookmarkStart w:id="12" w:name="_Toc211353652"/>
       <w:r>
         <w:t>3.4 Funciones</w:t>
       </w:r>
-      <w:bookmarkEnd w:id="15"/>
+      <w:bookmarkEnd w:id="12"/>
     </w:p>
     <w:p>
       <w:pPr>
@@ -12466,7 +12464,39 @@
                 <w:szCs w:val="28"/>
               </w:rPr>
               <w:br/>
-              <w:t>Registro en el sistema (WMS/ERP).</w:t>
+              <w:t>Registro en el sistema (WMS</w:t>
+            </w:r>
+            <w:r>
+              <w:rPr>
+                <w:rFonts w:eastAsia="Times New Roman" w:cs="Calibri"/>
+                <w:color w:val="000000"/>
+                <w:szCs w:val="28"/>
+              </w:rPr>
+              <w:t xml:space="preserve"> </w:t>
+            </w:r>
+            <w:r>
+              <w:rPr>
+                <w:rFonts w:eastAsia="Times New Roman" w:cs="Calibri"/>
+                <w:color w:val="000000"/>
+                <w:szCs w:val="28"/>
+              </w:rPr>
+              <w:t>/</w:t>
+            </w:r>
+            <w:r>
+              <w:rPr>
+                <w:rFonts w:eastAsia="Times New Roman" w:cs="Calibri"/>
+                <w:color w:val="000000"/>
+                <w:szCs w:val="28"/>
+              </w:rPr>
+              <w:t xml:space="preserve"> </w:t>
+            </w:r>
+            <w:r>
+              <w:rPr>
+                <w:rFonts w:eastAsia="Times New Roman" w:cs="Calibri"/>
+                <w:color w:val="000000"/>
+                <w:szCs w:val="28"/>
+              </w:rPr>
+              <w:t>ERP).</w:t>
             </w:r>
           </w:p>
         </w:tc>
@@ -13439,12 +13469,12 @@
       <w:pPr>
         <w:pStyle w:val="Ttulo1"/>
       </w:pPr>
-      <w:bookmarkStart w:id="16" w:name="_Toc210637667"/>
+      <w:bookmarkStart w:id="13" w:name="_Toc211353653"/>
       <w:r>
         <w:lastRenderedPageBreak/>
         <w:t>Operación de almacén</w:t>
       </w:r>
-      <w:bookmarkEnd w:id="16"/>
+      <w:bookmarkEnd w:id="13"/>
     </w:p>
     <w:p>
       <w:pPr>
@@ -13461,6 +13491,57 @@
     </w:p>
     <w:p>
       <w:pPr>
+        <w:pStyle w:val="Ttulo2"/>
+      </w:pPr>
+      <w:bookmarkStart w:id="14" w:name="_Toc211353654"/>
+      <w:r>
+        <w:t>4.1 Concepto</w:t>
+      </w:r>
+      <w:bookmarkEnd w:id="14"/>
+    </w:p>
+    <w:p>
+      <w:pPr>
+        <w:rPr>
+          <w:lang w:val="es-419" w:eastAsia="es-CO"/>
+        </w:rPr>
+      </w:pPr>
+      <w:r>
+        <w:rPr>
+          <w:lang w:val="es-419" w:eastAsia="es-CO"/>
+        </w:rPr>
+        <w:t>La operación de un almacén es el conjunto de actividades planificadas y sistematizadas que permiten la recepción, almacenamiento, gestión y despacho de mercancías de manera eficiente.</w:t>
+      </w:r>
+    </w:p>
+    <w:p>
+      <w:pPr>
+        <w:rPr>
+          <w:lang w:val="es-419" w:eastAsia="es-CO"/>
+        </w:rPr>
+      </w:pPr>
+      <w:r>
+        <w:rPr>
+          <w:lang w:val="es-419" w:eastAsia="es-CO"/>
+        </w:rPr>
+        <w:t>Este proceso es fundamental dentro de la cadena de suministro, ya que actúa como enlace entre la producción y la distribución, impactando directamente en la satisfacción del cliente final.</w:t>
+      </w:r>
+    </w:p>
+    <w:p>
+      <w:pPr>
+        <w:spacing w:before="0" w:after="160" w:line="259" w:lineRule="auto"/>
+        <w:ind w:firstLine="0"/>
+        <w:rPr>
+          <w:lang w:val="es-419" w:eastAsia="es-CO"/>
+        </w:rPr>
+      </w:pPr>
+      <w:r>
+        <w:rPr>
+          <w:lang w:val="es-419" w:eastAsia="es-CO"/>
+        </w:rPr>
+        <w:br w:type="page"/>
+      </w:r>
+    </w:p>
+    <w:p>
+      <w:pPr>
         <w:pStyle w:val="Figura"/>
         <w:rPr>
           <w:b w:val="0"/>
@@ -13468,6 +13549,7 @@
         </w:rPr>
       </w:pPr>
       <w:r>
+        <w:lastRenderedPageBreak/>
         <w:t xml:space="preserve">Figura 4. </w:t>
       </w:r>
       <w:r>
@@ -13491,10 +13573,10 @@
           <w:lang w:val="es-419" w:eastAsia="es-CO"/>
         </w:rPr>
         <w:drawing>
-          <wp:inline distT="0" distB="0" distL="0" distR="0" wp14:anchorId="7EDBED07" wp14:editId="2703A3F0">
-            <wp:extent cx="3695700" cy="4279900"/>
-            <wp:effectExtent l="0" t="0" r="0" b="0"/>
-            <wp:docPr id="1168244658" name="Imagen 1" descr="En la figura 4 se presentan los objetivos del proceso operativo de almacén.Garantizar la disponibilidad de productos.Optimizar espacios y recursos.Minimizar costos operativos.Mantener la integridad de los inventarios"/>
+          <wp:inline distT="0" distB="0" distL="0" distR="0" wp14:anchorId="7EDBED07" wp14:editId="6472E4B7">
+            <wp:extent cx="2993951" cy="3467222"/>
+            <wp:effectExtent l="0" t="0" r="3810" b="0"/>
+            <wp:docPr id="1168244658" name="Imagen 1" descr="En la figura 4 se presentan los objetivos del proceso operativo de almacén.Garantizar la disponibilidad de productos.Optimizar espacios y recursos.Minimizar costos operativos.Mantener la integridad de los inventarios."/>
             <wp:cNvGraphicFramePr>
               <a:graphicFrameLocks xmlns:a="http://schemas.openxmlformats.org/drawingml/2006/main" noChangeAspect="1"/>
             </wp:cNvGraphicFramePr>
@@ -13502,7 +13584,7 @@
               <a:graphicData uri="http://schemas.openxmlformats.org/drawingml/2006/picture">
                 <pic:pic xmlns:pic="http://schemas.openxmlformats.org/drawingml/2006/picture">
                   <pic:nvPicPr>
-                    <pic:cNvPr id="1168244658" name="Imagen 1" descr="En la figura 4 se presentan los objetivos del proceso operativo de almacén.Garantizar la disponibilidad de productos.Optimizar espacios y recursos.Minimizar costos operativos.Mantener la integridad de los inventarios"/>
+                    <pic:cNvPr id="1168244658" name="Imagen 1" descr="En la figura 4 se presentan los objetivos del proceso operativo de almacén.Garantizar la disponibilidad de productos.Optimizar espacios y recursos.Minimizar costos operativos.Mantener la integridad de los inventarios."/>
                     <pic:cNvPicPr/>
                   </pic:nvPicPr>
                   <pic:blipFill>
@@ -13514,7 +13596,7 @@
                   <pic:spPr>
                     <a:xfrm>
                       <a:off x="0" y="0"/>
-                      <a:ext cx="3695700" cy="4279900"/>
+                      <a:ext cx="3030228" cy="3509233"/>
                     </a:xfrm>
                     <a:prstGeom prst="rect">
                       <a:avLst/>
@@ -13579,7 +13661,6 @@
         <w:rPr>
           <w:lang w:val="es-419" w:eastAsia="es-CO"/>
         </w:rPr>
-        <w:lastRenderedPageBreak/>
         <w:t>Optimizar espacios y recursos.</w:t>
       </w:r>
     </w:p>
@@ -13656,11 +13737,11 @@
       <w:pPr>
         <w:pStyle w:val="Ttulo2"/>
       </w:pPr>
-      <w:bookmarkStart w:id="17" w:name="_Toc210637668"/>
+      <w:bookmarkStart w:id="15" w:name="_Toc211353655"/>
       <w:r>
         <w:t>4.2 Etapas</w:t>
       </w:r>
-      <w:bookmarkEnd w:id="17"/>
+      <w:bookmarkEnd w:id="15"/>
     </w:p>
     <w:p>
       <w:pPr>
@@ -13699,6 +13780,7 @@
           <w:bCs/>
           <w:lang w:eastAsia="es-CO"/>
         </w:rPr>
+        <w:lastRenderedPageBreak/>
         <w:t>Recepción de bienes:</w:t>
       </w:r>
       <w:r>
@@ -13859,7 +13941,6 @@
           <w:bCs/>
           <w:lang w:eastAsia="es-CO"/>
         </w:rPr>
-        <w:lastRenderedPageBreak/>
         <w:t>Despacho y expedición</w:t>
       </w:r>
       <w:r>
@@ -14000,7 +14081,14 @@
         <w:rPr>
           <w:lang w:eastAsia="es-CO"/>
         </w:rPr>
-        <w:t>roceso continuo de auditorías y recuentos para garantizar que existencias físicas coincidan con registros. El control de inventarios detecta desviaciones, previene faltantes o excesos y asegura precisión en la gestión eficiente del almacén.</w:t>
+        <w:t xml:space="preserve">roceso continuo de auditorías y recuentos para garantizar que existencias físicas coincidan con registros. El control de </w:t>
+      </w:r>
+      <w:r>
+        <w:rPr>
+          <w:lang w:eastAsia="es-CO"/>
+        </w:rPr>
+        <w:lastRenderedPageBreak/>
+        <w:t>inventarios detecta desviaciones, previene faltantes o excesos y asegura precisión en la gestión eficiente del almacén.</w:t>
       </w:r>
     </w:p>
     <w:p>
@@ -14017,7 +14105,7 @@
           <w14:ligatures w14:val="standardContextual"/>
         </w:rPr>
       </w:pPr>
-      <w:bookmarkStart w:id="18" w:name="_Toc210637669"/>
+      <w:bookmarkStart w:id="16" w:name="_Toc211353656"/>
       <w:r>
         <w:rPr>
           <w:rFonts w:asciiTheme="minorHAnsi" w:eastAsiaTheme="minorHAnsi" w:hAnsiTheme="minorHAnsi" w:cstheme="minorBidi"/>
@@ -14070,17 +14158,17 @@
         </w:rPr>
         <w:t>.</w:t>
       </w:r>
-      <w:bookmarkEnd w:id="18"/>
+      <w:bookmarkEnd w:id="16"/>
     </w:p>
     <w:p>
       <w:pPr>
         <w:pStyle w:val="Ttulo2"/>
       </w:pPr>
-      <w:bookmarkStart w:id="19" w:name="_Toc210637670"/>
+      <w:bookmarkStart w:id="17" w:name="_Toc211353657"/>
       <w:r>
         <w:t>4.3 Herramientas tecnológicas</w:t>
       </w:r>
-      <w:bookmarkEnd w:id="19"/>
+      <w:bookmarkEnd w:id="17"/>
     </w:p>
     <w:p>
       <w:pPr>
@@ -14254,16 +14342,7 @@
                 <w:color w:val="12263F"/>
                 <w:szCs w:val="28"/>
               </w:rPr>
-              <w:t xml:space="preserve">Gestión de inventario en tiempo real con actualización automática </w:t>
-            </w:r>
-            <w:r>
-              <w:rPr>
-                <w:rFonts w:asciiTheme="minorHAnsi" w:hAnsiTheme="minorHAnsi" w:cstheme="minorHAnsi"/>
-                <w:color w:val="12263F"/>
-                <w:szCs w:val="28"/>
-              </w:rPr>
-              <w:lastRenderedPageBreak/>
-              <w:t xml:space="preserve">de </w:t>
+              <w:t xml:space="preserve">Gestión de inventario en tiempo real con actualización automática de </w:t>
             </w:r>
             <w:r>
               <w:rPr>
@@ -14367,7 +14446,6 @@
                 <w:color w:val="12263F"/>
                 <w:szCs w:val="28"/>
               </w:rPr>
-              <w:lastRenderedPageBreak/>
               <w:t>Reducción de hasta 30 % en tiempos de preparación de pedidos.</w:t>
             </w:r>
             <w:r>
@@ -14377,14 +14455,6 @@
                 <w:szCs w:val="28"/>
               </w:rPr>
               <w:br/>
-            </w:r>
-            <w:r>
-              <w:rPr>
-                <w:rFonts w:asciiTheme="minorHAnsi" w:hAnsiTheme="minorHAnsi" w:cstheme="minorHAnsi"/>
-                <w:color w:val="12263F"/>
-                <w:szCs w:val="28"/>
-              </w:rPr>
-              <w:lastRenderedPageBreak/>
               <w:t>Precisión de inventario superior al 99.5 %.</w:t>
             </w:r>
             <w:r>
@@ -14452,7 +14522,43 @@
                 <w:szCs w:val="28"/>
                 <w:lang w:val="en-US"/>
               </w:rPr>
-              <w:t>Sistemas AS/RS (</w:t>
+              <w:t>Sistemas AS</w:t>
+            </w:r>
+            <w:r>
+              <w:rPr>
+                <w:rFonts w:asciiTheme="minorHAnsi" w:hAnsiTheme="minorHAnsi" w:cstheme="minorHAnsi"/>
+                <w:color w:val="12263F"/>
+                <w:szCs w:val="28"/>
+                <w:lang w:val="en-US"/>
+              </w:rPr>
+              <w:t xml:space="preserve"> </w:t>
+            </w:r>
+            <w:r>
+              <w:rPr>
+                <w:rFonts w:asciiTheme="minorHAnsi" w:hAnsiTheme="minorHAnsi" w:cstheme="minorHAnsi"/>
+                <w:color w:val="12263F"/>
+                <w:szCs w:val="28"/>
+                <w:lang w:val="en-US"/>
+              </w:rPr>
+              <w:t>/</w:t>
+            </w:r>
+            <w:r>
+              <w:rPr>
+                <w:rFonts w:asciiTheme="minorHAnsi" w:hAnsiTheme="minorHAnsi" w:cstheme="minorHAnsi"/>
+                <w:color w:val="12263F"/>
+                <w:szCs w:val="28"/>
+                <w:lang w:val="en-US"/>
+              </w:rPr>
+              <w:t xml:space="preserve"> </w:t>
+            </w:r>
+            <w:r>
+              <w:rPr>
+                <w:rFonts w:asciiTheme="minorHAnsi" w:hAnsiTheme="minorHAnsi" w:cstheme="minorHAnsi"/>
+                <w:color w:val="12263F"/>
+                <w:szCs w:val="28"/>
+                <w:lang w:val="en-US"/>
+              </w:rPr>
+              <w:t>RS (</w:t>
             </w:r>
             <w:r>
               <w:rPr>
@@ -14617,7 +14723,23 @@
                 <w:color w:val="12263F"/>
                 <w:szCs w:val="28"/>
               </w:rPr>
-              <w:t>Robots móviles Autónomos:</w:t>
+              <w:t xml:space="preserve">Robots móviles </w:t>
+            </w:r>
+            <w:r>
+              <w:rPr>
+                <w:rFonts w:asciiTheme="minorHAnsi" w:hAnsiTheme="minorHAnsi" w:cstheme="minorHAnsi"/>
+                <w:color w:val="12263F"/>
+                <w:szCs w:val="28"/>
+              </w:rPr>
+              <w:t>a</w:t>
+            </w:r>
+            <w:r>
+              <w:rPr>
+                <w:rFonts w:asciiTheme="minorHAnsi" w:hAnsiTheme="minorHAnsi" w:cstheme="minorHAnsi"/>
+                <w:color w:val="12263F"/>
+                <w:szCs w:val="28"/>
+              </w:rPr>
+              <w:t>utónomos:</w:t>
             </w:r>
           </w:p>
           <w:p>
@@ -14749,7 +14871,6 @@
                 <w:szCs w:val="28"/>
                 <w:lang w:val="es-419" w:eastAsia="es-CO"/>
               </w:rPr>
-              <w:lastRenderedPageBreak/>
               <w:t>Tecnologías 4.0</w:t>
             </w:r>
             <w:r>
@@ -14859,6 +14980,7 @@
                 <w:szCs w:val="28"/>
                 <w:lang w:val="es-419" w:eastAsia="es-CO"/>
               </w:rPr>
+              <w:lastRenderedPageBreak/>
               <w:t>Tecnologías 4.0</w:t>
             </w:r>
             <w:r>
@@ -15144,12 +15266,11 @@
       <w:pPr>
         <w:pStyle w:val="Ttulo1"/>
       </w:pPr>
-      <w:bookmarkStart w:id="20" w:name="_Toc210637671"/>
-      <w:r>
-        <w:lastRenderedPageBreak/>
+      <w:bookmarkStart w:id="18" w:name="_Toc211353658"/>
+      <w:r>
         <w:t>Movimientos de almacén</w:t>
       </w:r>
-      <w:bookmarkEnd w:id="20"/>
+      <w:bookmarkEnd w:id="18"/>
     </w:p>
     <w:p>
       <w:pPr>
@@ -15168,11 +15289,12 @@
       <w:pPr>
         <w:pStyle w:val="Ttulo2"/>
       </w:pPr>
-      <w:bookmarkStart w:id="21" w:name="_Toc210637672"/>
-      <w:r>
+      <w:bookmarkStart w:id="19" w:name="_Toc211353659"/>
+      <w:r>
+        <w:lastRenderedPageBreak/>
         <w:t>5.1 Concepto</w:t>
       </w:r>
-      <w:bookmarkEnd w:id="21"/>
+      <w:bookmarkEnd w:id="19"/>
     </w:p>
     <w:p>
       <w:pPr>
@@ -15204,11 +15326,11 @@
       <w:pPr>
         <w:pStyle w:val="Ttulo2"/>
       </w:pPr>
-      <w:bookmarkStart w:id="22" w:name="_Toc210637673"/>
+      <w:bookmarkStart w:id="20" w:name="_Toc211353660"/>
       <w:r>
         <w:t>5.2 Características</w:t>
       </w:r>
-      <w:bookmarkEnd w:id="22"/>
+      <w:bookmarkEnd w:id="20"/>
     </w:p>
     <w:p>
       <w:pPr>
@@ -15266,7 +15388,6 @@
           <w:bCs/>
           <w:lang w:val="es-419" w:eastAsia="es-CO"/>
         </w:rPr>
-        <w:lastRenderedPageBreak/>
         <w:t>Trazabilidad:</w:t>
       </w:r>
       <w:r>
@@ -15351,6 +15472,7 @@
           <w:bCs/>
           <w:lang w:val="es-419" w:eastAsia="es-CO"/>
         </w:rPr>
+        <w:lastRenderedPageBreak/>
         <w:t>Flexibilidad:</w:t>
       </w:r>
       <w:r>
@@ -15400,7 +15522,7 @@
           <w14:ligatures w14:val="standardContextual"/>
         </w:rPr>
       </w:pPr>
-      <w:bookmarkStart w:id="23" w:name="_Toc210637674"/>
+      <w:bookmarkStart w:id="21" w:name="_Toc211353661"/>
       <w:r>
         <w:rPr>
           <w:rFonts w:asciiTheme="minorHAnsi" w:eastAsiaTheme="minorHAnsi" w:hAnsiTheme="minorHAnsi" w:cstheme="minorBidi"/>
@@ -15453,17 +15575,17 @@
         </w:rPr>
         <w:t>.</w:t>
       </w:r>
-      <w:bookmarkEnd w:id="23"/>
+      <w:bookmarkEnd w:id="21"/>
     </w:p>
     <w:p>
       <w:pPr>
         <w:pStyle w:val="Ttulo2"/>
       </w:pPr>
-      <w:bookmarkStart w:id="24" w:name="_Toc210637675"/>
+      <w:bookmarkStart w:id="22" w:name="_Toc211353662"/>
       <w:r>
         <w:t>5.3 Tipos</w:t>
       </w:r>
-      <w:bookmarkEnd w:id="24"/>
+      <w:bookmarkEnd w:id="22"/>
     </w:p>
     <w:p>
       <w:pPr>
@@ -15558,7 +15680,6 @@
         <w:rPr>
           <w:lang w:val="es-419" w:eastAsia="es-CO"/>
         </w:rPr>
-        <w:lastRenderedPageBreak/>
         <w:t>Verificación de cantidad y calidad.</w:t>
       </w:r>
     </w:p>
@@ -15577,7 +15698,31 @@
         <w:rPr>
           <w:lang w:val="es-419" w:eastAsia="es-CO"/>
         </w:rPr>
-        <w:t>Registro en sistemas de gestión (WMS/ERP).</w:t>
+        <w:t>Registro en sistemas de gestión (WMS</w:t>
+      </w:r>
+      <w:r>
+        <w:rPr>
+          <w:lang w:val="es-419" w:eastAsia="es-CO"/>
+        </w:rPr>
+        <w:t xml:space="preserve"> </w:t>
+      </w:r>
+      <w:r>
+        <w:rPr>
+          <w:lang w:val="es-419" w:eastAsia="es-CO"/>
+        </w:rPr>
+        <w:t>/</w:t>
+      </w:r>
+      <w:r>
+        <w:rPr>
+          <w:lang w:val="es-419" w:eastAsia="es-CO"/>
+        </w:rPr>
+        <w:t xml:space="preserve"> </w:t>
+      </w:r>
+      <w:r>
+        <w:rPr>
+          <w:lang w:val="es-419" w:eastAsia="es-CO"/>
+        </w:rPr>
+        <w:t>ERP).</w:t>
       </w:r>
     </w:p>
     <w:p>
@@ -15692,6 +15837,7 @@
         <w:rPr>
           <w:lang w:val="es-419" w:eastAsia="es-CO"/>
         </w:rPr>
+        <w:lastRenderedPageBreak/>
         <w:t>Reubicación de productos (reabastecimiento, consolidación).</w:t>
       </w:r>
     </w:p>
@@ -15937,12 +16083,12 @@
       <w:pPr>
         <w:pStyle w:val="Titulosgenerales"/>
       </w:pPr>
-      <w:bookmarkStart w:id="25" w:name="_Toc210637676"/>
+      <w:bookmarkStart w:id="23" w:name="_Toc211353663"/>
       <w:r>
         <w:lastRenderedPageBreak/>
         <w:t>Síntesis</w:t>
       </w:r>
-      <w:bookmarkEnd w:id="25"/>
+      <w:bookmarkEnd w:id="23"/>
       <w:r>
         <w:t xml:space="preserve"> </w:t>
       </w:r>
@@ -16019,12 +16165,12 @@
       <w:pPr>
         <w:pStyle w:val="Titulosgenerales"/>
       </w:pPr>
-      <w:bookmarkStart w:id="26" w:name="_Toc210637677"/>
+      <w:bookmarkStart w:id="24" w:name="_Toc211353664"/>
       <w:r>
         <w:lastRenderedPageBreak/>
         <w:t>Glosario</w:t>
       </w:r>
-      <w:bookmarkEnd w:id="26"/>
+      <w:bookmarkEnd w:id="24"/>
     </w:p>
     <w:p>
       <w:pPr>
@@ -16081,7 +16227,7 @@
           <w:szCs w:val="28"/>
           <w:lang w:val="es-419"/>
         </w:rPr>
-        <w:t>Almacén automatizado (AS/RS)</w:t>
+        <w:t>Almacén automatizado (AS</w:t>
       </w:r>
       <w:r>
         <w:rPr>
@@ -16091,15 +16237,7 @@
           <w:szCs w:val="28"/>
           <w:lang w:val="es-419"/>
         </w:rPr>
-        <w:t xml:space="preserve">: </w:t>
-      </w:r>
-      <w:r>
-        <w:rPr>
-          <w:rFonts w:ascii="Calibri" w:hAnsi="Calibri" w:cs="Calibri"/>
-          <w:szCs w:val="28"/>
-          <w:lang w:val="es-419"/>
-        </w:rPr>
-        <w:t>instalación que utiliza sistemas robóticos y software para gestionar inventarios con mínima intervención humana</w:t>
+        <w:t xml:space="preserve"> </w:t>
       </w:r>
       <w:r>
         <w:rPr>
@@ -16109,34 +16247,7 @@
           <w:szCs w:val="28"/>
           <w:lang w:val="es-419"/>
         </w:rPr>
-        <w:t>.</w:t>
-      </w:r>
-    </w:p>
-    <w:p>
-      <w:pPr>
-        <w:rPr>
-          <w:rFonts w:ascii="Calibri" w:hAnsi="Calibri" w:cs="Calibri"/>
-          <w:szCs w:val="28"/>
-          <w:lang w:val="es-419"/>
-        </w:rPr>
-      </w:pPr>
-      <w:r>
-        <w:rPr>
-          <w:rStyle w:val="Extranjerismo"/>
-          <w:b/>
-          <w:bCs/>
-          <w:lang w:val="es-419"/>
-        </w:rPr>
-        <w:t>Blockchain</w:t>
-      </w:r>
-      <w:r>
-        <w:rPr>
-          <w:rStyle w:val="Extranjerismo"/>
-          <w:b/>
-          <w:bCs/>
-          <w:lang w:val="es-CO"/>
-        </w:rPr>
-        <w:t>:</w:t>
+        <w:t>/</w:t>
       </w:r>
       <w:r>
         <w:rPr>
@@ -16151,14 +16262,14 @@
       <w:r>
         <w:rPr>
           <w:rFonts w:ascii="Calibri" w:hAnsi="Calibri" w:cs="Calibri"/>
+          <w:b/>
+          <w:bCs/>
           <w:szCs w:val="28"/>
           <w:lang w:val="es-419"/>
         </w:rPr>
-        <w:t>tecnología de registro inmutable para trazabilidad logística y autenticidad de productos.</w:t>
-      </w:r>
-    </w:p>
-    <w:p>
-      <w:pPr>
+        <w:t>RS)</w:t>
+      </w:r>
+      <w:r>
         <w:rPr>
           <w:rFonts w:ascii="Calibri" w:hAnsi="Calibri" w:cs="Calibri"/>
           <w:b/>
@@ -16166,7 +16277,16 @@
           <w:szCs w:val="28"/>
           <w:lang w:val="es-419"/>
         </w:rPr>
-      </w:pPr>
+        <w:t xml:space="preserve">: </w:t>
+      </w:r>
+      <w:r>
+        <w:rPr>
+          <w:rFonts w:ascii="Calibri" w:hAnsi="Calibri" w:cs="Calibri"/>
+          <w:szCs w:val="28"/>
+          <w:lang w:val="es-419"/>
+        </w:rPr>
+        <w:t>instalación que utiliza sistemas robóticos y software para gestionar inventarios con mínima intervención humana</w:t>
+      </w:r>
       <w:r>
         <w:rPr>
           <w:rFonts w:ascii="Calibri" w:hAnsi="Calibri" w:cs="Calibri"/>
@@ -16175,23 +16295,34 @@
           <w:szCs w:val="28"/>
           <w:lang w:val="es-419"/>
         </w:rPr>
-        <w:t>Cadena de frío</w:t>
-      </w:r>
-      <w:r>
+        <w:t>.</w:t>
+      </w:r>
+    </w:p>
+    <w:p>
+      <w:pPr>
         <w:rPr>
           <w:rFonts w:ascii="Calibri" w:hAnsi="Calibri" w:cs="Calibri"/>
           <w:szCs w:val="28"/>
           <w:lang w:val="es-419"/>
         </w:rPr>
-        <w:t>: p</w:t>
-      </w:r>
-      <w:r>
-        <w:rPr>
-          <w:rFonts w:ascii="Calibri" w:hAnsi="Calibri" w:cs="Calibri"/>
-          <w:szCs w:val="28"/>
+      </w:pPr>
+      <w:r>
+        <w:rPr>
+          <w:rStyle w:val="Extranjerismo"/>
+          <w:b/>
+          <w:bCs/>
           <w:lang w:val="es-419"/>
         </w:rPr>
-        <w:t>roceso logístico que mantiene productos perecederos (ej. alimentos, medicamentos) en condiciones de temperatura controlada desde producción hasta distribución</w:t>
+        <w:t>Blockchain</w:t>
+      </w:r>
+      <w:r>
+        <w:rPr>
+          <w:rStyle w:val="Extranjerismo"/>
+          <w:b/>
+          <w:bCs/>
+          <w:lang w:val="es-CO"/>
+        </w:rPr>
+        <w:t>:</w:t>
       </w:r>
       <w:r>
         <w:rPr>
@@ -16201,36 +16332,19 @@
           <w:szCs w:val="28"/>
           <w:lang w:val="es-419"/>
         </w:rPr>
-        <w:t>.</w:t>
-      </w:r>
-    </w:p>
-    <w:p>
-      <w:pPr>
+        <w:t xml:space="preserve"> </w:t>
+      </w:r>
+      <w:r>
         <w:rPr>
           <w:rFonts w:ascii="Calibri" w:hAnsi="Calibri" w:cs="Calibri"/>
           <w:szCs w:val="28"/>
           <w:lang w:val="es-419"/>
         </w:rPr>
-      </w:pPr>
-      <w:r>
-        <w:rPr>
-          <w:rStyle w:val="Extranjerismo"/>
-          <w:b/>
-          <w:bCs/>
-          <w:lang w:val="es-419"/>
-        </w:rPr>
-        <w:t>Cross-docking</w:t>
-      </w:r>
-      <w:r>
-        <w:rPr>
-          <w:rStyle w:val="Extranjerismo"/>
-          <w:b/>
-          <w:bCs/>
-          <w:lang w:val="es-CO"/>
-        </w:rPr>
-        <w:t>:</w:t>
-      </w:r>
-      <w:r>
+        <w:t>tecnología de registro inmutable para trazabilidad logística y autenticidad de productos.</w:t>
+      </w:r>
+    </w:p>
+    <w:p>
+      <w:pPr>
         <w:rPr>
           <w:rFonts w:ascii="Calibri" w:hAnsi="Calibri" w:cs="Calibri"/>
           <w:b/>
@@ -16238,43 +16352,7 @@
           <w:szCs w:val="28"/>
           <w:lang w:val="es-419"/>
         </w:rPr>
-        <w:t xml:space="preserve"> </w:t>
-      </w:r>
-      <w:r>
-        <w:rPr>
-          <w:rFonts w:ascii="Calibri" w:hAnsi="Calibri" w:cs="Calibri"/>
-          <w:szCs w:val="28"/>
-          <w:lang w:val="es-419"/>
-        </w:rPr>
-        <w:t>estrategia logística donde las mercancías pasan directamente de recepción a despacho, sin almacenamiento prolongado.</w:t>
-      </w:r>
-    </w:p>
-    <w:p>
-      <w:pPr>
-        <w:rPr>
-          <w:rFonts w:ascii="Calibri" w:hAnsi="Calibri" w:cs="Calibri"/>
-          <w:szCs w:val="28"/>
-          <w:lang w:val="es-419"/>
-        </w:rPr>
-      </w:pPr>
-      <w:r>
-        <w:rPr>
-          <w:rStyle w:val="Extranjerismo"/>
-          <w:b/>
-          <w:bCs/>
-          <w:lang w:val="es-419"/>
-        </w:rPr>
-        <w:t>Dark store</w:t>
-      </w:r>
-      <w:r>
-        <w:rPr>
-          <w:rStyle w:val="Extranjerismo"/>
-          <w:b/>
-          <w:bCs/>
-          <w:lang w:val="es-CO"/>
-        </w:rPr>
-        <w:t>:</w:t>
-      </w:r>
+      </w:pPr>
       <w:r>
         <w:rPr>
           <w:rFonts w:ascii="Calibri" w:hAnsi="Calibri" w:cs="Calibri"/>
@@ -16283,7 +16361,7 @@
           <w:szCs w:val="28"/>
           <w:lang w:val="es-419"/>
         </w:rPr>
-        <w:t xml:space="preserve"> </w:t>
+        <w:t>Cadena de frío</w:t>
       </w:r>
       <w:r>
         <w:rPr>
@@ -16291,17 +16369,16 @@
           <w:szCs w:val="28"/>
           <w:lang w:val="es-419"/>
         </w:rPr>
-        <w:t>almacén dedicado exclusivamente a cumplir pedidos de comercio electrónico, sin atención al público. Operan para entregas ultrarrápidas (15-30 min).</w:t>
-      </w:r>
-    </w:p>
-    <w:p>
-      <w:pPr>
+        <w:t>: p</w:t>
+      </w:r>
+      <w:r>
         <w:rPr>
           <w:rFonts w:ascii="Calibri" w:hAnsi="Calibri" w:cs="Calibri"/>
           <w:szCs w:val="28"/>
           <w:lang w:val="es-419"/>
         </w:rPr>
-      </w:pPr>
+        <w:t>roceso logístico que mantiene productos perecederos (ej. alimentos, medicamentos) en condiciones de temperatura controlada desde producción hasta distribución</w:t>
+      </w:r>
       <w:r>
         <w:rPr>
           <w:rFonts w:ascii="Calibri" w:hAnsi="Calibri" w:cs="Calibri"/>
@@ -16310,7 +16387,34 @@
           <w:szCs w:val="28"/>
           <w:lang w:val="es-419"/>
         </w:rPr>
-        <w:t>Gestión de devoluciones</w:t>
+        <w:t>.</w:t>
+      </w:r>
+    </w:p>
+    <w:p>
+      <w:pPr>
+        <w:rPr>
+          <w:rFonts w:ascii="Calibri" w:hAnsi="Calibri" w:cs="Calibri"/>
+          <w:szCs w:val="28"/>
+          <w:lang w:val="es-419"/>
+        </w:rPr>
+      </w:pPr>
+      <w:r>
+        <w:rPr>
+          <w:rStyle w:val="Extranjerismo"/>
+          <w:b/>
+          <w:bCs/>
+          <w:lang w:val="es-419"/>
+        </w:rPr>
+        <w:t>Cross-docking</w:t>
+      </w:r>
+      <w:r>
+        <w:rPr>
+          <w:rStyle w:val="Extranjerismo"/>
+          <w:b/>
+          <w:bCs/>
+          <w:lang w:val="es-CO"/>
+        </w:rPr>
+        <w:t>:</w:t>
       </w:r>
       <w:r>
         <w:rPr>
@@ -16320,7 +16424,7 @@
           <w:szCs w:val="28"/>
           <w:lang w:val="es-419"/>
         </w:rPr>
-        <w:t xml:space="preserve">: </w:t>
+        <w:t xml:space="preserve"> </w:t>
       </w:r>
       <w:r>
         <w:rPr>
@@ -16328,7 +16432,7 @@
           <w:szCs w:val="28"/>
           <w:lang w:val="es-419"/>
         </w:rPr>
-        <w:t>proceso de recibir, inspeccionar y reincorporar productos devueltos (logística inversa).</w:t>
+        <w:t>estrategia logística donde las mercancías pasan directamente de recepción a despacho, sin almacenamiento prolongado.</w:t>
       </w:r>
     </w:p>
     <w:p>
@@ -16346,7 +16450,7 @@
           <w:bCs/>
           <w:lang w:val="es-419"/>
         </w:rPr>
-        <w:t>IoT</w:t>
+        <w:t>Dark store</w:t>
       </w:r>
       <w:r>
         <w:rPr>
@@ -16373,7 +16477,7 @@
           <w:szCs w:val="28"/>
           <w:lang w:val="es-419"/>
         </w:rPr>
-        <w:t>internet de las cosas, red de dispositivos interconectados para monitoreo en tiempo real.</w:t>
+        <w:t>almacén dedicado exclusivamente a cumplir pedidos de comercio electrónico, sin atención al público. Operan para entregas ultrarrápidas (15-30 min).</w:t>
       </w:r>
     </w:p>
     <w:p>
@@ -16384,24 +16488,6 @@
           <w:lang w:val="es-419"/>
         </w:rPr>
       </w:pPr>
-      <w:r>
-        <w:rPr>
-          <w:rStyle w:val="Extranjerismo"/>
-          <w:b/>
-          <w:bCs/>
-          <w:lang w:val="es-419"/>
-        </w:rPr>
-        <w:t>Kitting</w:t>
-      </w:r>
-      <w:r>
-        <w:rPr>
-          <w:rStyle w:val="Extranjerismo"/>
-          <w:b/>
-          <w:bCs/>
-          <w:lang w:val="es-CO"/>
-        </w:rPr>
-        <w:t>:</w:t>
-      </w:r>
       <w:r>
         <w:rPr>
           <w:rFonts w:ascii="Calibri" w:hAnsi="Calibri" w:cs="Calibri"/>
@@ -16410,42 +16496,7 @@
           <w:szCs w:val="28"/>
           <w:lang w:val="es-419"/>
         </w:rPr>
-        <w:t xml:space="preserve"> </w:t>
-      </w:r>
-      <w:r>
-        <w:rPr>
-          <w:rFonts w:ascii="Calibri" w:hAnsi="Calibri" w:cs="Calibri"/>
-          <w:szCs w:val="28"/>
-          <w:lang w:val="es-419"/>
-        </w:rPr>
-        <w:t>proceso de agrupar componentes específicos para ensamblaje o pedidos personalizados.</w:t>
-      </w:r>
-    </w:p>
-    <w:p>
-      <w:pPr>
-        <w:rPr>
-          <w:rFonts w:ascii="Calibri" w:hAnsi="Calibri" w:cs="Calibri"/>
-          <w:szCs w:val="28"/>
-          <w:lang w:val="es-419"/>
-        </w:rPr>
-      </w:pPr>
-      <w:r>
-        <w:rPr>
-          <w:rStyle w:val="Extranjerismo"/>
-          <w:b/>
-          <w:bCs/>
-          <w:lang w:val="es-419"/>
-        </w:rPr>
-        <w:t>Packing</w:t>
-      </w:r>
-      <w:r>
-        <w:rPr>
-          <w:rStyle w:val="Extranjerismo"/>
-          <w:b/>
-          <w:bCs/>
-          <w:lang w:val="es-CO"/>
-        </w:rPr>
-        <w:t>:</w:t>
+        <w:t>Gestión de devoluciones</w:t>
       </w:r>
       <w:r>
         <w:rPr>
@@ -16455,7 +16506,7 @@
           <w:szCs w:val="28"/>
           <w:lang w:val="es-419"/>
         </w:rPr>
-        <w:t xml:space="preserve"> </w:t>
+        <w:t xml:space="preserve">: </w:t>
       </w:r>
       <w:r>
         <w:rPr>
@@ -16463,7 +16514,7 @@
           <w:szCs w:val="28"/>
           <w:lang w:val="es-419"/>
         </w:rPr>
-        <w:t>etapa de embalaje y etiquetado de productos antes del despacho.</w:t>
+        <w:t>proceso de recibir, inspeccionar y reincorporar productos devueltos (logística inversa).</w:t>
       </w:r>
     </w:p>
     <w:p>
@@ -16481,8 +16532,7 @@
           <w:bCs/>
           <w:lang w:val="es-419"/>
         </w:rPr>
-        <w:lastRenderedPageBreak/>
-        <w:t>Picking</w:t>
+        <w:t>IoT</w:t>
       </w:r>
       <w:r>
         <w:rPr>
@@ -16509,25 +16559,35 @@
           <w:szCs w:val="28"/>
           <w:lang w:val="es-419"/>
         </w:rPr>
-        <w:t>p</w:t>
-      </w:r>
-      <w:r>
+        <w:t>internet de las cosas, red de dispositivos interconectados para monitoreo en tiempo real.</w:t>
+      </w:r>
+    </w:p>
+    <w:p>
+      <w:pPr>
         <w:rPr>
           <w:rFonts w:ascii="Calibri" w:hAnsi="Calibri" w:cs="Calibri"/>
           <w:szCs w:val="28"/>
           <w:lang w:val="es-419"/>
         </w:rPr>
-        <w:t>roceso de selección y preparación de pedidos según órdenes de compra.</w:t>
-      </w:r>
-    </w:p>
-    <w:p>
-      <w:pPr>
-        <w:rPr>
-          <w:rFonts w:ascii="Calibri" w:hAnsi="Calibri" w:cs="Calibri"/>
-          <w:szCs w:val="28"/>
+      </w:pPr>
+      <w:r>
+        <w:rPr>
+          <w:rStyle w:val="Extranjerismo"/>
+          <w:b/>
+          <w:bCs/>
           <w:lang w:val="es-419"/>
         </w:rPr>
-      </w:pPr>
+        <w:t>Kitting</w:t>
+      </w:r>
+      <w:r>
+        <w:rPr>
+          <w:rStyle w:val="Extranjerismo"/>
+          <w:b/>
+          <w:bCs/>
+          <w:lang w:val="es-CO"/>
+        </w:rPr>
+        <w:t>:</w:t>
+      </w:r>
       <w:r>
         <w:rPr>
           <w:rFonts w:ascii="Calibri" w:hAnsi="Calibri" w:cs="Calibri"/>
@@ -16536,7 +16596,42 @@
           <w:szCs w:val="28"/>
           <w:lang w:val="es-419"/>
         </w:rPr>
-        <w:t>Normativa ADR</w:t>
+        <w:t xml:space="preserve"> </w:t>
+      </w:r>
+      <w:r>
+        <w:rPr>
+          <w:rFonts w:ascii="Calibri" w:hAnsi="Calibri" w:cs="Calibri"/>
+          <w:szCs w:val="28"/>
+          <w:lang w:val="es-419"/>
+        </w:rPr>
+        <w:t>proceso de agrupar componentes específicos para ensamblaje o pedidos personalizados.</w:t>
+      </w:r>
+    </w:p>
+    <w:p>
+      <w:pPr>
+        <w:rPr>
+          <w:rFonts w:ascii="Calibri" w:hAnsi="Calibri" w:cs="Calibri"/>
+          <w:szCs w:val="28"/>
+          <w:lang w:val="es-419"/>
+        </w:rPr>
+      </w:pPr>
+      <w:r>
+        <w:rPr>
+          <w:rStyle w:val="Extranjerismo"/>
+          <w:b/>
+          <w:bCs/>
+          <w:lang w:val="es-419"/>
+        </w:rPr>
+        <w:t>Packing</w:t>
+      </w:r>
+      <w:r>
+        <w:rPr>
+          <w:rStyle w:val="Extranjerismo"/>
+          <w:b/>
+          <w:bCs/>
+          <w:lang w:val="es-CO"/>
+        </w:rPr>
+        <w:t>:</w:t>
       </w:r>
       <w:r>
         <w:rPr>
@@ -16546,7 +16641,7 @@
           <w:szCs w:val="28"/>
           <w:lang w:val="es-419"/>
         </w:rPr>
-        <w:t xml:space="preserve">: </w:t>
+        <w:t xml:space="preserve"> </w:t>
       </w:r>
       <w:r>
         <w:rPr>
@@ -16554,7 +16649,7 @@
           <w:szCs w:val="28"/>
           <w:lang w:val="es-419"/>
         </w:rPr>
-        <w:t>regulaciones europeas para el transporte terrestre de mercancías peligrosas, aplicables en Colombia para garantizar seguridad y cumplimiento legal.</w:t>
+        <w:t>etapa de embalaje y etiquetado de productos antes del despacho.</w:t>
       </w:r>
     </w:p>
     <w:p>
@@ -16565,6 +16660,25 @@
           <w:lang w:val="es-419"/>
         </w:rPr>
       </w:pPr>
+      <w:r>
+        <w:rPr>
+          <w:rStyle w:val="Extranjerismo"/>
+          <w:b/>
+          <w:bCs/>
+          <w:lang w:val="es-419"/>
+        </w:rPr>
+        <w:lastRenderedPageBreak/>
+        <w:t>Picking</w:t>
+      </w:r>
+      <w:r>
+        <w:rPr>
+          <w:rStyle w:val="Extranjerismo"/>
+          <w:b/>
+          <w:bCs/>
+          <w:lang w:val="es-CO"/>
+        </w:rPr>
+        <w:t>:</w:t>
+      </w:r>
       <w:r>
         <w:rPr>
           <w:rFonts w:ascii="Calibri" w:hAnsi="Calibri" w:cs="Calibri"/>
@@ -16573,8 +16687,33 @@
           <w:szCs w:val="28"/>
           <w:lang w:val="es-419"/>
         </w:rPr>
-        <w:t>RFID</w:t>
-      </w:r>
+        <w:t xml:space="preserve"> </w:t>
+      </w:r>
+      <w:r>
+        <w:rPr>
+          <w:rFonts w:ascii="Calibri" w:hAnsi="Calibri" w:cs="Calibri"/>
+          <w:szCs w:val="28"/>
+          <w:lang w:val="es-419"/>
+        </w:rPr>
+        <w:t>p</w:t>
+      </w:r>
+      <w:r>
+        <w:rPr>
+          <w:rFonts w:ascii="Calibri" w:hAnsi="Calibri" w:cs="Calibri"/>
+          <w:szCs w:val="28"/>
+          <w:lang w:val="es-419"/>
+        </w:rPr>
+        <w:t>roceso de selección y preparación de pedidos según órdenes de compra.</w:t>
+      </w:r>
+    </w:p>
+    <w:p>
+      <w:pPr>
+        <w:rPr>
+          <w:rFonts w:ascii="Calibri" w:hAnsi="Calibri" w:cs="Calibri"/>
+          <w:szCs w:val="28"/>
+          <w:lang w:val="es-419"/>
+        </w:rPr>
+      </w:pPr>
       <w:r>
         <w:rPr>
           <w:rFonts w:ascii="Calibri" w:hAnsi="Calibri" w:cs="Calibri"/>
@@ -16583,41 +16722,8 @@
           <w:szCs w:val="28"/>
           <w:lang w:val="es-419"/>
         </w:rPr>
-        <w:t xml:space="preserve">: </w:t>
-      </w:r>
-      <w:r>
-        <w:rPr>
-          <w:rFonts w:ascii="Calibri" w:hAnsi="Calibri" w:cs="Calibri"/>
-          <w:szCs w:val="28"/>
-          <w:lang w:val="es-419"/>
-        </w:rPr>
-        <w:t xml:space="preserve">es un sistema de almacenamiento y recuperación de datos remotos que </w:t>
-      </w:r>
-      <w:r>
-        <w:rPr>
-          <w:rFonts w:ascii="Calibri" w:hAnsi="Calibri" w:cs="Calibri"/>
-          <w:szCs w:val="28"/>
-          <w:lang w:val="es-419"/>
-        </w:rPr>
-        <w:t>usa dispositivos denominados etiquetas, tarjetas o transpondedores</w:t>
-      </w:r>
-      <w:r>
-        <w:rPr>
-          <w:rFonts w:ascii="Calibri" w:hAnsi="Calibri" w:cs="Calibri"/>
-          <w:szCs w:val="28"/>
-          <w:lang w:val="es-419"/>
-        </w:rPr>
-        <w:t>.</w:t>
-      </w:r>
-    </w:p>
-    <w:p>
-      <w:pPr>
-        <w:rPr>
-          <w:rFonts w:ascii="Calibri" w:hAnsi="Calibri" w:cs="Calibri"/>
-          <w:szCs w:val="28"/>
-          <w:lang w:val="es-419"/>
-        </w:rPr>
-      </w:pPr>
+        <w:t>Normativa ADR</w:t>
+      </w:r>
       <w:r>
         <w:rPr>
           <w:rFonts w:ascii="Calibri" w:hAnsi="Calibri" w:cs="Calibri"/>
@@ -16626,8 +16732,25 @@
           <w:szCs w:val="28"/>
           <w:lang w:val="es-419"/>
         </w:rPr>
-        <w:t>Unitarización</w:t>
-      </w:r>
+        <w:t xml:space="preserve">: </w:t>
+      </w:r>
+      <w:r>
+        <w:rPr>
+          <w:rFonts w:ascii="Calibri" w:hAnsi="Calibri" w:cs="Calibri"/>
+          <w:szCs w:val="28"/>
+          <w:lang w:val="es-419"/>
+        </w:rPr>
+        <w:t>regulaciones europeas para el transporte terrestre de mercancías peligrosas, aplicables en Colombia para garantizar seguridad y cumplimiento legal.</w:t>
+      </w:r>
+    </w:p>
+    <w:p>
+      <w:pPr>
+        <w:rPr>
+          <w:rFonts w:ascii="Calibri" w:hAnsi="Calibri" w:cs="Calibri"/>
+          <w:szCs w:val="28"/>
+          <w:lang w:val="es-419"/>
+        </w:rPr>
+      </w:pPr>
       <w:r>
         <w:rPr>
           <w:rFonts w:ascii="Calibri" w:hAnsi="Calibri" w:cs="Calibri"/>
@@ -16636,40 +16759,8 @@
           <w:szCs w:val="28"/>
           <w:lang w:val="es-419"/>
         </w:rPr>
-        <w:t xml:space="preserve">: </w:t>
-      </w:r>
-      <w:r>
-        <w:rPr>
-          <w:rFonts w:ascii="Calibri" w:hAnsi="Calibri" w:cs="Calibri"/>
-          <w:szCs w:val="28"/>
-          <w:lang w:val="es-419"/>
-        </w:rPr>
-        <w:t>consolidación de carga en unidades (</w:t>
-      </w:r>
-      <w:r>
-        <w:rPr>
-          <w:rStyle w:val="Extranjerismo"/>
-          <w:lang w:val="es-419"/>
-        </w:rPr>
-        <w:t>pallets</w:t>
-      </w:r>
-      <w:r>
-        <w:rPr>
-          <w:rFonts w:ascii="Calibri" w:hAnsi="Calibri" w:cs="Calibri"/>
-          <w:szCs w:val="28"/>
-          <w:lang w:val="es-419"/>
-        </w:rPr>
-        <w:t>, contenedores) para optimizar el transporte.</w:t>
-      </w:r>
-    </w:p>
-    <w:p>
-      <w:pPr>
-        <w:rPr>
-          <w:rFonts w:ascii="Calibri" w:hAnsi="Calibri" w:cs="Calibri"/>
-          <w:szCs w:val="28"/>
-          <w:lang w:val="es-419"/>
-        </w:rPr>
-      </w:pPr>
+        <w:t>RFID</w:t>
+      </w:r>
       <w:r>
         <w:rPr>
           <w:rFonts w:ascii="Calibri" w:hAnsi="Calibri" w:cs="Calibri"/>
@@ -16678,8 +16769,41 @@
           <w:szCs w:val="28"/>
           <w:lang w:val="es-419"/>
         </w:rPr>
-        <w:t>WMS</w:t>
-      </w:r>
+        <w:t xml:space="preserve">: </w:t>
+      </w:r>
+      <w:r>
+        <w:rPr>
+          <w:rFonts w:ascii="Calibri" w:hAnsi="Calibri" w:cs="Calibri"/>
+          <w:szCs w:val="28"/>
+          <w:lang w:val="es-419"/>
+        </w:rPr>
+        <w:t xml:space="preserve">es un sistema de almacenamiento y recuperación de datos remotos que </w:t>
+      </w:r>
+      <w:r>
+        <w:rPr>
+          <w:rFonts w:ascii="Calibri" w:hAnsi="Calibri" w:cs="Calibri"/>
+          <w:szCs w:val="28"/>
+          <w:lang w:val="es-419"/>
+        </w:rPr>
+        <w:t>usa dispositivos denominados etiquetas, tarjetas o transpondedores</w:t>
+      </w:r>
+      <w:r>
+        <w:rPr>
+          <w:rFonts w:ascii="Calibri" w:hAnsi="Calibri" w:cs="Calibri"/>
+          <w:szCs w:val="28"/>
+          <w:lang w:val="es-419"/>
+        </w:rPr>
+        <w:t>.</w:t>
+      </w:r>
+    </w:p>
+    <w:p>
+      <w:pPr>
+        <w:rPr>
+          <w:rFonts w:ascii="Calibri" w:hAnsi="Calibri" w:cs="Calibri"/>
+          <w:szCs w:val="28"/>
+          <w:lang w:val="es-419"/>
+        </w:rPr>
+      </w:pPr>
       <w:r>
         <w:rPr>
           <w:rFonts w:ascii="Calibri" w:hAnsi="Calibri" w:cs="Calibri"/>
@@ -16688,40 +16812,8 @@
           <w:szCs w:val="28"/>
           <w:lang w:val="es-419"/>
         </w:rPr>
-        <w:t xml:space="preserve">: </w:t>
-      </w:r>
-      <w:r>
-        <w:rPr>
-          <w:rFonts w:ascii="Calibri" w:hAnsi="Calibri" w:cs="Calibri"/>
-          <w:szCs w:val="28"/>
-          <w:lang w:val="es-419"/>
-        </w:rPr>
-        <w:t xml:space="preserve">sistema de gestión de almacenes, </w:t>
-      </w:r>
-      <w:r>
-        <w:rPr>
-          <w:rStyle w:val="Extranjerismo"/>
-          <w:lang w:val="es-419"/>
-        </w:rPr>
-        <w:t>software</w:t>
-      </w:r>
-      <w:r>
-        <w:rPr>
-          <w:rFonts w:ascii="Calibri" w:hAnsi="Calibri" w:cs="Calibri"/>
-          <w:szCs w:val="28"/>
-          <w:lang w:val="es-419"/>
-        </w:rPr>
-        <w:t xml:space="preserve"> para controlar inventarios y operaciones.</w:t>
-      </w:r>
-    </w:p>
-    <w:p>
-      <w:pPr>
-        <w:rPr>
-          <w:rFonts w:ascii="Calibri" w:hAnsi="Calibri" w:cs="Calibri"/>
-          <w:szCs w:val="28"/>
-          <w:lang w:val="es-419"/>
-        </w:rPr>
-      </w:pPr>
+        <w:t>Unitarización</w:t>
+      </w:r>
       <w:r>
         <w:rPr>
           <w:rFonts w:ascii="Calibri" w:hAnsi="Calibri" w:cs="Calibri"/>
@@ -16730,8 +16822,40 @@
           <w:szCs w:val="28"/>
           <w:lang w:val="es-419"/>
         </w:rPr>
-        <w:t>Zonificación</w:t>
-      </w:r>
+        <w:t xml:space="preserve">: </w:t>
+      </w:r>
+      <w:r>
+        <w:rPr>
+          <w:rFonts w:ascii="Calibri" w:hAnsi="Calibri" w:cs="Calibri"/>
+          <w:szCs w:val="28"/>
+          <w:lang w:val="es-419"/>
+        </w:rPr>
+        <w:t>consolidación de carga en unidades (</w:t>
+      </w:r>
+      <w:r>
+        <w:rPr>
+          <w:rStyle w:val="Extranjerismo"/>
+          <w:lang w:val="es-419"/>
+        </w:rPr>
+        <w:t>pallets</w:t>
+      </w:r>
+      <w:r>
+        <w:rPr>
+          <w:rFonts w:ascii="Calibri" w:hAnsi="Calibri" w:cs="Calibri"/>
+          <w:szCs w:val="28"/>
+          <w:lang w:val="es-419"/>
+        </w:rPr>
+        <w:t>, contenedores) para optimizar el transporte.</w:t>
+      </w:r>
+    </w:p>
+    <w:p>
+      <w:pPr>
+        <w:rPr>
+          <w:rFonts w:ascii="Calibri" w:hAnsi="Calibri" w:cs="Calibri"/>
+          <w:szCs w:val="28"/>
+          <w:lang w:val="es-419"/>
+        </w:rPr>
+      </w:pPr>
       <w:r>
         <w:rPr>
           <w:rFonts w:ascii="Calibri" w:hAnsi="Calibri" w:cs="Calibri"/>
@@ -16740,19 +16864,9 @@
           <w:szCs w:val="28"/>
           <w:lang w:val="es-419"/>
         </w:rPr>
-        <w:t xml:space="preserve">: </w:t>
-      </w:r>
-      <w:r>
-        <w:rPr>
-          <w:rFonts w:ascii="Calibri" w:hAnsi="Calibri" w:cs="Calibri"/>
-          <w:szCs w:val="28"/>
-          <w:lang w:val="es-419"/>
-        </w:rPr>
-        <w:t>división del almacén en áreas según tipo de producto, rotación o peligrosidad.</w:t>
-      </w:r>
-    </w:p>
-    <w:p>
-      <w:pPr>
+        <w:t>WMS</w:t>
+      </w:r>
+      <w:r>
         <w:rPr>
           <w:rFonts w:ascii="Calibri" w:hAnsi="Calibri" w:cs="Calibri"/>
           <w:b/>
@@ -16760,18 +16874,90 @@
           <w:szCs w:val="28"/>
           <w:lang w:val="es-419"/>
         </w:rPr>
-      </w:pPr>
+        <w:t xml:space="preserve">: </w:t>
+      </w:r>
+      <w:r>
+        <w:rPr>
+          <w:rFonts w:ascii="Calibri" w:hAnsi="Calibri" w:cs="Calibri"/>
+          <w:szCs w:val="28"/>
+          <w:lang w:val="es-419"/>
+        </w:rPr>
+        <w:t xml:space="preserve">sistema de gestión de almacenes, </w:t>
+      </w:r>
+      <w:r>
+        <w:rPr>
+          <w:rStyle w:val="Extranjerismo"/>
+          <w:lang w:val="es-419"/>
+        </w:rPr>
+        <w:t>software</w:t>
+      </w:r>
+      <w:r>
+        <w:rPr>
+          <w:rFonts w:ascii="Calibri" w:hAnsi="Calibri" w:cs="Calibri"/>
+          <w:szCs w:val="28"/>
+          <w:lang w:val="es-419"/>
+        </w:rPr>
+        <w:t xml:space="preserve"> para controlar inventarios y operaciones.</w:t>
+      </w:r>
     </w:p>
     <w:p>
       <w:pPr>
+        <w:rPr>
+          <w:rFonts w:ascii="Calibri" w:hAnsi="Calibri" w:cs="Calibri"/>
+          <w:szCs w:val="28"/>
+          <w:lang w:val="es-419"/>
+        </w:rPr>
+      </w:pPr>
+      <w:r>
+        <w:rPr>
+          <w:rFonts w:ascii="Calibri" w:hAnsi="Calibri" w:cs="Calibri"/>
+          <w:b/>
+          <w:bCs/>
+          <w:szCs w:val="28"/>
+          <w:lang w:val="es-419"/>
+        </w:rPr>
+        <w:t>Zonificación</w:t>
+      </w:r>
+      <w:r>
+        <w:rPr>
+          <w:rFonts w:ascii="Calibri" w:hAnsi="Calibri" w:cs="Calibri"/>
+          <w:b/>
+          <w:bCs/>
+          <w:szCs w:val="28"/>
+          <w:lang w:val="es-419"/>
+        </w:rPr>
+        <w:t xml:space="preserve">: </w:t>
+      </w:r>
+      <w:r>
+        <w:rPr>
+          <w:rFonts w:ascii="Calibri" w:hAnsi="Calibri" w:cs="Calibri"/>
+          <w:szCs w:val="28"/>
+          <w:lang w:val="es-419"/>
+        </w:rPr>
+        <w:t>división del almacén en áreas según tipo de producto, rotación o peligrosidad.</w:t>
+      </w:r>
+    </w:p>
+    <w:p>
+      <w:pPr>
+        <w:rPr>
+          <w:rFonts w:ascii="Calibri" w:hAnsi="Calibri" w:cs="Calibri"/>
+          <w:b/>
+          <w:bCs/>
+          <w:szCs w:val="28"/>
+          <w:lang w:val="es-419"/>
+        </w:rPr>
+      </w:pPr>
+    </w:p>
+    <w:p>
+      <w:pPr>
         <w:pStyle w:val="Titulosgenerales"/>
       </w:pPr>
-      <w:bookmarkStart w:id="27" w:name="_Toc210637678"/>
+      <w:bookmarkStart w:id="25" w:name="_Toc211353665"/>
       <w:r>
         <w:lastRenderedPageBreak/>
         <w:t>Material complementario</w:t>
       </w:r>
-      <w:bookmarkEnd w:id="27"/>
+      <w:bookmarkEnd w:id="25"/>
     </w:p>
     <w:tbl>
       <w:tblPr>
@@ -17502,12 +17688,12 @@
       <w:pPr>
         <w:pStyle w:val="Titulosgenerales"/>
       </w:pPr>
-      <w:bookmarkStart w:id="28" w:name="_Toc210637679"/>
+      <w:bookmarkStart w:id="26" w:name="_Toc211353666"/>
       <w:r>
         <w:lastRenderedPageBreak/>
         <w:t>Referencias bibliográficas</w:t>
       </w:r>
-      <w:bookmarkEnd w:id="28"/>
+      <w:bookmarkEnd w:id="26"/>
       <w:r>
         <w:t xml:space="preserve"> </w:t>
       </w:r>
@@ -17651,49 +17837,9 @@
           <w:color w:val="000000" w:themeColor="text1"/>
           <w:lang w:eastAsia="es-CO"/>
         </w:rPr>
-        <w:t xml:space="preserve">Servicio Nacional de Aprendizaje (SENA). (2021). </w:t>
-      </w:r>
-      <w:proofErr w:type="spellStart"/>
-      <w:r>
-        <w:rPr>
-          <w:color w:val="000000" w:themeColor="text1"/>
-          <w:lang w:eastAsia="es-CO"/>
-        </w:rPr>
-        <w:t>Zajuna</w:t>
-      </w:r>
-      <w:proofErr w:type="spellEnd"/>
-      <w:r>
-        <w:rPr>
-          <w:color w:val="000000" w:themeColor="text1"/>
-          <w:lang w:eastAsia="es-CO"/>
-        </w:rPr>
-        <w:t xml:space="preserve"> Semilla. 121523_2_Virtual-Coordinación de procesos logísticos. </w:t>
+        <w:t xml:space="preserve">Universidad Tecnológica de Chile. (2017). Logística y Distribución. </w:t>
       </w:r>
       <w:hyperlink r:id="rId27" w:history="1">
-        <w:r>
-          <w:rPr>
-            <w:rStyle w:val="Hipervnculo"/>
-            <w:lang w:eastAsia="es-CO"/>
-          </w:rPr>
-          <w:t>https://zajuna.sena.edu.co/zajuna/course/view.php?id=32450</w:t>
-        </w:r>
-      </w:hyperlink>
-    </w:p>
-    <w:p>
-      <w:pPr>
-        <w:rPr>
-          <w:color w:val="000000" w:themeColor="text1"/>
-          <w:lang w:eastAsia="es-CO"/>
-        </w:rPr>
-      </w:pPr>
-      <w:r>
-        <w:rPr>
-          <w:color w:val="000000" w:themeColor="text1"/>
-          <w:lang w:eastAsia="es-CO"/>
-        </w:rPr>
-        <w:t xml:space="preserve">Universidad Tecnológica de Chile. (2017). Logística y Distribución. </w:t>
-      </w:r>
-      <w:hyperlink r:id="rId28" w:history="1">
         <w:r>
           <w:rPr>
             <w:rStyle w:val="Hipervnculo"/>
@@ -17723,7 +17869,7 @@
       <w:pPr>
         <w:pStyle w:val="Titulosgenerales"/>
       </w:pPr>
-      <w:bookmarkStart w:id="29" w:name="_Toc210637680"/>
+      <w:bookmarkStart w:id="27" w:name="_Toc211353667"/>
       <w:r>
         <w:lastRenderedPageBreak/>
         <w:t>C</w:t>
@@ -17731,7 +17877,7 @@
       <w:r>
         <w:t>réditos</w:t>
       </w:r>
-      <w:bookmarkEnd w:id="29"/>
+      <w:bookmarkEnd w:id="27"/>
     </w:p>
     <w:tbl>
       <w:tblPr>
@@ -17741,9 +17887,9 @@
         <w:tblLook w:val="04A0" w:firstRow="1" w:lastRow="0" w:firstColumn="1" w:lastColumn="0" w:noHBand="0" w:noVBand="1"/>
       </w:tblPr>
       <w:tblGrid>
-        <w:gridCol w:w="2830"/>
+        <w:gridCol w:w="3114"/>
+        <w:gridCol w:w="3685"/>
         <w:gridCol w:w="3261"/>
-        <w:gridCol w:w="3969"/>
       </w:tblGrid>
       <w:tr>
         <w:trPr>
@@ -17753,7 +17899,7 @@
         </w:trPr>
         <w:tc>
           <w:tcPr>
-            <w:tcW w:w="2830" w:type="dxa"/>
+            <w:tcW w:w="3114" w:type="dxa"/>
           </w:tcPr>
           <w:p>
             <w:pPr>
@@ -17769,6 +17915,27 @@
                 <w:lang w:val="es-419" w:eastAsia="es-CO"/>
               </w:rPr>
               <w:t>Nombre</w:t>
+            </w:r>
+          </w:p>
+        </w:tc>
+        <w:tc>
+          <w:tcPr>
+            <w:tcW w:w="3685" w:type="dxa"/>
+          </w:tcPr>
+          <w:p>
+            <w:pPr>
+              <w:ind w:firstLine="0"/>
+              <w:rPr>
+                <w:szCs w:val="28"/>
+                <w:lang w:val="es-419" w:eastAsia="es-CO"/>
+              </w:rPr>
+            </w:pPr>
+            <w:r>
+              <w:rPr>
+                <w:szCs w:val="28"/>
+                <w:lang w:val="es-419" w:eastAsia="es-CO"/>
+              </w:rPr>
+              <w:t>Cargo</w:t>
             </w:r>
           </w:p>
         </w:tc>
@@ -17789,27 +17956,6 @@
                 <w:szCs w:val="28"/>
                 <w:lang w:val="es-419" w:eastAsia="es-CO"/>
               </w:rPr>
-              <w:t>Cargo</w:t>
-            </w:r>
-          </w:p>
-        </w:tc>
-        <w:tc>
-          <w:tcPr>
-            <w:tcW w:w="3969" w:type="dxa"/>
-          </w:tcPr>
-          <w:p>
-            <w:pPr>
-              <w:ind w:firstLine="0"/>
-              <w:rPr>
-                <w:szCs w:val="28"/>
-                <w:lang w:val="es-419" w:eastAsia="es-CO"/>
-              </w:rPr>
-            </w:pPr>
-            <w:r>
-              <w:rPr>
-                <w:szCs w:val="28"/>
-                <w:lang w:val="es-419" w:eastAsia="es-CO"/>
-              </w:rPr>
               <w:t>Centro de Formación</w:t>
             </w:r>
             <w:r>
@@ -17828,7 +17974,7 @@
         </w:trPr>
         <w:tc>
           <w:tcPr>
-            <w:tcW w:w="2830" w:type="dxa"/>
+            <w:tcW w:w="3114" w:type="dxa"/>
           </w:tcPr>
           <w:p>
             <w:pPr>
@@ -17846,6 +17992,29 @@
                 <w:szCs w:val="28"/>
               </w:rPr>
               <w:t>Milady Tatiana Villamil Castellanos</w:t>
+            </w:r>
+          </w:p>
+        </w:tc>
+        <w:tc>
+          <w:tcPr>
+            <w:tcW w:w="3685" w:type="dxa"/>
+          </w:tcPr>
+          <w:p>
+            <w:pPr>
+              <w:pStyle w:val="TextoTablas"/>
+              <w:rPr>
+                <w:rFonts w:cs="Calibri"/>
+                <w:sz w:val="28"/>
+                <w:szCs w:val="28"/>
+              </w:rPr>
+            </w:pPr>
+            <w:r>
+              <w:rPr>
+                <w:rFonts w:cs="Calibri"/>
+                <w:sz w:val="28"/>
+                <w:szCs w:val="28"/>
+              </w:rPr>
+              <w:t>Responsable del Ecosistema de Recursos Educativos Digitales (RED)</w:t>
             </w:r>
           </w:p>
         </w:tc>
@@ -17868,29 +18037,6 @@
                 <w:sz w:val="28"/>
                 <w:szCs w:val="28"/>
               </w:rPr>
-              <w:t>Responsable del Ecosistema de Recursos Educativos Digitales (RED)</w:t>
-            </w:r>
-          </w:p>
-        </w:tc>
-        <w:tc>
-          <w:tcPr>
-            <w:tcW w:w="3969" w:type="dxa"/>
-          </w:tcPr>
-          <w:p>
-            <w:pPr>
-              <w:pStyle w:val="TextoTablas"/>
-              <w:rPr>
-                <w:rFonts w:cs="Calibri"/>
-                <w:sz w:val="28"/>
-                <w:szCs w:val="28"/>
-              </w:rPr>
-            </w:pPr>
-            <w:r>
-              <w:rPr>
-                <w:rFonts w:cs="Calibri"/>
-                <w:sz w:val="28"/>
-                <w:szCs w:val="28"/>
-              </w:rPr>
               <w:t xml:space="preserve">Dirección </w:t>
             </w:r>
             <w:r>
@@ -17915,7 +18061,7 @@
       <w:tr>
         <w:tc>
           <w:tcPr>
-            <w:tcW w:w="2830" w:type="dxa"/>
+            <w:tcW w:w="3114" w:type="dxa"/>
           </w:tcPr>
           <w:p>
             <w:pPr>
@@ -17933,6 +18079,61 @@
                 <w:szCs w:val="28"/>
               </w:rPr>
               <w:t>Miguel de Jesús Paredes Maestre</w:t>
+            </w:r>
+          </w:p>
+        </w:tc>
+        <w:tc>
+          <w:tcPr>
+            <w:tcW w:w="3685" w:type="dxa"/>
+          </w:tcPr>
+          <w:p>
+            <w:pPr>
+              <w:pStyle w:val="TextoTablas"/>
+              <w:rPr>
+                <w:rFonts w:cs="Calibri"/>
+                <w:sz w:val="28"/>
+                <w:szCs w:val="28"/>
+              </w:rPr>
+            </w:pPr>
+            <w:r>
+              <w:rPr>
+                <w:rFonts w:cs="Calibri"/>
+                <w:sz w:val="28"/>
+                <w:szCs w:val="28"/>
+              </w:rPr>
+              <w:t xml:space="preserve">Responsable de </w:t>
+            </w:r>
+            <w:r>
+              <w:rPr>
+                <w:rFonts w:cs="Calibri"/>
+                <w:sz w:val="28"/>
+                <w:szCs w:val="28"/>
+              </w:rPr>
+              <w:t>l</w:t>
+            </w:r>
+            <w:r>
+              <w:rPr>
+                <w:rFonts w:cs="Calibri"/>
+                <w:sz w:val="28"/>
+                <w:szCs w:val="28"/>
+              </w:rPr>
+              <w:t xml:space="preserve">ínea de </w:t>
+            </w:r>
+            <w:r>
+              <w:rPr>
+                <w:rFonts w:cs="Calibri"/>
+                <w:sz w:val="28"/>
+                <w:szCs w:val="28"/>
+              </w:rPr>
+              <w:t>p</w:t>
+            </w:r>
+            <w:r>
+              <w:rPr>
+                <w:rFonts w:cs="Calibri"/>
+                <w:sz w:val="28"/>
+                <w:szCs w:val="28"/>
+              </w:rPr>
+              <w:t>roducción</w:t>
             </w:r>
           </w:p>
         </w:tc>
@@ -17955,61 +18156,6 @@
                 <w:sz w:val="28"/>
                 <w:szCs w:val="28"/>
               </w:rPr>
-              <w:t xml:space="preserve">Responsable de </w:t>
-            </w:r>
-            <w:r>
-              <w:rPr>
-                <w:rFonts w:cs="Calibri"/>
-                <w:sz w:val="28"/>
-                <w:szCs w:val="28"/>
-              </w:rPr>
-              <w:t>l</w:t>
-            </w:r>
-            <w:r>
-              <w:rPr>
-                <w:rFonts w:cs="Calibri"/>
-                <w:sz w:val="28"/>
-                <w:szCs w:val="28"/>
-              </w:rPr>
-              <w:t xml:space="preserve">ínea de </w:t>
-            </w:r>
-            <w:r>
-              <w:rPr>
-                <w:rFonts w:cs="Calibri"/>
-                <w:sz w:val="28"/>
-                <w:szCs w:val="28"/>
-              </w:rPr>
-              <w:t>p</w:t>
-            </w:r>
-            <w:r>
-              <w:rPr>
-                <w:rFonts w:cs="Calibri"/>
-                <w:sz w:val="28"/>
-                <w:szCs w:val="28"/>
-              </w:rPr>
-              <w:t>roducción</w:t>
-            </w:r>
-          </w:p>
-        </w:tc>
-        <w:tc>
-          <w:tcPr>
-            <w:tcW w:w="3969" w:type="dxa"/>
-          </w:tcPr>
-          <w:p>
-            <w:pPr>
-              <w:pStyle w:val="TextoTablas"/>
-              <w:rPr>
-                <w:rFonts w:cs="Calibri"/>
-                <w:sz w:val="28"/>
-                <w:szCs w:val="28"/>
-              </w:rPr>
-            </w:pPr>
-            <w:r>
-              <w:rPr>
-                <w:rFonts w:cs="Calibri"/>
-                <w:sz w:val="28"/>
-                <w:szCs w:val="28"/>
-              </w:rPr>
               <w:t xml:space="preserve">Centro de Comercio y Servicios </w:t>
             </w:r>
             <w:r>
@@ -18037,7 +18183,7 @@
         </w:trPr>
         <w:tc>
           <w:tcPr>
-            <w:tcW w:w="2830" w:type="dxa"/>
+            <w:tcW w:w="3114" w:type="dxa"/>
           </w:tcPr>
           <w:p>
             <w:pPr>
@@ -18054,6 +18200,49 @@
                 <w:szCs w:val="28"/>
               </w:rPr>
               <w:t>Yesis Arturo Choperena Guerrero</w:t>
+            </w:r>
+          </w:p>
+        </w:tc>
+        <w:tc>
+          <w:tcPr>
+            <w:tcW w:w="3685" w:type="dxa"/>
+          </w:tcPr>
+          <w:p>
+            <w:pPr>
+              <w:pStyle w:val="TextoTablas"/>
+              <w:rPr>
+                <w:rFonts w:cs="Calibri"/>
+                <w:sz w:val="28"/>
+                <w:szCs w:val="28"/>
+              </w:rPr>
+            </w:pPr>
+            <w:r>
+              <w:rPr>
+                <w:sz w:val="28"/>
+                <w:szCs w:val="28"/>
+              </w:rPr>
+              <w:t>Expert</w:t>
+            </w:r>
+            <w:r>
+              <w:rPr>
+                <w:sz w:val="28"/>
+                <w:szCs w:val="28"/>
+              </w:rPr>
+              <w:t>o</w:t>
+            </w:r>
+            <w:r>
+              <w:rPr>
+                <w:sz w:val="28"/>
+                <w:szCs w:val="28"/>
+              </w:rPr>
+              <w:t xml:space="preserve"> temátic</w:t>
+            </w:r>
+            <w:r>
+              <w:rPr>
+                <w:sz w:val="28"/>
+                <w:szCs w:val="28"/>
+              </w:rPr>
+              <w:t>o</w:t>
             </w:r>
           </w:p>
         </w:tc>
@@ -18072,49 +18261,6 @@
             </w:pPr>
             <w:r>
               <w:rPr>
-                <w:sz w:val="28"/>
-                <w:szCs w:val="28"/>
-              </w:rPr>
-              <w:t>Expert</w:t>
-            </w:r>
-            <w:r>
-              <w:rPr>
-                <w:sz w:val="28"/>
-                <w:szCs w:val="28"/>
-              </w:rPr>
-              <w:t>o</w:t>
-            </w:r>
-            <w:r>
-              <w:rPr>
-                <w:sz w:val="28"/>
-                <w:szCs w:val="28"/>
-              </w:rPr>
-              <w:t xml:space="preserve"> temátic</w:t>
-            </w:r>
-            <w:r>
-              <w:rPr>
-                <w:sz w:val="28"/>
-                <w:szCs w:val="28"/>
-              </w:rPr>
-              <w:t>o</w:t>
-            </w:r>
-          </w:p>
-        </w:tc>
-        <w:tc>
-          <w:tcPr>
-            <w:tcW w:w="3969" w:type="dxa"/>
-          </w:tcPr>
-          <w:p>
-            <w:pPr>
-              <w:pStyle w:val="TextoTablas"/>
-              <w:rPr>
-                <w:rFonts w:cs="Calibri"/>
-                <w:sz w:val="28"/>
-                <w:szCs w:val="28"/>
-              </w:rPr>
-            </w:pPr>
-            <w:r>
-              <w:rPr>
                 <w:rFonts w:cs="Calibri"/>
                 <w:sz w:val="28"/>
                 <w:szCs w:val="28"/>
@@ -18127,7 +18273,7 @@
       <w:tr>
         <w:tc>
           <w:tcPr>
-            <w:tcW w:w="2830" w:type="dxa"/>
+            <w:tcW w:w="3114" w:type="dxa"/>
           </w:tcPr>
           <w:p>
             <w:pPr>
@@ -18150,6 +18296,27 @@
                 <w:szCs w:val="28"/>
               </w:rPr>
               <w:t xml:space="preserve"> Gallardo</w:t>
+            </w:r>
+          </w:p>
+        </w:tc>
+        <w:tc>
+          <w:tcPr>
+            <w:tcW w:w="3685" w:type="dxa"/>
+          </w:tcPr>
+          <w:p>
+            <w:pPr>
+              <w:pStyle w:val="TextoTablas"/>
+              <w:rPr>
+                <w:sz w:val="28"/>
+                <w:szCs w:val="28"/>
+              </w:rPr>
+            </w:pPr>
+            <w:r>
+              <w:rPr>
+                <w:sz w:val="28"/>
+                <w:szCs w:val="28"/>
+              </w:rPr>
+              <w:t>Evaluador instruccional</w:t>
             </w:r>
           </w:p>
         </w:tc>
@@ -18170,27 +18337,6 @@
                 <w:sz w:val="28"/>
                 <w:szCs w:val="28"/>
               </w:rPr>
-              <w:t>Evaluador instruccional</w:t>
-            </w:r>
-          </w:p>
-        </w:tc>
-        <w:tc>
-          <w:tcPr>
-            <w:tcW w:w="3969" w:type="dxa"/>
-          </w:tcPr>
-          <w:p>
-            <w:pPr>
-              <w:pStyle w:val="TextoTablas"/>
-              <w:rPr>
-                <w:sz w:val="28"/>
-                <w:szCs w:val="28"/>
-              </w:rPr>
-            </w:pPr>
-            <w:r>
-              <w:rPr>
-                <w:sz w:val="28"/>
-                <w:szCs w:val="28"/>
-              </w:rPr>
               <w:t>Centro de Comercio y Servicios -Regional Atlántico</w:t>
             </w:r>
           </w:p>
@@ -18202,7 +18348,7 @@
         </w:trPr>
         <w:tc>
           <w:tcPr>
-            <w:tcW w:w="2830" w:type="dxa"/>
+            <w:tcW w:w="3114" w:type="dxa"/>
           </w:tcPr>
           <w:p>
             <w:pPr>
@@ -18219,6 +18365,36 @@
                 <w:szCs w:val="28"/>
               </w:rPr>
               <w:t>Antonio Vecino Valero</w:t>
+            </w:r>
+          </w:p>
+        </w:tc>
+        <w:tc>
+          <w:tcPr>
+            <w:tcW w:w="3685" w:type="dxa"/>
+          </w:tcPr>
+          <w:p>
+            <w:pPr>
+              <w:pStyle w:val="TextoTablas"/>
+              <w:rPr>
+                <w:rFonts w:cs="Calibri"/>
+                <w:sz w:val="28"/>
+                <w:szCs w:val="28"/>
+              </w:rPr>
+            </w:pPr>
+            <w:r>
+              <w:rPr>
+                <w:sz w:val="28"/>
+                <w:szCs w:val="28"/>
+              </w:rPr>
+              <w:t xml:space="preserve">Diseñador </w:t>
+            </w:r>
+            <w:r>
+              <w:rPr>
+                <w:rStyle w:val="Extranjerismo"/>
+                <w:sz w:val="28"/>
+                <w:szCs w:val="28"/>
+              </w:rPr>
+              <w:t xml:space="preserve">web </w:t>
             </w:r>
           </w:p>
         </w:tc>
@@ -18240,36 +18416,6 @@
                 <w:sz w:val="28"/>
                 <w:szCs w:val="28"/>
               </w:rPr>
-              <w:t xml:space="preserve">Diseñador </w:t>
-            </w:r>
-            <w:r>
-              <w:rPr>
-                <w:rStyle w:val="Extranjerismo"/>
-                <w:sz w:val="28"/>
-                <w:szCs w:val="28"/>
-              </w:rPr>
-              <w:t xml:space="preserve">web </w:t>
-            </w:r>
-          </w:p>
-        </w:tc>
-        <w:tc>
-          <w:tcPr>
-            <w:tcW w:w="3969" w:type="dxa"/>
-          </w:tcPr>
-          <w:p>
-            <w:pPr>
-              <w:pStyle w:val="TextoTablas"/>
-              <w:rPr>
-                <w:rFonts w:cs="Calibri"/>
-                <w:sz w:val="28"/>
-                <w:szCs w:val="28"/>
-              </w:rPr>
-            </w:pPr>
-            <w:r>
-              <w:rPr>
-                <w:sz w:val="28"/>
-                <w:szCs w:val="28"/>
-              </w:rPr>
               <w:t>Centro de Comercio y Servicios -Regional Atlántico</w:t>
             </w:r>
           </w:p>
@@ -18278,7 +18424,7 @@
       <w:tr>
         <w:tc>
           <w:tcPr>
-            <w:tcW w:w="2830" w:type="dxa"/>
+            <w:tcW w:w="3114" w:type="dxa"/>
           </w:tcPr>
           <w:p>
             <w:pPr>
@@ -18295,6 +18441,44 @@
                 <w:szCs w:val="28"/>
               </w:rPr>
               <w:t>Fabio Fonseca Arguelles</w:t>
+            </w:r>
+          </w:p>
+        </w:tc>
+        <w:tc>
+          <w:tcPr>
+            <w:tcW w:w="3685" w:type="dxa"/>
+          </w:tcPr>
+          <w:p>
+            <w:pPr>
+              <w:pStyle w:val="TextoTablas"/>
+              <w:rPr>
+                <w:rFonts w:cs="Calibri"/>
+                <w:sz w:val="28"/>
+                <w:szCs w:val="28"/>
+              </w:rPr>
+            </w:pPr>
+            <w:r>
+              <w:rPr>
+                <w:sz w:val="28"/>
+                <w:szCs w:val="28"/>
+              </w:rPr>
+              <w:t xml:space="preserve">Desarrollador </w:t>
+            </w:r>
+            <w:r>
+              <w:rPr>
+                <w:rStyle w:val="Extranjerismo"/>
+                <w:sz w:val="28"/>
+                <w:szCs w:val="28"/>
+              </w:rPr>
+              <w:t>full stack</w:t>
+            </w:r>
+            <w:r>
+              <w:rPr>
+                <w:rStyle w:val="Extranjerismo"/>
+                <w:sz w:val="28"/>
+                <w:szCs w:val="28"/>
+              </w:rPr>
+              <w:t xml:space="preserve"> junior</w:t>
             </w:r>
           </w:p>
         </w:tc>
@@ -18313,44 +18497,6 @@
             </w:pPr>
             <w:r>
               <w:rPr>
-                <w:sz w:val="28"/>
-                <w:szCs w:val="28"/>
-              </w:rPr>
-              <w:t xml:space="preserve">Desarrollador </w:t>
-            </w:r>
-            <w:r>
-              <w:rPr>
-                <w:rStyle w:val="Extranjerismo"/>
-                <w:sz w:val="28"/>
-                <w:szCs w:val="28"/>
-              </w:rPr>
-              <w:t>full stack</w:t>
-            </w:r>
-            <w:r>
-              <w:rPr>
-                <w:rStyle w:val="Extranjerismo"/>
-                <w:sz w:val="28"/>
-                <w:szCs w:val="28"/>
-              </w:rPr>
-              <w:t xml:space="preserve"> junior</w:t>
-            </w:r>
-          </w:p>
-        </w:tc>
-        <w:tc>
-          <w:tcPr>
-            <w:tcW w:w="3969" w:type="dxa"/>
-          </w:tcPr>
-          <w:p>
-            <w:pPr>
-              <w:pStyle w:val="TextoTablas"/>
-              <w:rPr>
-                <w:rFonts w:cs="Calibri"/>
-                <w:sz w:val="28"/>
-                <w:szCs w:val="28"/>
-              </w:rPr>
-            </w:pPr>
-            <w:r>
-              <w:rPr>
                 <w:rFonts w:cs="Calibri"/>
                 <w:sz w:val="28"/>
                 <w:szCs w:val="28"/>
@@ -18366,7 +18512,7 @@
         </w:trPr>
         <w:tc>
           <w:tcPr>
-            <w:tcW w:w="2830" w:type="dxa"/>
+            <w:tcW w:w="3114" w:type="dxa"/>
           </w:tcPr>
           <w:p>
             <w:pPr>
@@ -18384,6 +18530,29 @@
                 <w:szCs w:val="28"/>
               </w:rPr>
               <w:t>Alexander Rafael Acosta Bedoya</w:t>
+            </w:r>
+          </w:p>
+        </w:tc>
+        <w:tc>
+          <w:tcPr>
+            <w:tcW w:w="3685" w:type="dxa"/>
+          </w:tcPr>
+          <w:p>
+            <w:pPr>
+              <w:pStyle w:val="TextoTablas"/>
+              <w:rPr>
+                <w:rFonts w:cs="Calibri"/>
+                <w:sz w:val="28"/>
+                <w:szCs w:val="28"/>
+              </w:rPr>
+            </w:pPr>
+            <w:r>
+              <w:rPr>
+                <w:rFonts w:cs="Calibri"/>
+                <w:sz w:val="28"/>
+                <w:szCs w:val="28"/>
+              </w:rPr>
+              <w:t>Animador y productor audiovisual</w:t>
             </w:r>
           </w:p>
         </w:tc>
@@ -18406,29 +18575,6 @@
                 <w:sz w:val="28"/>
                 <w:szCs w:val="28"/>
               </w:rPr>
-              <w:t>Animador y productor audiovisual</w:t>
-            </w:r>
-          </w:p>
-        </w:tc>
-        <w:tc>
-          <w:tcPr>
-            <w:tcW w:w="3969" w:type="dxa"/>
-          </w:tcPr>
-          <w:p>
-            <w:pPr>
-              <w:pStyle w:val="TextoTablas"/>
-              <w:rPr>
-                <w:rFonts w:cs="Calibri"/>
-                <w:sz w:val="28"/>
-                <w:szCs w:val="28"/>
-              </w:rPr>
-            </w:pPr>
-            <w:r>
-              <w:rPr>
-                <w:rFonts w:cs="Calibri"/>
-                <w:sz w:val="28"/>
-                <w:szCs w:val="28"/>
-              </w:rPr>
               <w:t>Centro de Comercio y Servicios - Regional Atlántico</w:t>
             </w:r>
           </w:p>
@@ -18437,7 +18583,7 @@
       <w:tr>
         <w:tc>
           <w:tcPr>
-            <w:tcW w:w="2830" w:type="dxa"/>
+            <w:tcW w:w="3114" w:type="dxa"/>
           </w:tcPr>
           <w:p>
             <w:pPr>
@@ -18455,6 +18601,45 @@
                 <w:szCs w:val="28"/>
               </w:rPr>
               <w:t>María Fernanda Morales Angulo</w:t>
+            </w:r>
+          </w:p>
+        </w:tc>
+        <w:tc>
+          <w:tcPr>
+            <w:tcW w:w="3685" w:type="dxa"/>
+          </w:tcPr>
+          <w:p>
+            <w:pPr>
+              <w:pStyle w:val="TextoTablas"/>
+              <w:rPr>
+                <w:rFonts w:cs="Calibri"/>
+                <w:sz w:val="28"/>
+                <w:szCs w:val="28"/>
+              </w:rPr>
+            </w:pPr>
+            <w:r>
+              <w:rPr>
+                <w:rFonts w:cs="Calibri"/>
+                <w:sz w:val="28"/>
+                <w:szCs w:val="28"/>
+              </w:rPr>
+              <w:t xml:space="preserve">Evaluador </w:t>
+            </w:r>
+            <w:r>
+              <w:rPr>
+                <w:rFonts w:cs="Calibri"/>
+                <w:sz w:val="28"/>
+                <w:szCs w:val="28"/>
+              </w:rPr>
+              <w:t>de</w:t>
+            </w:r>
+            <w:r>
+              <w:rPr>
+                <w:rFonts w:cs="Calibri"/>
+                <w:sz w:val="28"/>
+                <w:szCs w:val="28"/>
+              </w:rPr>
+              <w:t xml:space="preserve"> contenidos inclusivos y accesibles</w:t>
             </w:r>
           </w:p>
         </w:tc>
@@ -18477,45 +18662,6 @@
                 <w:sz w:val="28"/>
                 <w:szCs w:val="28"/>
               </w:rPr>
-              <w:t xml:space="preserve">Evaluador </w:t>
-            </w:r>
-            <w:r>
-              <w:rPr>
-                <w:rFonts w:cs="Calibri"/>
-                <w:sz w:val="28"/>
-                <w:szCs w:val="28"/>
-              </w:rPr>
-              <w:t>de</w:t>
-            </w:r>
-            <w:r>
-              <w:rPr>
-                <w:rFonts w:cs="Calibri"/>
-                <w:sz w:val="28"/>
-                <w:szCs w:val="28"/>
-              </w:rPr>
-              <w:t xml:space="preserve"> contenidos inclusivos y accesibles</w:t>
-            </w:r>
-          </w:p>
-        </w:tc>
-        <w:tc>
-          <w:tcPr>
-            <w:tcW w:w="3969" w:type="dxa"/>
-          </w:tcPr>
-          <w:p>
-            <w:pPr>
-              <w:pStyle w:val="TextoTablas"/>
-              <w:rPr>
-                <w:rFonts w:cs="Calibri"/>
-                <w:sz w:val="28"/>
-                <w:szCs w:val="28"/>
-              </w:rPr>
-            </w:pPr>
-            <w:r>
-              <w:rPr>
-                <w:rFonts w:cs="Calibri"/>
-                <w:sz w:val="28"/>
-                <w:szCs w:val="28"/>
-              </w:rPr>
               <w:t>Centro de Comercio y Servicios - Regional Atlántico</w:t>
             </w:r>
           </w:p>
@@ -18527,7 +18673,7 @@
         </w:trPr>
         <w:tc>
           <w:tcPr>
-            <w:tcW w:w="2830" w:type="dxa"/>
+            <w:tcW w:w="3114" w:type="dxa"/>
           </w:tcPr>
           <w:p>
             <w:pPr>
@@ -18544,7 +18690,47 @@
                 <w:sz w:val="28"/>
                 <w:szCs w:val="28"/>
               </w:rPr>
+              <w:lastRenderedPageBreak/>
               <w:t>Luz Karime Amaya Cabra</w:t>
+            </w:r>
+          </w:p>
+        </w:tc>
+        <w:tc>
+          <w:tcPr>
+            <w:tcW w:w="3685" w:type="dxa"/>
+          </w:tcPr>
+          <w:p>
+            <w:pPr>
+              <w:pStyle w:val="TextoTablas"/>
+              <w:rPr>
+                <w:rFonts w:cs="Calibri"/>
+                <w:sz w:val="28"/>
+                <w:szCs w:val="28"/>
+              </w:rPr>
+            </w:pPr>
+            <w:r>
+              <w:rPr>
+                <w:rFonts w:cs="Calibri"/>
+                <w:sz w:val="28"/>
+                <w:szCs w:val="28"/>
+              </w:rPr>
+              <w:t xml:space="preserve">Evaluador </w:t>
+            </w:r>
+            <w:r>
+              <w:rPr>
+                <w:rFonts w:cs="Calibri"/>
+                <w:sz w:val="28"/>
+                <w:szCs w:val="28"/>
+              </w:rPr>
+              <w:t>de</w:t>
+            </w:r>
+            <w:r>
+              <w:rPr>
+                <w:rFonts w:cs="Calibri"/>
+                <w:sz w:val="28"/>
+                <w:szCs w:val="28"/>
+              </w:rPr>
+              <w:t xml:space="preserve"> contenidos inclusivos y accesibles</w:t>
             </w:r>
           </w:p>
         </w:tc>
@@ -18567,45 +18753,6 @@
                 <w:sz w:val="28"/>
                 <w:szCs w:val="28"/>
               </w:rPr>
-              <w:t xml:space="preserve">Evaluador </w:t>
-            </w:r>
-            <w:r>
-              <w:rPr>
-                <w:rFonts w:cs="Calibri"/>
-                <w:sz w:val="28"/>
-                <w:szCs w:val="28"/>
-              </w:rPr>
-              <w:t>de</w:t>
-            </w:r>
-            <w:r>
-              <w:rPr>
-                <w:rFonts w:cs="Calibri"/>
-                <w:sz w:val="28"/>
-                <w:szCs w:val="28"/>
-              </w:rPr>
-              <w:t xml:space="preserve"> contenidos inclusivos y accesibles</w:t>
-            </w:r>
-          </w:p>
-        </w:tc>
-        <w:tc>
-          <w:tcPr>
-            <w:tcW w:w="3969" w:type="dxa"/>
-          </w:tcPr>
-          <w:p>
-            <w:pPr>
-              <w:pStyle w:val="TextoTablas"/>
-              <w:rPr>
-                <w:rFonts w:cs="Calibri"/>
-                <w:sz w:val="28"/>
-                <w:szCs w:val="28"/>
-              </w:rPr>
-            </w:pPr>
-            <w:r>
-              <w:rPr>
-                <w:rFonts w:cs="Calibri"/>
-                <w:sz w:val="28"/>
-                <w:szCs w:val="28"/>
-              </w:rPr>
               <w:t>Centro de Comercio y Servicios - Regional Atlántico</w:t>
             </w:r>
           </w:p>
@@ -18614,7 +18761,7 @@
       <w:tr>
         <w:tc>
           <w:tcPr>
-            <w:tcW w:w="2830" w:type="dxa"/>
+            <w:tcW w:w="3114" w:type="dxa"/>
           </w:tcPr>
           <w:p>
             <w:pPr>
@@ -18648,6 +18795,29 @@
                 <w:szCs w:val="28"/>
               </w:rPr>
               <w:t xml:space="preserve"> Villafañe</w:t>
+            </w:r>
+          </w:p>
+        </w:tc>
+        <w:tc>
+          <w:tcPr>
+            <w:tcW w:w="3685" w:type="dxa"/>
+          </w:tcPr>
+          <w:p>
+            <w:pPr>
+              <w:pStyle w:val="TextoTablas"/>
+              <w:rPr>
+                <w:rFonts w:cs="Calibri"/>
+                <w:sz w:val="28"/>
+                <w:szCs w:val="28"/>
+              </w:rPr>
+            </w:pPr>
+            <w:r>
+              <w:rPr>
+                <w:rFonts w:cs="Calibri"/>
+                <w:sz w:val="28"/>
+                <w:szCs w:val="28"/>
+              </w:rPr>
+              <w:t>Validador y vinculador de recursos digitales</w:t>
             </w:r>
           </w:p>
         </w:tc>
@@ -18670,29 +18840,6 @@
                 <w:sz w:val="28"/>
                 <w:szCs w:val="28"/>
               </w:rPr>
-              <w:t>Validador y vinculador de recursos digitales</w:t>
-            </w:r>
-          </w:p>
-        </w:tc>
-        <w:tc>
-          <w:tcPr>
-            <w:tcW w:w="3969" w:type="dxa"/>
-          </w:tcPr>
-          <w:p>
-            <w:pPr>
-              <w:pStyle w:val="TextoTablas"/>
-              <w:rPr>
-                <w:rFonts w:cs="Calibri"/>
-                <w:sz w:val="28"/>
-                <w:szCs w:val="28"/>
-              </w:rPr>
-            </w:pPr>
-            <w:r>
-              <w:rPr>
-                <w:rFonts w:cs="Calibri"/>
-                <w:sz w:val="28"/>
-                <w:szCs w:val="28"/>
-              </w:rPr>
               <w:t>Centro de Comercio y Servicios - Regional Atlántico</w:t>
             </w:r>
           </w:p>
@@ -18704,7 +18851,7 @@
         </w:trPr>
         <w:tc>
           <w:tcPr>
-            <w:tcW w:w="2830" w:type="dxa"/>
+            <w:tcW w:w="3114" w:type="dxa"/>
           </w:tcPr>
           <w:p>
             <w:pPr>
@@ -18722,6 +18869,29 @@
                 <w:szCs w:val="28"/>
               </w:rPr>
               <w:t>Jairo Luis Valencia Ebratt</w:t>
+            </w:r>
+          </w:p>
+        </w:tc>
+        <w:tc>
+          <w:tcPr>
+            <w:tcW w:w="3685" w:type="dxa"/>
+          </w:tcPr>
+          <w:p>
+            <w:pPr>
+              <w:pStyle w:val="TextoTablas"/>
+              <w:rPr>
+                <w:rFonts w:cs="Calibri"/>
+                <w:sz w:val="28"/>
+                <w:szCs w:val="28"/>
+              </w:rPr>
+            </w:pPr>
+            <w:r>
+              <w:rPr>
+                <w:rFonts w:cs="Calibri"/>
+                <w:sz w:val="28"/>
+                <w:szCs w:val="28"/>
+              </w:rPr>
+              <w:t>Validador y vinculador de recursos digitales</w:t>
             </w:r>
           </w:p>
         </w:tc>
@@ -18744,29 +18914,6 @@
                 <w:sz w:val="28"/>
                 <w:szCs w:val="28"/>
               </w:rPr>
-              <w:t>Validador y vinculador de recursos digitales</w:t>
-            </w:r>
-          </w:p>
-        </w:tc>
-        <w:tc>
-          <w:tcPr>
-            <w:tcW w:w="3969" w:type="dxa"/>
-          </w:tcPr>
-          <w:p>
-            <w:pPr>
-              <w:pStyle w:val="TextoTablas"/>
-              <w:rPr>
-                <w:rFonts w:cs="Calibri"/>
-                <w:sz w:val="28"/>
-                <w:szCs w:val="28"/>
-              </w:rPr>
-            </w:pPr>
-            <w:r>
-              <w:rPr>
-                <w:rFonts w:cs="Calibri"/>
-                <w:sz w:val="28"/>
-                <w:szCs w:val="28"/>
-              </w:rPr>
               <w:t>Centro de Comercio y Servicios - Regional Atlántico</w:t>
             </w:r>
           </w:p>
@@ -18785,8 +18932,8 @@
       </w:pPr>
     </w:p>
     <w:sectPr>
-      <w:headerReference w:type="default" r:id="rId29"/>
-      <w:footerReference w:type="default" r:id="rId30"/>
+      <w:headerReference w:type="default" r:id="rId28"/>
+      <w:footerReference w:type="default" r:id="rId29"/>
       <w:pgSz w:w="12240" w:h="15840"/>
       <w:pgMar w:top="1701" w:right="1134" w:bottom="1134" w:left="1134" w:header="709" w:footer="737" w:gutter="0"/>
       <w:pgNumType w:start="1"/>
@@ -49409,6 +49556,17 @@
 </file>
 
 <file path=customXml/item1.xml><?xml version="1.0" encoding="utf-8"?>
+<p:properties xmlns:p="http://schemas.microsoft.com/office/2006/metadata/properties" xmlns:xsi="http://www.w3.org/2001/XMLSchema-instance" xmlns:pc="http://schemas.microsoft.com/office/infopath/2007/PartnerControls">
+  <documentManagement>
+    <TaxCatchAll xmlns="cb45339b-ced9-4d0d-8f64-77573914d53b" xsi:nil="true"/>
+    <lcf76f155ced4ddcb4097134ff3c332f xmlns="43a3ca16-9c26-4813-b83f-4aec9927b43f">
+      <Terms xmlns="http://schemas.microsoft.com/office/infopath/2007/PartnerControls"/>
+    </lcf76f155ced4ddcb4097134ff3c332f>
+  </documentManagement>
+</p:properties>
+</file>
+
+<file path=customXml/item2.xml><?xml version="1.0" encoding="utf-8"?>
 <?mso-contentType ?>
 <FormTemplates xmlns="http://schemas.microsoft.com/sharepoint/v3/contenttype/forms">
   <Display>DocumentLibraryForm</Display>
@@ -49417,43 +49575,31 @@
 </FormTemplates>
 </file>
 
-<file path=customXml/item2.xml><?xml version="1.0" encoding="utf-8"?>
-<p:properties xmlns:p="http://schemas.microsoft.com/office/2006/metadata/properties" xmlns:xsi="http://www.w3.org/2001/XMLSchema-instance" xmlns:pc="http://schemas.microsoft.com/office/infopath/2007/PartnerControls">
-  <documentManagement>
-    <TaxCatchAll xmlns="adccf511-daff-4bcb-9072-914cedbf4c7e" xsi:nil="true"/>
-    <lcf76f155ced4ddcb4097134ff3c332f xmlns="a70d3c18-0869-45a1-9f75-4b4b8f0f32be">
-      <Terms xmlns="http://schemas.microsoft.com/office/infopath/2007/PartnerControls"/>
-    </lcf76f155ced4ddcb4097134ff3c332f>
-  </documentManagement>
-</p:properties>
-</file>
-
 <file path=customXml/item3.xml><?xml version="1.0" encoding="utf-8"?>
-<b:Sources xmlns:b="http://schemas.openxmlformats.org/officeDocument/2006/bibliography" xmlns="http://schemas.openxmlformats.org/officeDocument/2006/bibliography" SelectedStyle="\APASixthEditionOfficeOnline.xsl" StyleName="APA" Version="6"/>
-</file>
-
-<file path=customXml/item4.xml><?xml version="1.0" encoding="utf-8"?>
-<ct:contentTypeSchema xmlns:ct="http://schemas.microsoft.com/office/2006/metadata/contentType" xmlns:ma="http://schemas.microsoft.com/office/2006/metadata/properties/metaAttributes" ct:_="" ma:_="" ma:contentTypeName="Documento" ma:contentTypeID="0x010100FC2B1768DD5A774EB396CCAB0DE361C1" ma:contentTypeVersion="12" ma:contentTypeDescription="Crear nuevo documento." ma:contentTypeScope="" ma:versionID="73bbb3c317121ea3087ce0564dba81cf">
-  <xsd:schema xmlns:xsd="http://www.w3.org/2001/XMLSchema" xmlns:xs="http://www.w3.org/2001/XMLSchema" xmlns:p="http://schemas.microsoft.com/office/2006/metadata/properties" xmlns:ns2="a70d3c18-0869-45a1-9f75-4b4b8f0f32be" xmlns:ns3="adccf511-daff-4bcb-9072-914cedbf4c7e" targetNamespace="http://schemas.microsoft.com/office/2006/metadata/properties" ma:root="true" ma:fieldsID="89b5199a66abea40ca7ec6b263fc5e35" ns2:_="" ns3:_="">
-    <xsd:import namespace="a70d3c18-0869-45a1-9f75-4b4b8f0f32be"/>
-    <xsd:import namespace="adccf511-daff-4bcb-9072-914cedbf4c7e"/>
+<ct:contentTypeSchema xmlns:ct="http://schemas.microsoft.com/office/2006/metadata/contentType" xmlns:ma="http://schemas.microsoft.com/office/2006/metadata/properties/metaAttributes" ct:_="" ma:_="" ma:contentTypeName="Documento" ma:contentTypeID="0x01010049282E1EDBE9234EA9E6D38F720E265F" ma:contentTypeVersion="15" ma:contentTypeDescription="Crear nuevo documento." ma:contentTypeScope="" ma:versionID="b31c7aa9eaf043a08b87120b3c4916e3">
+  <xsd:schema xmlns:xsd="http://www.w3.org/2001/XMLSchema" xmlns:xs="http://www.w3.org/2001/XMLSchema" xmlns:p="http://schemas.microsoft.com/office/2006/metadata/properties" xmlns:ns2="cb45339b-ced9-4d0d-8f64-77573914d53b" xmlns:ns3="43a3ca16-9c26-4813-b83f-4aec9927b43f" targetNamespace="http://schemas.microsoft.com/office/2006/metadata/properties" ma:root="true" ma:fieldsID="3533d065b04d75c457075bc55f1f5315" ns2:_="" ns3:_="">
+    <xsd:import namespace="cb45339b-ced9-4d0d-8f64-77573914d53b"/>
+    <xsd:import namespace="43a3ca16-9c26-4813-b83f-4aec9927b43f"/>
     <xsd:element name="properties">
       <xsd:complexType>
         <xsd:sequence>
           <xsd:element name="documentManagement">
             <xsd:complexType>
               <xsd:all>
-                <xsd:element ref="ns2:MediaServiceMetadata" minOccurs="0"/>
-                <xsd:element ref="ns2:MediaServiceFastMetadata" minOccurs="0"/>
-                <xsd:element ref="ns2:MediaServiceSearchProperties" minOccurs="0"/>
-                <xsd:element ref="ns2:MediaServiceDateTaken" minOccurs="0"/>
-                <xsd:element ref="ns2:MediaServiceGenerationTime" minOccurs="0"/>
-                <xsd:element ref="ns2:MediaServiceEventHashCode" minOccurs="0"/>
-                <xsd:element ref="ns2:MediaLengthInSeconds" minOccurs="0"/>
-                <xsd:element ref="ns2:lcf76f155ced4ddcb4097134ff3c332f" minOccurs="0"/>
-                <xsd:element ref="ns3:TaxCatchAll" minOccurs="0"/>
-                <xsd:element ref="ns2:MediaServiceOCR" minOccurs="0"/>
-                <xsd:element ref="ns2:MediaServiceBillingMetadata" minOccurs="0"/>
+                <xsd:element ref="ns2:SharedWithUsers" minOccurs="0"/>
+                <xsd:element ref="ns2:SharedWithDetails" minOccurs="0"/>
+                <xsd:element ref="ns3:MediaServiceMetadata" minOccurs="0"/>
+                <xsd:element ref="ns3:MediaServiceFastMetadata" minOccurs="0"/>
+                <xsd:element ref="ns3:MediaServiceDateTaken" minOccurs="0"/>
+                <xsd:element ref="ns3:MediaServiceObjectDetectorVersions" minOccurs="0"/>
+                <xsd:element ref="ns3:MediaLengthInSeconds" minOccurs="0"/>
+                <xsd:element ref="ns3:MediaServiceLocation" minOccurs="0"/>
+                <xsd:element ref="ns3:MediaServiceGenerationTime" minOccurs="0"/>
+                <xsd:element ref="ns3:MediaServiceEventHashCode" minOccurs="0"/>
+                <xsd:element ref="ns3:lcf76f155ced4ddcb4097134ff3c332f" minOccurs="0"/>
+                <xsd:element ref="ns2:TaxCatchAll" minOccurs="0"/>
+                <xsd:element ref="ns3:MediaServiceOCR" minOccurs="0"/>
+                <xsd:element ref="ns3:MediaServiceSearchProperties" minOccurs="0"/>
               </xsd:all>
             </xsd:complexType>
           </xsd:element>
@@ -49461,35 +49607,66 @@
       </xsd:complexType>
     </xsd:element>
   </xsd:schema>
-  <xsd:schema xmlns:xsd="http://www.w3.org/2001/XMLSchema" xmlns:xs="http://www.w3.org/2001/XMLSchema" xmlns:dms="http://schemas.microsoft.com/office/2006/documentManagement/types" xmlns:pc="http://schemas.microsoft.com/office/infopath/2007/PartnerControls" targetNamespace="a70d3c18-0869-45a1-9f75-4b4b8f0f32be" elementFormDefault="qualified">
+  <xsd:schema xmlns:xsd="http://www.w3.org/2001/XMLSchema" xmlns:xs="http://www.w3.org/2001/XMLSchema" xmlns:dms="http://schemas.microsoft.com/office/2006/documentManagement/types" xmlns:pc="http://schemas.microsoft.com/office/infopath/2007/PartnerControls" targetNamespace="cb45339b-ced9-4d0d-8f64-77573914d53b" elementFormDefault="qualified">
     <xsd:import namespace="http://schemas.microsoft.com/office/2006/documentManagement/types"/>
     <xsd:import namespace="http://schemas.microsoft.com/office/infopath/2007/PartnerControls"/>
-    <xsd:element name="MediaServiceMetadata" ma:index="8" nillable="true" ma:displayName="MediaServiceMetadata" ma:hidden="true" ma:internalName="MediaServiceMetadata" ma:readOnly="true">
+    <xsd:element name="SharedWithUsers" ma:index="8" nillable="true" ma:displayName="Compartido con" ma:internalName="SharedWithUsers" ma:readOnly="true">
+      <xsd:complexType>
+        <xsd:complexContent>
+          <xsd:extension base="dms:UserMulti">
+            <xsd:sequence>
+              <xsd:element name="UserInfo" minOccurs="0" maxOccurs="unbounded">
+                <xsd:complexType>
+                  <xsd:sequence>
+                    <xsd:element name="DisplayName" type="xsd:string" minOccurs="0"/>
+                    <xsd:element name="AccountId" type="dms:UserId" minOccurs="0" nillable="true"/>
+                    <xsd:element name="AccountType" type="xsd:string" minOccurs="0"/>
+                  </xsd:sequence>
+                </xsd:complexType>
+              </xsd:element>
+            </xsd:sequence>
+          </xsd:extension>
+        </xsd:complexContent>
+      </xsd:complexType>
+    </xsd:element>
+    <xsd:element name="SharedWithDetails" ma:index="9" nillable="true" ma:displayName="Detalles de uso compartido" ma:internalName="SharedWithDetails" ma:readOnly="true">
+      <xsd:simpleType>
+        <xsd:restriction base="dms:Note">
+          <xsd:maxLength value="255"/>
+        </xsd:restriction>
+      </xsd:simpleType>
+    </xsd:element>
+    <xsd:element name="TaxCatchAll" ma:index="20" nillable="true" ma:displayName="Taxonomy Catch All Column" ma:hidden="true" ma:list="{2f40a149-578b-41a1-8845-c88bc1831770}" ma:internalName="TaxCatchAll" ma:showField="CatchAllData" ma:web="cb45339b-ced9-4d0d-8f64-77573914d53b">
+      <xsd:complexType>
+        <xsd:complexContent>
+          <xsd:extension base="dms:MultiChoiceLookup">
+            <xsd:sequence>
+              <xsd:element name="Value" type="dms:Lookup" maxOccurs="unbounded" minOccurs="0" nillable="true"/>
+            </xsd:sequence>
+          </xsd:extension>
+        </xsd:complexContent>
+      </xsd:complexType>
+    </xsd:element>
+  </xsd:schema>
+  <xsd:schema xmlns:xsd="http://www.w3.org/2001/XMLSchema" xmlns:xs="http://www.w3.org/2001/XMLSchema" xmlns:dms="http://schemas.microsoft.com/office/2006/documentManagement/types" xmlns:pc="http://schemas.microsoft.com/office/infopath/2007/PartnerControls" targetNamespace="43a3ca16-9c26-4813-b83f-4aec9927b43f" elementFormDefault="qualified">
+    <xsd:import namespace="http://schemas.microsoft.com/office/2006/documentManagement/types"/>
+    <xsd:import namespace="http://schemas.microsoft.com/office/infopath/2007/PartnerControls"/>
+    <xsd:element name="MediaServiceMetadata" ma:index="10" nillable="true" ma:displayName="MediaServiceMetadata" ma:hidden="true" ma:internalName="MediaServiceMetadata" ma:readOnly="true">
       <xsd:simpleType>
         <xsd:restriction base="dms:Note"/>
       </xsd:simpleType>
     </xsd:element>
-    <xsd:element name="MediaServiceFastMetadata" ma:index="9" nillable="true" ma:displayName="MediaServiceFastMetadata" ma:hidden="true" ma:internalName="MediaServiceFastMetadata" ma:readOnly="true">
+    <xsd:element name="MediaServiceFastMetadata" ma:index="11" nillable="true" ma:displayName="MediaServiceFastMetadata" ma:hidden="true" ma:internalName="MediaServiceFastMetadata" ma:readOnly="true">
       <xsd:simpleType>
         <xsd:restriction base="dms:Note"/>
       </xsd:simpleType>
     </xsd:element>
-    <xsd:element name="MediaServiceSearchProperties" ma:index="10" nillable="true" ma:displayName="MediaServiceSearchProperties" ma:hidden="true" ma:internalName="MediaServiceSearchProperties" ma:readOnly="true">
-      <xsd:simpleType>
-        <xsd:restriction base="dms:Note"/>
-      </xsd:simpleType>
-    </xsd:element>
-    <xsd:element name="MediaServiceDateTaken" ma:index="11" nillable="true" ma:displayName="MediaServiceDateTaken" ma:hidden="true" ma:indexed="true" ma:internalName="MediaServiceDateTaken" ma:readOnly="true">
+    <xsd:element name="MediaServiceDateTaken" ma:index="12" nillable="true" ma:displayName="MediaServiceDateTaken" ma:hidden="true" ma:indexed="true" ma:internalName="MediaServiceDateTaken" ma:readOnly="true">
       <xsd:simpleType>
         <xsd:restriction base="dms:Text"/>
       </xsd:simpleType>
     </xsd:element>
-    <xsd:element name="MediaServiceGenerationTime" ma:index="12" nillable="true" ma:displayName="MediaServiceGenerationTime" ma:hidden="true" ma:internalName="MediaServiceGenerationTime" ma:readOnly="true">
-      <xsd:simpleType>
-        <xsd:restriction base="dms:Text"/>
-      </xsd:simpleType>
-    </xsd:element>
-    <xsd:element name="MediaServiceEventHashCode" ma:index="13" nillable="true" ma:displayName="MediaServiceEventHashCode" ma:hidden="true" ma:internalName="MediaServiceEventHashCode" ma:readOnly="true">
+    <xsd:element name="MediaServiceObjectDetectorVersions" ma:index="13" nillable="true" ma:displayName="MediaServiceObjectDetectorVersions" ma:hidden="true" ma:indexed="true" ma:internalName="MediaServiceObjectDetectorVersions" ma:readOnly="true">
       <xsd:simpleType>
         <xsd:restriction base="dms:Text"/>
       </xsd:simpleType>
@@ -49499,39 +49676,39 @@
         <xsd:restriction base="dms:Unknown"/>
       </xsd:simpleType>
     </xsd:element>
-    <xsd:element name="lcf76f155ced4ddcb4097134ff3c332f" ma:index="16" nillable="true" ma:taxonomy="true" ma:internalName="lcf76f155ced4ddcb4097134ff3c332f" ma:taxonomyFieldName="MediaServiceImageTags" ma:displayName="Etiquetas de imagen" ma:readOnly="false" ma:fieldId="{5cf76f15-5ced-4ddc-b409-7134ff3c332f}" ma:taxonomyMulti="true" ma:sspId="d33c8c81-5745-4931-bcc4-c2aeafe86780" ma:termSetId="09814cd3-568e-fe90-9814-8d621ff8fb84" ma:anchorId="fba54fb3-c3e1-fe81-a776-ca4b69148c4d" ma:open="true" ma:isKeyword="false">
+    <xsd:element name="MediaServiceLocation" ma:index="15" nillable="true" ma:displayName="Location" ma:indexed="true" ma:internalName="MediaServiceLocation" ma:readOnly="true">
+      <xsd:simpleType>
+        <xsd:restriction base="dms:Text"/>
+      </xsd:simpleType>
+    </xsd:element>
+    <xsd:element name="MediaServiceGenerationTime" ma:index="16" nillable="true" ma:displayName="MediaServiceGenerationTime" ma:hidden="true" ma:internalName="MediaServiceGenerationTime" ma:readOnly="true">
+      <xsd:simpleType>
+        <xsd:restriction base="dms:Text"/>
+      </xsd:simpleType>
+    </xsd:element>
+    <xsd:element name="MediaServiceEventHashCode" ma:index="17" nillable="true" ma:displayName="MediaServiceEventHashCode" ma:hidden="true" ma:internalName="MediaServiceEventHashCode" ma:readOnly="true">
+      <xsd:simpleType>
+        <xsd:restriction base="dms:Text"/>
+      </xsd:simpleType>
+    </xsd:element>
+    <xsd:element name="lcf76f155ced4ddcb4097134ff3c332f" ma:index="19" nillable="true" ma:taxonomy="true" ma:internalName="lcf76f155ced4ddcb4097134ff3c332f" ma:taxonomyFieldName="MediaServiceImageTags" ma:displayName="Etiquetas de imagen" ma:readOnly="false" ma:fieldId="{5cf76f15-5ced-4ddc-b409-7134ff3c332f}" ma:taxonomyMulti="true" ma:sspId="d33c8c81-5745-4931-bcc4-c2aeafe86780" ma:termSetId="09814cd3-568e-fe90-9814-8d621ff8fb84" ma:anchorId="fba54fb3-c3e1-fe81-a776-ca4b69148c4d" ma:open="true" ma:isKeyword="false">
       <xsd:complexType>
         <xsd:sequence>
           <xsd:element ref="pc:Terms" minOccurs="0" maxOccurs="1"/>
         </xsd:sequence>
       </xsd:complexType>
     </xsd:element>
-    <xsd:element name="MediaServiceOCR" ma:index="18" nillable="true" ma:displayName="Extracted Text" ma:internalName="MediaServiceOCR" ma:readOnly="true">
+    <xsd:element name="MediaServiceOCR" ma:index="21" nillable="true" ma:displayName="Extracted Text" ma:internalName="MediaServiceOCR" ma:readOnly="true">
       <xsd:simpleType>
         <xsd:restriction base="dms:Note">
           <xsd:maxLength value="255"/>
         </xsd:restriction>
       </xsd:simpleType>
     </xsd:element>
-    <xsd:element name="MediaServiceBillingMetadata" ma:index="19" nillable="true" ma:displayName="MediaServiceBillingMetadata" ma:hidden="true" ma:internalName="MediaServiceBillingMetadata" ma:readOnly="true">
+    <xsd:element name="MediaServiceSearchProperties" ma:index="22" nillable="true" ma:displayName="MediaServiceSearchProperties" ma:hidden="true" ma:internalName="MediaServiceSearchProperties" ma:readOnly="true">
       <xsd:simpleType>
         <xsd:restriction base="dms:Note"/>
       </xsd:simpleType>
-    </xsd:element>
-  </xsd:schema>
-  <xsd:schema xmlns:xsd="http://www.w3.org/2001/XMLSchema" xmlns:xs="http://www.w3.org/2001/XMLSchema" xmlns:dms="http://schemas.microsoft.com/office/2006/documentManagement/types" xmlns:pc="http://schemas.microsoft.com/office/infopath/2007/PartnerControls" targetNamespace="adccf511-daff-4bcb-9072-914cedbf4c7e" elementFormDefault="qualified">
-    <xsd:import namespace="http://schemas.microsoft.com/office/2006/documentManagement/types"/>
-    <xsd:import namespace="http://schemas.microsoft.com/office/infopath/2007/PartnerControls"/>
-    <xsd:element name="TaxCatchAll" ma:index="17" nillable="true" ma:displayName="Taxonomy Catch All Column" ma:hidden="true" ma:list="{d55fdbc5-1632-489d-aeea-ba6fd7407963}" ma:internalName="TaxCatchAll" ma:showField="CatchAllData" ma:web="adccf511-daff-4bcb-9072-914cedbf4c7e">
-      <xsd:complexType>
-        <xsd:complexContent>
-          <xsd:extension base="dms:MultiChoiceLookup">
-            <xsd:sequence>
-              <xsd:element name="Value" type="dms:Lookup" maxOccurs="unbounded" minOccurs="0" nillable="true"/>
-            </xsd:sequence>
-          </xsd:extension>
-        </xsd:complexContent>
-      </xsd:complexType>
     </xsd:element>
   </xsd:schema>
   <xsd:schema xmlns="http://schemas.openxmlformats.org/package/2006/metadata/core-properties" xmlns:xsd="http://www.w3.org/2001/XMLSchema" xmlns:xsi="http://www.w3.org/2001/XMLSchema-instance" xmlns:dc="http://purl.org/dc/elements/1.1/" xmlns:dcterms="http://purl.org/dc/terms/" xmlns:odoc="http://schemas.microsoft.com/internal/obd" targetNamespace="http://schemas.openxmlformats.org/package/2006/metadata/core-properties" elementFormDefault="qualified" attributeFormDefault="unqualified" blockDefault="#all">
@@ -49633,15 +49810,11 @@
 </ct:contentTypeSchema>
 </file>
 
-<file path=customXml/itemProps1.xml><?xml version="1.0" encoding="utf-8"?>
-<ds:datastoreItem xmlns:ds="http://schemas.openxmlformats.org/officeDocument/2006/customXml" ds:itemID="{81CBDEC1-3B00-44ED-AD36-0268077980BA}">
-  <ds:schemaRefs>
-    <ds:schemaRef ds:uri="http://schemas.microsoft.com/sharepoint/v3/contenttype/forms"/>
-  </ds:schemaRefs>
-</ds:datastoreItem>
+<file path=customXml/item4.xml><?xml version="1.0" encoding="utf-8"?>
+<b:Sources xmlns:b="http://schemas.openxmlformats.org/officeDocument/2006/bibliography" xmlns="http://schemas.openxmlformats.org/officeDocument/2006/bibliography" SelectedStyle="\APASixthEditionOfficeOnline.xsl" StyleName="APA" Version="6"/>
 </file>
 
-<file path=customXml/itemProps2.xml><?xml version="1.0" encoding="utf-8"?>
+<file path=customXml/itemProps1.xml><?xml version="1.0" encoding="utf-8"?>
 <ds:datastoreItem xmlns:ds="http://schemas.openxmlformats.org/officeDocument/2006/customXml" ds:itemID="{6929C9FE-9F22-4B98-96EF-1B541B3BD0B2}">
   <ds:schemaRefs>
     <ds:schemaRef ds:uri="http://schemas.microsoft.com/office/2006/metadata/properties"/>
@@ -49652,14 +49825,37 @@
 </ds:datastoreItem>
 </file>
 
+<file path=customXml/itemProps2.xml><?xml version="1.0" encoding="utf-8"?>
+<ds:datastoreItem xmlns:ds="http://schemas.openxmlformats.org/officeDocument/2006/customXml" ds:itemID="{81CBDEC1-3B00-44ED-AD36-0268077980BA}">
+  <ds:schemaRefs>
+    <ds:schemaRef ds:uri="http://schemas.microsoft.com/sharepoint/v3/contenttype/forms"/>
+  </ds:schemaRefs>
+</ds:datastoreItem>
+</file>
+
 <file path=customXml/itemProps3.xml><?xml version="1.0" encoding="utf-8"?>
+<ds:datastoreItem xmlns:ds="http://schemas.openxmlformats.org/officeDocument/2006/customXml" ds:itemID="{DF43E046-DB0C-42D1-8C73-AE38B52F1ED7}">
+  <ds:schemaRefs>
+    <ds:schemaRef ds:uri="http://schemas.microsoft.com/office/2006/metadata/contentType"/>
+    <ds:schemaRef ds:uri="http://schemas.microsoft.com/office/2006/metadata/properties/metaAttributes"/>
+    <ds:schemaRef ds:uri="http://www.w3.org/2001/XMLSchema"/>
+    <ds:schemaRef ds:uri="http://schemas.microsoft.com/office/2006/metadata/properties"/>
+    <ds:schemaRef ds:uri="cb45339b-ced9-4d0d-8f64-77573914d53b"/>
+    <ds:schemaRef ds:uri="43a3ca16-9c26-4813-b83f-4aec9927b43f"/>
+    <ds:schemaRef ds:uri="http://schemas.microsoft.com/office/2006/documentManagement/types"/>
+    <ds:schemaRef ds:uri="http://schemas.microsoft.com/office/infopath/2007/PartnerControls"/>
+    <ds:schemaRef ds:uri="http://schemas.openxmlformats.org/package/2006/metadata/core-properties"/>
+    <ds:schemaRef ds:uri="http://purl.org/dc/elements/1.1/"/>
+    <ds:schemaRef ds:uri="http://purl.org/dc/terms/"/>
+    <ds:schemaRef ds:uri="http://schemas.microsoft.com/internal/obd"/>
+  </ds:schemaRefs>
+</ds:datastoreItem>
+</file>
+
+<file path=customXml/itemProps4.xml><?xml version="1.0" encoding="utf-8"?>
 <ds:datastoreItem xmlns:ds="http://schemas.openxmlformats.org/officeDocument/2006/customXml" ds:itemID="{E8AB44A3-7C62-4BD2-82ED-8ABC209970FA}">
   <ds:schemaRefs>
     <ds:schemaRef ds:uri="http://schemas.openxmlformats.org/officeDocument/2006/bibliography"/>
   </ds:schemaRefs>
 </ds:datastoreItem>
-</file>
-
-<file path=customXml/itemProps4.xml><?xml version="1.0" encoding="utf-8"?>
-<ds:datastoreItem xmlns:ds="http://schemas.openxmlformats.org/officeDocument/2006/customXml" ds:itemID="{86EF7483-2955-4E50-A18B-87346F42EB67}"/>
 </file>
</xml_diff>

<commit_message>
Ajustes de nuevos hallazgos por parte de repositorio
</commit_message>
<xml_diff>
--- a/fuentes/CFA1_12150024_DU.docx
+++ b/fuentes/CFA1_12150024_DU.docx
@@ -505,7 +505,7 @@
           <w:r>
             <w:fldChar w:fldCharType="separate"/>
           </w:r>
-          <w:hyperlink w:anchor="_Toc211353640" w:history="1">
+          <w:hyperlink w:anchor="_Toc211434677" w:history="1">
             <w:r>
               <w:rPr>
                 <w:rStyle w:val="Hipervnculo"/>
@@ -532,7 +532,7 @@
                 <w:noProof/>
                 <w:webHidden/>
               </w:rPr>
-              <w:instrText xml:space="preserve"> PAGEREF _Toc211353640 \h </w:instrText>
+              <w:instrText xml:space="preserve"> PAGEREF _Toc211434677 \h </w:instrText>
             </w:r>
             <w:r>
               <w:rPr>
@@ -578,7 +578,7 @@
               <w:lang w:eastAsia="es-MX"/>
             </w:rPr>
           </w:pPr>
-          <w:hyperlink w:anchor="_Toc211353641" w:history="1">
+          <w:hyperlink w:anchor="_Toc211434678" w:history="1">
             <w:r>
               <w:rPr>
                 <w:rStyle w:val="Hipervnculo"/>
@@ -622,7 +622,7 @@
                 <w:noProof/>
                 <w:webHidden/>
               </w:rPr>
-              <w:instrText xml:space="preserve"> PAGEREF _Toc211353641 \h </w:instrText>
+              <w:instrText xml:space="preserve"> PAGEREF _Toc211434678 \h </w:instrText>
             </w:r>
             <w:r>
               <w:rPr>
@@ -664,7 +664,7 @@
               <w:lang w:eastAsia="es-MX"/>
             </w:rPr>
           </w:pPr>
-          <w:hyperlink w:anchor="_Toc211353642" w:history="1">
+          <w:hyperlink w:anchor="_Toc211434679" w:history="1">
             <w:r>
               <w:rPr>
                 <w:rStyle w:val="Hipervnculo"/>
@@ -708,7 +708,7 @@
                 <w:noProof/>
                 <w:webHidden/>
               </w:rPr>
-              <w:instrText xml:space="preserve"> PAGEREF _Toc211353642 \h </w:instrText>
+              <w:instrText xml:space="preserve"> PAGEREF _Toc211434679 \h </w:instrText>
             </w:r>
             <w:r>
               <w:rPr>
@@ -750,7 +750,7 @@
               <w:lang w:eastAsia="es-MX"/>
             </w:rPr>
           </w:pPr>
-          <w:hyperlink w:anchor="_Toc211353643" w:history="1">
+          <w:hyperlink w:anchor="_Toc211434680" w:history="1">
             <w:r>
               <w:rPr>
                 <w:rStyle w:val="Hipervnculo"/>
@@ -794,7 +794,7 @@
                 <w:noProof/>
                 <w:webHidden/>
               </w:rPr>
-              <w:instrText xml:space="preserve"> PAGEREF _Toc211353643 \h </w:instrText>
+              <w:instrText xml:space="preserve"> PAGEREF _Toc211434680 \h </w:instrText>
             </w:r>
             <w:r>
               <w:rPr>
@@ -840,7 +840,7 @@
               <w:lang w:eastAsia="es-MX"/>
             </w:rPr>
           </w:pPr>
-          <w:hyperlink w:anchor="_Toc211353644" w:history="1">
+          <w:hyperlink w:anchor="_Toc211434681" w:history="1">
             <w:r>
               <w:rPr>
                 <w:rStyle w:val="Hipervnculo"/>
@@ -884,7 +884,7 @@
                 <w:noProof/>
                 <w:webHidden/>
               </w:rPr>
-              <w:instrText xml:space="preserve"> PAGEREF _Toc211353644 \h </w:instrText>
+              <w:instrText xml:space="preserve"> PAGEREF _Toc211434681 \h </w:instrText>
             </w:r>
             <w:r>
               <w:rPr>
@@ -926,7 +926,7 @@
               <w:lang w:eastAsia="es-MX"/>
             </w:rPr>
           </w:pPr>
-          <w:hyperlink w:anchor="_Toc211353645" w:history="1">
+          <w:hyperlink w:anchor="_Toc211434682" w:history="1">
             <w:r>
               <w:rPr>
                 <w:rStyle w:val="Hipervnculo"/>
@@ -953,7 +953,7 @@
                 <w:noProof/>
                 <w:webHidden/>
               </w:rPr>
-              <w:instrText xml:space="preserve"> PAGEREF _Toc211353645 \h </w:instrText>
+              <w:instrText xml:space="preserve"> PAGEREF _Toc211434682 \h </w:instrText>
             </w:r>
             <w:r>
               <w:rPr>
@@ -995,7 +995,7 @@
               <w:lang w:eastAsia="es-MX"/>
             </w:rPr>
           </w:pPr>
-          <w:hyperlink w:anchor="_Toc211353646" w:history="1">
+          <w:hyperlink w:anchor="_Toc211434683" w:history="1">
             <w:r>
               <w:rPr>
                 <w:rStyle w:val="Hipervnculo"/>
@@ -1022,7 +1022,7 @@
                 <w:noProof/>
                 <w:webHidden/>
               </w:rPr>
-              <w:instrText xml:space="preserve"> PAGEREF _Toc211353646 \h </w:instrText>
+              <w:instrText xml:space="preserve"> PAGEREF _Toc211434683 \h </w:instrText>
             </w:r>
             <w:r>
               <w:rPr>
@@ -1064,7 +1064,7 @@
               <w:lang w:eastAsia="es-MX"/>
             </w:rPr>
           </w:pPr>
-          <w:hyperlink w:anchor="_Toc211353647" w:history="1">
+          <w:hyperlink w:anchor="_Toc211434684" w:history="1">
             <w:r>
               <w:rPr>
                 <w:rStyle w:val="Hipervnculo"/>
@@ -1091,7 +1091,7 @@
                 <w:noProof/>
                 <w:webHidden/>
               </w:rPr>
-              <w:instrText xml:space="preserve"> PAGEREF _Toc211353647 \h </w:instrText>
+              <w:instrText xml:space="preserve"> PAGEREF _Toc211434684 \h </w:instrText>
             </w:r>
             <w:r>
               <w:rPr>
@@ -1137,7 +1137,7 @@
               <w:lang w:eastAsia="es-MX"/>
             </w:rPr>
           </w:pPr>
-          <w:hyperlink w:anchor="_Toc211353648" w:history="1">
+          <w:hyperlink w:anchor="_Toc211434685" w:history="1">
             <w:r>
               <w:rPr>
                 <w:rStyle w:val="Hipervnculo"/>
@@ -1181,7 +1181,7 @@
                 <w:noProof/>
                 <w:webHidden/>
               </w:rPr>
-              <w:instrText xml:space="preserve"> PAGEREF _Toc211353648 \h </w:instrText>
+              <w:instrText xml:space="preserve"> PAGEREF _Toc211434685 \h </w:instrText>
             </w:r>
             <w:r>
               <w:rPr>
@@ -1223,7 +1223,7 @@
               <w:lang w:eastAsia="es-MX"/>
             </w:rPr>
           </w:pPr>
-          <w:hyperlink w:anchor="_Toc211353649" w:history="1">
+          <w:hyperlink w:anchor="_Toc211434686" w:history="1">
             <w:r>
               <w:rPr>
                 <w:rStyle w:val="Hipervnculo"/>
@@ -1250,7 +1250,7 @@
                 <w:noProof/>
                 <w:webHidden/>
               </w:rPr>
-              <w:instrText xml:space="preserve"> PAGEREF _Toc211353649 \h </w:instrText>
+              <w:instrText xml:space="preserve"> PAGEREF _Toc211434686 \h </w:instrText>
             </w:r>
             <w:r>
               <w:rPr>
@@ -1292,7 +1292,7 @@
               <w:lang w:eastAsia="es-MX"/>
             </w:rPr>
           </w:pPr>
-          <w:hyperlink w:anchor="_Toc211353650" w:history="1">
+          <w:hyperlink w:anchor="_Toc211434687" w:history="1">
             <w:r>
               <w:rPr>
                 <w:rStyle w:val="Hipervnculo"/>
@@ -1319,7 +1319,7 @@
                 <w:noProof/>
                 <w:webHidden/>
               </w:rPr>
-              <w:instrText xml:space="preserve"> PAGEREF _Toc211353650 \h </w:instrText>
+              <w:instrText xml:space="preserve"> PAGEREF _Toc211434687 \h </w:instrText>
             </w:r>
             <w:r>
               <w:rPr>
@@ -1361,7 +1361,7 @@
               <w:lang w:eastAsia="es-MX"/>
             </w:rPr>
           </w:pPr>
-          <w:hyperlink w:anchor="_Toc211353651" w:history="1">
+          <w:hyperlink w:anchor="_Toc211434688" w:history="1">
             <w:r>
               <w:rPr>
                 <w:rStyle w:val="Hipervnculo"/>
@@ -1388,7 +1388,7 @@
                 <w:noProof/>
                 <w:webHidden/>
               </w:rPr>
-              <w:instrText xml:space="preserve"> PAGEREF _Toc211353651 \h </w:instrText>
+              <w:instrText xml:space="preserve"> PAGEREF _Toc211434688 \h </w:instrText>
             </w:r>
             <w:r>
               <w:rPr>
@@ -1430,7 +1430,7 @@
               <w:lang w:eastAsia="es-MX"/>
             </w:rPr>
           </w:pPr>
-          <w:hyperlink w:anchor="_Toc211353652" w:history="1">
+          <w:hyperlink w:anchor="_Toc211434689" w:history="1">
             <w:r>
               <w:rPr>
                 <w:rStyle w:val="Hipervnculo"/>
@@ -1457,7 +1457,7 @@
                 <w:noProof/>
                 <w:webHidden/>
               </w:rPr>
-              <w:instrText xml:space="preserve"> PAGEREF _Toc211353652 \h </w:instrText>
+              <w:instrText xml:space="preserve"> PAGEREF _Toc211434689 \h </w:instrText>
             </w:r>
             <w:r>
               <w:rPr>
@@ -1503,7 +1503,7 @@
               <w:lang w:eastAsia="es-MX"/>
             </w:rPr>
           </w:pPr>
-          <w:hyperlink w:anchor="_Toc211353653" w:history="1">
+          <w:hyperlink w:anchor="_Toc211434690" w:history="1">
             <w:r>
               <w:rPr>
                 <w:rStyle w:val="Hipervnculo"/>
@@ -1547,7 +1547,7 @@
                 <w:noProof/>
                 <w:webHidden/>
               </w:rPr>
-              <w:instrText xml:space="preserve"> PAGEREF _Toc211353653 \h </w:instrText>
+              <w:instrText xml:space="preserve"> PAGEREF _Toc211434690 \h </w:instrText>
             </w:r>
             <w:r>
               <w:rPr>
@@ -1589,7 +1589,7 @@
               <w:lang w:eastAsia="es-MX"/>
             </w:rPr>
           </w:pPr>
-          <w:hyperlink w:anchor="_Toc211353654" w:history="1">
+          <w:hyperlink w:anchor="_Toc211434691" w:history="1">
             <w:r>
               <w:rPr>
                 <w:rStyle w:val="Hipervnculo"/>
@@ -1616,7 +1616,7 @@
                 <w:noProof/>
                 <w:webHidden/>
               </w:rPr>
-              <w:instrText xml:space="preserve"> PAGEREF _Toc211353654 \h </w:instrText>
+              <w:instrText xml:space="preserve"> PAGEREF _Toc211434691 \h </w:instrText>
             </w:r>
             <w:r>
               <w:rPr>
@@ -1658,7 +1658,7 @@
               <w:lang w:eastAsia="es-MX"/>
             </w:rPr>
           </w:pPr>
-          <w:hyperlink w:anchor="_Toc211353655" w:history="1">
+          <w:hyperlink w:anchor="_Toc211434692" w:history="1">
             <w:r>
               <w:rPr>
                 <w:rStyle w:val="Hipervnculo"/>
@@ -1685,7 +1685,7 @@
                 <w:noProof/>
                 <w:webHidden/>
               </w:rPr>
-              <w:instrText xml:space="preserve"> PAGEREF _Toc211353655 \h </w:instrText>
+              <w:instrText xml:space="preserve"> PAGEREF _Toc211434692 \h </w:instrText>
             </w:r>
             <w:r>
               <w:rPr>
@@ -1727,21 +1727,13 @@
               <w:lang w:eastAsia="es-MX"/>
             </w:rPr>
           </w:pPr>
-          <w:hyperlink w:anchor="_Toc211353656" w:history="1">
-            <w:r>
-              <w:rPr>
-                <w:rStyle w:val="Hipervnculo"/>
-                <w:bCs/>
-                <w:noProof/>
-              </w:rPr>
-              <w:t xml:space="preserve">Fuente: </w:t>
-            </w:r>
+          <w:hyperlink w:anchor="_Toc211434693" w:history="1">
             <w:r>
               <w:rPr>
                 <w:rStyle w:val="Hipervnculo"/>
                 <w:noProof/>
               </w:rPr>
-              <w:t>SENA, 2025.</w:t>
+              <w:t>4.3 Herramientas tecnológicas</w:t>
             </w:r>
             <w:r>
               <w:rPr>
@@ -1762,76 +1754,7 @@
                 <w:noProof/>
                 <w:webHidden/>
               </w:rPr>
-              <w:instrText xml:space="preserve"> PAGEREF _Toc211353656 \h </w:instrText>
-            </w:r>
-            <w:r>
-              <w:rPr>
-                <w:noProof/>
-                <w:webHidden/>
-              </w:rPr>
-            </w:r>
-            <w:r>
-              <w:rPr>
-                <w:noProof/>
-                <w:webHidden/>
-              </w:rPr>
-              <w:fldChar w:fldCharType="separate"/>
-            </w:r>
-            <w:r>
-              <w:rPr>
-                <w:noProof/>
-                <w:webHidden/>
-              </w:rPr>
-              <w:t>36</w:t>
-            </w:r>
-            <w:r>
-              <w:rPr>
-                <w:noProof/>
-                <w:webHidden/>
-              </w:rPr>
-              <w:fldChar w:fldCharType="end"/>
-            </w:r>
-          </w:hyperlink>
-        </w:p>
-        <w:p>
-          <w:pPr>
-            <w:pStyle w:val="TDC2"/>
-            <w:rPr>
-              <w:rFonts w:eastAsiaTheme="minorEastAsia"/>
-              <w:noProof/>
-              <w:sz w:val="24"/>
-              <w:szCs w:val="24"/>
-              <w:lang w:eastAsia="es-MX"/>
-            </w:rPr>
-          </w:pPr>
-          <w:hyperlink w:anchor="_Toc211353657" w:history="1">
-            <w:r>
-              <w:rPr>
-                <w:rStyle w:val="Hipervnculo"/>
-                <w:noProof/>
-              </w:rPr>
-              <w:t>4.3 Herramientas tecnológicas</w:t>
-            </w:r>
-            <w:r>
-              <w:rPr>
-                <w:noProof/>
-                <w:webHidden/>
-              </w:rPr>
-              <w:tab/>
-            </w:r>
-            <w:r>
-              <w:rPr>
-                <w:noProof/>
-                <w:webHidden/>
-              </w:rPr>
-              <w:fldChar w:fldCharType="begin"/>
-            </w:r>
-            <w:r>
-              <w:rPr>
-                <w:noProof/>
-                <w:webHidden/>
-              </w:rPr>
-              <w:instrText xml:space="preserve"> PAGEREF _Toc211353657 \h </w:instrText>
+              <w:instrText xml:space="preserve"> PAGEREF _Toc211434693 \h </w:instrText>
             </w:r>
             <w:r>
               <w:rPr>
@@ -1877,7 +1800,7 @@
               <w:lang w:eastAsia="es-MX"/>
             </w:rPr>
           </w:pPr>
-          <w:hyperlink w:anchor="_Toc211353658" w:history="1">
+          <w:hyperlink w:anchor="_Toc211434694" w:history="1">
             <w:r>
               <w:rPr>
                 <w:rStyle w:val="Hipervnculo"/>
@@ -1921,7 +1844,7 @@
                 <w:noProof/>
                 <w:webHidden/>
               </w:rPr>
-              <w:instrText xml:space="preserve"> PAGEREF _Toc211353658 \h </w:instrText>
+              <w:instrText xml:space="preserve"> PAGEREF _Toc211434694 \h </w:instrText>
             </w:r>
             <w:r>
               <w:rPr>
@@ -1963,7 +1886,7 @@
               <w:lang w:eastAsia="es-MX"/>
             </w:rPr>
           </w:pPr>
-          <w:hyperlink w:anchor="_Toc211353659" w:history="1">
+          <w:hyperlink w:anchor="_Toc211434695" w:history="1">
             <w:r>
               <w:rPr>
                 <w:rStyle w:val="Hipervnculo"/>
@@ -1990,7 +1913,7 @@
                 <w:noProof/>
                 <w:webHidden/>
               </w:rPr>
-              <w:instrText xml:space="preserve"> PAGEREF _Toc211353659 \h </w:instrText>
+              <w:instrText xml:space="preserve"> PAGEREF _Toc211434695 \h </w:instrText>
             </w:r>
             <w:r>
               <w:rPr>
@@ -2032,7 +1955,7 @@
               <w:lang w:eastAsia="es-MX"/>
             </w:rPr>
           </w:pPr>
-          <w:hyperlink w:anchor="_Toc211353660" w:history="1">
+          <w:hyperlink w:anchor="_Toc211434696" w:history="1">
             <w:r>
               <w:rPr>
                 <w:rStyle w:val="Hipervnculo"/>
@@ -2059,7 +1982,7 @@
                 <w:noProof/>
                 <w:webHidden/>
               </w:rPr>
-              <w:instrText xml:space="preserve"> PAGEREF _Toc211353660 \h </w:instrText>
+              <w:instrText xml:space="preserve"> PAGEREF _Toc211434696 \h </w:instrText>
             </w:r>
             <w:r>
               <w:rPr>
@@ -2101,21 +2024,13 @@
               <w:lang w:eastAsia="es-MX"/>
             </w:rPr>
           </w:pPr>
-          <w:hyperlink w:anchor="_Toc211353661" w:history="1">
-            <w:r>
-              <w:rPr>
-                <w:rStyle w:val="Hipervnculo"/>
-                <w:bCs/>
-                <w:noProof/>
-              </w:rPr>
-              <w:t xml:space="preserve">Fuente: </w:t>
-            </w:r>
+          <w:hyperlink w:anchor="_Toc211434697" w:history="1">
             <w:r>
               <w:rPr>
                 <w:rStyle w:val="Hipervnculo"/>
                 <w:noProof/>
               </w:rPr>
-              <w:t>SENA, 2025.</w:t>
+              <w:t>5.3 Tipos</w:t>
             </w:r>
             <w:r>
               <w:rPr>
@@ -2136,76 +2051,7 @@
                 <w:noProof/>
                 <w:webHidden/>
               </w:rPr>
-              <w:instrText xml:space="preserve"> PAGEREF _Toc211353661 \h </w:instrText>
-            </w:r>
-            <w:r>
-              <w:rPr>
-                <w:noProof/>
-                <w:webHidden/>
-              </w:rPr>
-            </w:r>
-            <w:r>
-              <w:rPr>
-                <w:noProof/>
-                <w:webHidden/>
-              </w:rPr>
-              <w:fldChar w:fldCharType="separate"/>
-            </w:r>
-            <w:r>
-              <w:rPr>
-                <w:noProof/>
-                <w:webHidden/>
-              </w:rPr>
-              <w:t>40</w:t>
-            </w:r>
-            <w:r>
-              <w:rPr>
-                <w:noProof/>
-                <w:webHidden/>
-              </w:rPr>
-              <w:fldChar w:fldCharType="end"/>
-            </w:r>
-          </w:hyperlink>
-        </w:p>
-        <w:p>
-          <w:pPr>
-            <w:pStyle w:val="TDC2"/>
-            <w:rPr>
-              <w:rFonts w:eastAsiaTheme="minorEastAsia"/>
-              <w:noProof/>
-              <w:sz w:val="24"/>
-              <w:szCs w:val="24"/>
-              <w:lang w:eastAsia="es-MX"/>
-            </w:rPr>
-          </w:pPr>
-          <w:hyperlink w:anchor="_Toc211353662" w:history="1">
-            <w:r>
-              <w:rPr>
-                <w:rStyle w:val="Hipervnculo"/>
-                <w:noProof/>
-              </w:rPr>
-              <w:t>5.3 Tipos</w:t>
-            </w:r>
-            <w:r>
-              <w:rPr>
-                <w:noProof/>
-                <w:webHidden/>
-              </w:rPr>
-              <w:tab/>
-            </w:r>
-            <w:r>
-              <w:rPr>
-                <w:noProof/>
-                <w:webHidden/>
-              </w:rPr>
-              <w:fldChar w:fldCharType="begin"/>
-            </w:r>
-            <w:r>
-              <w:rPr>
-                <w:noProof/>
-                <w:webHidden/>
-              </w:rPr>
-              <w:instrText xml:space="preserve"> PAGEREF _Toc211353662 \h </w:instrText>
+              <w:instrText xml:space="preserve"> PAGEREF _Toc211434697 \h </w:instrText>
             </w:r>
             <w:r>
               <w:rPr>
@@ -2250,7 +2096,7 @@
               <w:lang w:eastAsia="es-MX"/>
             </w:rPr>
           </w:pPr>
-          <w:hyperlink w:anchor="_Toc211353663" w:history="1">
+          <w:hyperlink w:anchor="_Toc211434698" w:history="1">
             <w:r>
               <w:rPr>
                 <w:rStyle w:val="Hipervnculo"/>
@@ -2277,7 +2123,7 @@
                 <w:noProof/>
                 <w:webHidden/>
               </w:rPr>
-              <w:instrText xml:space="preserve"> PAGEREF _Toc211353663 \h </w:instrText>
+              <w:instrText xml:space="preserve"> PAGEREF _Toc211434698 \h </w:instrText>
             </w:r>
             <w:r>
               <w:rPr>
@@ -2322,7 +2168,7 @@
               <w:lang w:eastAsia="es-MX"/>
             </w:rPr>
           </w:pPr>
-          <w:hyperlink w:anchor="_Toc211353664" w:history="1">
+          <w:hyperlink w:anchor="_Toc211434699" w:history="1">
             <w:r>
               <w:rPr>
                 <w:rStyle w:val="Hipervnculo"/>
@@ -2349,7 +2195,7 @@
                 <w:noProof/>
                 <w:webHidden/>
               </w:rPr>
-              <w:instrText xml:space="preserve"> PAGEREF _Toc211353664 \h </w:instrText>
+              <w:instrText xml:space="preserve"> PAGEREF _Toc211434699 \h </w:instrText>
             </w:r>
             <w:r>
               <w:rPr>
@@ -2394,7 +2240,7 @@
               <w:lang w:eastAsia="es-MX"/>
             </w:rPr>
           </w:pPr>
-          <w:hyperlink w:anchor="_Toc211353665" w:history="1">
+          <w:hyperlink w:anchor="_Toc211434700" w:history="1">
             <w:r>
               <w:rPr>
                 <w:rStyle w:val="Hipervnculo"/>
@@ -2421,7 +2267,7 @@
                 <w:noProof/>
                 <w:webHidden/>
               </w:rPr>
-              <w:instrText xml:space="preserve"> PAGEREF _Toc211353665 \h </w:instrText>
+              <w:instrText xml:space="preserve"> PAGEREF _Toc211434700 \h </w:instrText>
             </w:r>
             <w:r>
               <w:rPr>
@@ -2466,7 +2312,7 @@
               <w:lang w:eastAsia="es-MX"/>
             </w:rPr>
           </w:pPr>
-          <w:hyperlink w:anchor="_Toc211353666" w:history="1">
+          <w:hyperlink w:anchor="_Toc211434701" w:history="1">
             <w:r>
               <w:rPr>
                 <w:rStyle w:val="Hipervnculo"/>
@@ -2493,7 +2339,7 @@
                 <w:noProof/>
                 <w:webHidden/>
               </w:rPr>
-              <w:instrText xml:space="preserve"> PAGEREF _Toc211353666 \h </w:instrText>
+              <w:instrText xml:space="preserve"> PAGEREF _Toc211434701 \h </w:instrText>
             </w:r>
             <w:r>
               <w:rPr>
@@ -2538,7 +2384,7 @@
               <w:lang w:eastAsia="es-MX"/>
             </w:rPr>
           </w:pPr>
-          <w:hyperlink w:anchor="_Toc211353667" w:history="1">
+          <w:hyperlink w:anchor="_Toc211434702" w:history="1">
             <w:r>
               <w:rPr>
                 <w:rStyle w:val="Hipervnculo"/>
@@ -2565,7 +2411,7 @@
                 <w:noProof/>
                 <w:webHidden/>
               </w:rPr>
-              <w:instrText xml:space="preserve"> PAGEREF _Toc211353667 \h </w:instrText>
+              <w:instrText xml:space="preserve"> PAGEREF _Toc211434702 \h </w:instrText>
             </w:r>
             <w:r>
               <w:rPr>
@@ -2622,7 +2468,7 @@
       <w:pPr>
         <w:pStyle w:val="Titulosgenerales"/>
       </w:pPr>
-      <w:bookmarkStart w:id="0" w:name="_Toc211353640"/>
+      <w:bookmarkStart w:id="0" w:name="_Toc211434677"/>
       <w:r>
         <w:lastRenderedPageBreak/>
         <w:t>Introducción</w:t>
@@ -2959,7 +2805,7 @@
       <w:pPr>
         <w:pStyle w:val="Ttulo1"/>
       </w:pPr>
-      <w:bookmarkStart w:id="1" w:name="_Toc211353641"/>
+      <w:bookmarkStart w:id="1" w:name="_Toc211434678"/>
       <w:r>
         <w:lastRenderedPageBreak/>
         <w:t>Flujo de bienes</w:t>
@@ -2996,7 +2842,7 @@
           <w:rFonts w:eastAsia="Times New Roman"/>
         </w:rPr>
       </w:pPr>
-      <w:bookmarkStart w:id="2" w:name="_Toc211353642"/>
+      <w:bookmarkStart w:id="2" w:name="_Toc211434679"/>
       <w:r>
         <w:t>Concepto</w:t>
       </w:r>
@@ -3480,7 +3326,7 @@
           <w:numId w:val="7"/>
         </w:numPr>
       </w:pPr>
-      <w:bookmarkStart w:id="3" w:name="_Toc211353643"/>
+      <w:bookmarkStart w:id="3" w:name="_Toc211434680"/>
       <w:r>
         <w:t>Normativa</w:t>
       </w:r>
@@ -4595,7 +4441,7 @@
           <w:lang w:val="es-419"/>
         </w:rPr>
       </w:pPr>
-      <w:bookmarkStart w:id="4" w:name="_Toc211353644"/>
+      <w:bookmarkStart w:id="4" w:name="_Toc211434681"/>
       <w:r>
         <w:rPr>
           <w:rStyle w:val="Extranjerismo"/>
@@ -4622,7 +4468,7 @@
       <w:pPr>
         <w:pStyle w:val="Ttulo2"/>
       </w:pPr>
-      <w:bookmarkStart w:id="5" w:name="_Toc211353645"/>
+      <w:bookmarkStart w:id="5" w:name="_Toc211434682"/>
       <w:r>
         <w:t>2.1 Concepto</w:t>
       </w:r>
@@ -4994,7 +4840,7 @@
       <w:pPr>
         <w:pStyle w:val="Ttulo2"/>
       </w:pPr>
-      <w:bookmarkStart w:id="6" w:name="_Toc211353646"/>
+      <w:bookmarkStart w:id="6" w:name="_Toc211434683"/>
       <w:r>
         <w:lastRenderedPageBreak/>
         <w:t>2.2 Tipos</w:t>
@@ -8086,7 +7932,7 @@
       <w:pPr>
         <w:pStyle w:val="Ttulo2"/>
       </w:pPr>
-      <w:bookmarkStart w:id="7" w:name="_Toc211353647"/>
+      <w:bookmarkStart w:id="7" w:name="_Toc211434684"/>
       <w:r>
         <w:t>2.3 Fichas técnicas</w:t>
       </w:r>
@@ -10929,7 +10775,7 @@
       <w:pPr>
         <w:pStyle w:val="Ttulo1"/>
       </w:pPr>
-      <w:bookmarkStart w:id="8" w:name="_Toc211353648"/>
+      <w:bookmarkStart w:id="8" w:name="_Toc211434685"/>
       <w:r>
         <w:lastRenderedPageBreak/>
         <w:t>Almacén</w:t>
@@ -10966,7 +10812,7 @@
       <w:pPr>
         <w:pStyle w:val="Ttulo2"/>
       </w:pPr>
-      <w:bookmarkStart w:id="9" w:name="_Toc211353649"/>
+      <w:bookmarkStart w:id="9" w:name="_Toc211434686"/>
       <w:r>
         <w:t>3.1 Concepto</w:t>
       </w:r>
@@ -11008,7 +10854,7 @@
       <w:pPr>
         <w:pStyle w:val="Ttulo2"/>
       </w:pPr>
-      <w:bookmarkStart w:id="10" w:name="_Toc211353650"/>
+      <w:bookmarkStart w:id="10" w:name="_Toc211434687"/>
       <w:r>
         <w:t>3.2 Características</w:t>
       </w:r>
@@ -11365,7 +11211,7 @@
       <w:pPr>
         <w:pStyle w:val="Ttulo2"/>
       </w:pPr>
-      <w:bookmarkStart w:id="11" w:name="_Toc211353651"/>
+      <w:bookmarkStart w:id="11" w:name="_Toc211434688"/>
       <w:r>
         <w:lastRenderedPageBreak/>
         <w:t>3.3 Tipos</w:t>
@@ -12274,7 +12120,7 @@
       <w:pPr>
         <w:pStyle w:val="Ttulo2"/>
       </w:pPr>
-      <w:bookmarkStart w:id="12" w:name="_Toc211353652"/>
+      <w:bookmarkStart w:id="12" w:name="_Toc211434689"/>
       <w:r>
         <w:t>3.4 Funciones</w:t>
       </w:r>
@@ -13469,7 +13315,7 @@
       <w:pPr>
         <w:pStyle w:val="Ttulo1"/>
       </w:pPr>
-      <w:bookmarkStart w:id="13" w:name="_Toc211353653"/>
+      <w:bookmarkStart w:id="13" w:name="_Toc211434690"/>
       <w:r>
         <w:lastRenderedPageBreak/>
         <w:t>Operación de almacén</w:t>
@@ -13493,7 +13339,7 @@
       <w:pPr>
         <w:pStyle w:val="Ttulo2"/>
       </w:pPr>
-      <w:bookmarkStart w:id="14" w:name="_Toc211353654"/>
+      <w:bookmarkStart w:id="14" w:name="_Toc211434691"/>
       <w:r>
         <w:t>4.1 Concepto</w:t>
       </w:r>
@@ -13737,7 +13583,7 @@
       <w:pPr>
         <w:pStyle w:val="Ttulo2"/>
       </w:pPr>
-      <w:bookmarkStart w:id="15" w:name="_Toc211353655"/>
+      <w:bookmarkStart w:id="15" w:name="_Toc211434692"/>
       <w:r>
         <w:t>4.2 Etapas</w:t>
       </w:r>
@@ -14093,82 +13939,46 @@
     </w:p>
     <w:p>
       <w:pPr>
-        <w:pStyle w:val="Ttulo2"/>
-        <w:rPr>
-          <w:rFonts w:asciiTheme="minorHAnsi" w:eastAsiaTheme="minorHAnsi" w:hAnsiTheme="minorHAnsi" w:cstheme="minorBidi"/>
-          <w:b w:val="0"/>
-          <w:color w:val="auto"/>
-          <w:kern w:val="2"/>
+        <w:ind w:firstLine="0"/>
+        <w:rPr>
+          <w:b/>
           <w:sz w:val="24"/>
           <w:szCs w:val="24"/>
-          <w:lang w:val="es-CO" w:eastAsia="en-US"/>
-          <w14:ligatures w14:val="standardContextual"/>
-        </w:rPr>
-      </w:pPr>
-      <w:bookmarkStart w:id="16" w:name="_Toc211353656"/>
-      <w:r>
-        <w:rPr>
-          <w:rFonts w:asciiTheme="minorHAnsi" w:eastAsiaTheme="minorHAnsi" w:hAnsiTheme="minorHAnsi" w:cstheme="minorBidi"/>
-          <w:bCs/>
-          <w:color w:val="auto"/>
-          <w:kern w:val="2"/>
+        </w:rPr>
+      </w:pPr>
+      <w:r>
+        <w:rPr>
+          <w:b/>
           <w:sz w:val="24"/>
           <w:szCs w:val="24"/>
-          <w:lang w:val="es-CO" w:eastAsia="en-US"/>
-          <w14:ligatures w14:val="standardContextual"/>
-        </w:rPr>
-        <w:t xml:space="preserve">Fuente: </w:t>
-      </w:r>
-      <w:r>
-        <w:rPr>
-          <w:rFonts w:asciiTheme="minorHAnsi" w:eastAsiaTheme="minorHAnsi" w:hAnsiTheme="minorHAnsi" w:cstheme="minorBidi"/>
-          <w:b w:val="0"/>
-          <w:color w:val="auto"/>
-          <w:kern w:val="2"/>
+        </w:rPr>
+        <w:t>Fuente:</w:t>
+      </w:r>
+      <w:r>
+        <w:rPr>
+          <w:bCs/>
           <w:sz w:val="24"/>
           <w:szCs w:val="24"/>
-          <w:lang w:val="es-CO" w:eastAsia="en-US"/>
-          <w14:ligatures w14:val="standardContextual"/>
-        </w:rPr>
-        <w:t>SENA</w:t>
-      </w:r>
-      <w:r>
-        <w:rPr>
-          <w:rFonts w:asciiTheme="minorHAnsi" w:eastAsiaTheme="minorHAnsi" w:hAnsiTheme="minorHAnsi" w:cstheme="minorBidi"/>
-          <w:b w:val="0"/>
-          <w:color w:val="auto"/>
-          <w:kern w:val="2"/>
+        </w:rPr>
+        <w:t xml:space="preserve"> </w:t>
+      </w:r>
+      <w:r>
+        <w:rPr>
           <w:sz w:val="24"/>
           <w:szCs w:val="24"/>
-          <w:lang w:val="es-CO" w:eastAsia="en-US"/>
-          <w14:ligatures w14:val="standardContextual"/>
-        </w:rPr>
-        <w:t>, 2025</w:t>
-      </w:r>
-      <w:r>
-        <w:rPr>
-          <w:rFonts w:asciiTheme="minorHAnsi" w:eastAsiaTheme="minorHAnsi" w:hAnsiTheme="minorHAnsi" w:cstheme="minorBidi"/>
-          <w:b w:val="0"/>
-          <w:color w:val="auto"/>
-          <w:kern w:val="2"/>
-          <w:sz w:val="24"/>
-          <w:szCs w:val="24"/>
-          <w:lang w:val="es-CO" w:eastAsia="en-US"/>
-          <w14:ligatures w14:val="standardContextual"/>
-        </w:rPr>
-        <w:t>.</w:t>
-      </w:r>
-      <w:bookmarkEnd w:id="16"/>
+        </w:rPr>
+        <w:t>SENA, 2025.</w:t>
+      </w:r>
     </w:p>
     <w:p>
       <w:pPr>
         <w:pStyle w:val="Ttulo2"/>
       </w:pPr>
-      <w:bookmarkStart w:id="17" w:name="_Toc211353657"/>
+      <w:bookmarkStart w:id="16" w:name="_Toc211434693"/>
       <w:r>
         <w:t>4.3 Herramientas tecnológicas</w:t>
       </w:r>
-      <w:bookmarkEnd w:id="17"/>
+      <w:bookmarkEnd w:id="16"/>
     </w:p>
     <w:p>
       <w:pPr>
@@ -15266,9 +15076,33 @@
       <w:pPr>
         <w:pStyle w:val="Ttulo1"/>
       </w:pPr>
-      <w:bookmarkStart w:id="18" w:name="_Toc211353658"/>
+      <w:bookmarkStart w:id="17" w:name="_Toc211434694"/>
       <w:r>
         <w:t>Movimientos de almacén</w:t>
+      </w:r>
+      <w:bookmarkEnd w:id="17"/>
+    </w:p>
+    <w:p>
+      <w:pPr>
+        <w:rPr>
+          <w:lang w:val="es-419" w:eastAsia="es-CO"/>
+        </w:rPr>
+      </w:pPr>
+      <w:r>
+        <w:rPr>
+          <w:lang w:val="es-419" w:eastAsia="es-CO"/>
+        </w:rPr>
+        <w:t>La importancia de los movimientos de almacén radica en su papel central para asegurar la fluidez y eficiencia de toda la cadena logística. Cada movimiento, ya sea la recepción, almacenamiento, traslado interno o expedición de mercancías, incide directamente en la capacidad de una empresa para responder ágilmente a la demanda y mantener un flujo constante de productos desde el origen hasta el cliente final.</w:t>
+      </w:r>
+    </w:p>
+    <w:p>
+      <w:pPr>
+        <w:pStyle w:val="Ttulo2"/>
+      </w:pPr>
+      <w:bookmarkStart w:id="18" w:name="_Toc211434695"/>
+      <w:r>
+        <w:lastRenderedPageBreak/>
+        <w:t>5.1 Concepto</w:t>
       </w:r>
       <w:bookmarkEnd w:id="18"/>
     </w:p>
@@ -15282,55 +15116,31 @@
         <w:rPr>
           <w:lang w:val="es-419" w:eastAsia="es-CO"/>
         </w:rPr>
-        <w:t>La importancia de los movimientos de almacén radica en su papel central para asegurar la fluidez y eficiencia de toda la cadena logística. Cada movimiento, ya sea la recepción, almacenamiento, traslado interno o expedición de mercancías, incide directamente en la capacidad de una empresa para responder ágilmente a la demanda y mantener un flujo constante de productos desde el origen hasta el cliente final.</w:t>
+        <w:t>Los movimientos de almacén representan el conjunto de operaciones que permiten el desplazamiento, control y gestión de productos dentro de un centro logístico. Estas acciones abarcan desde la recepción y ubicación inicial de la mercancía, pasando por su manipulación y preparación, hasta la expedición final hacia el siguiente eslabón de la cadena de suministro. Cada movimiento, ya sea físico o administrativo, está orientado a asegurar que los materiales estén disponibles exactamente donde y cuando se requieren para la producción o distribución.</w:t>
       </w:r>
     </w:p>
     <w:p>
       <w:pPr>
-        <w:pStyle w:val="Ttulo2"/>
-      </w:pPr>
-      <w:bookmarkStart w:id="19" w:name="_Toc211353659"/>
-      <w:r>
-        <w:lastRenderedPageBreak/>
-        <w:t>5.1 Concepto</w:t>
-      </w:r>
-      <w:bookmarkEnd w:id="19"/>
+        <w:rPr>
+          <w:lang w:val="es-419" w:eastAsia="es-CO"/>
+        </w:rPr>
+      </w:pPr>
+      <w:r>
+        <w:rPr>
+          <w:lang w:val="es-419" w:eastAsia="es-CO"/>
+        </w:rPr>
+        <w:t>En la logística moderna, la gestión eficiente de estos movimientos es un factor determinante para el éxito empresarial.</w:t>
+      </w:r>
     </w:p>
     <w:p>
       <w:pPr>
-        <w:rPr>
-          <w:lang w:val="es-419" w:eastAsia="es-CO"/>
-        </w:rPr>
-      </w:pPr>
-      <w:r>
-        <w:rPr>
-          <w:lang w:val="es-419" w:eastAsia="es-CO"/>
-        </w:rPr>
-        <w:t>Los movimientos de almacén representan el conjunto de operaciones que permiten el desplazamiento, control y gestión de productos dentro de un centro logístico. Estas acciones abarcan desde la recepción y ubicación inicial de la mercancía, pasando por su manipulación y preparación, hasta la expedición final hacia el siguiente eslabón de la cadena de suministro. Cada movimiento, ya sea físico o administrativo, está orientado a asegurar que los materiales estén disponibles exactamente donde y cuando se requieren para la producción o distribución.</w:t>
-      </w:r>
-    </w:p>
-    <w:p>
-      <w:pPr>
-        <w:rPr>
-          <w:lang w:val="es-419" w:eastAsia="es-CO"/>
-        </w:rPr>
-      </w:pPr>
-      <w:r>
-        <w:rPr>
-          <w:lang w:val="es-419" w:eastAsia="es-CO"/>
-        </w:rPr>
-        <w:t>En la logística moderna, la gestión eficiente de estos movimientos es un factor determinante para el éxito empresarial.</w:t>
-      </w:r>
-    </w:p>
-    <w:p>
-      <w:pPr>
         <w:pStyle w:val="Ttulo2"/>
       </w:pPr>
-      <w:bookmarkStart w:id="20" w:name="_Toc211353660"/>
+      <w:bookmarkStart w:id="19" w:name="_Toc211434696"/>
       <w:r>
         <w:t>5.2 Características</w:t>
       </w:r>
-      <w:bookmarkEnd w:id="20"/>
+      <w:bookmarkEnd w:id="19"/>
     </w:p>
     <w:p>
       <w:pPr>
@@ -15510,82 +15320,47 @@
     </w:p>
     <w:p>
       <w:pPr>
-        <w:pStyle w:val="Ttulo2"/>
-        <w:rPr>
-          <w:rFonts w:asciiTheme="minorHAnsi" w:eastAsiaTheme="minorHAnsi" w:hAnsiTheme="minorHAnsi" w:cstheme="minorBidi"/>
-          <w:b w:val="0"/>
-          <w:color w:val="auto"/>
-          <w:kern w:val="2"/>
+        <w:ind w:firstLine="0"/>
+        <w:jc w:val="both"/>
+        <w:rPr>
+          <w:b/>
           <w:sz w:val="24"/>
           <w:szCs w:val="24"/>
-          <w:lang w:val="es-CO" w:eastAsia="en-US"/>
-          <w14:ligatures w14:val="standardContextual"/>
-        </w:rPr>
-      </w:pPr>
-      <w:bookmarkStart w:id="21" w:name="_Toc211353661"/>
-      <w:r>
-        <w:rPr>
-          <w:rFonts w:asciiTheme="minorHAnsi" w:eastAsiaTheme="minorHAnsi" w:hAnsiTheme="minorHAnsi" w:cstheme="minorBidi"/>
-          <w:bCs/>
-          <w:color w:val="auto"/>
-          <w:kern w:val="2"/>
+        </w:rPr>
+      </w:pPr>
+      <w:r>
+        <w:rPr>
+          <w:b/>
           <w:sz w:val="24"/>
           <w:szCs w:val="24"/>
-          <w:lang w:val="es-CO" w:eastAsia="en-US"/>
-          <w14:ligatures w14:val="standardContextual"/>
-        </w:rPr>
-        <w:t xml:space="preserve">Fuente: </w:t>
-      </w:r>
-      <w:r>
-        <w:rPr>
-          <w:rFonts w:asciiTheme="minorHAnsi" w:eastAsiaTheme="minorHAnsi" w:hAnsiTheme="minorHAnsi" w:cstheme="minorBidi"/>
-          <w:b w:val="0"/>
-          <w:color w:val="auto"/>
-          <w:kern w:val="2"/>
+        </w:rPr>
+        <w:t>Fuente:</w:t>
+      </w:r>
+      <w:r>
+        <w:rPr>
+          <w:bCs/>
           <w:sz w:val="24"/>
           <w:szCs w:val="24"/>
-          <w:lang w:val="es-CO" w:eastAsia="en-US"/>
-          <w14:ligatures w14:val="standardContextual"/>
-        </w:rPr>
-        <w:t>SENA</w:t>
-      </w:r>
-      <w:r>
-        <w:rPr>
-          <w:rFonts w:asciiTheme="minorHAnsi" w:eastAsiaTheme="minorHAnsi" w:hAnsiTheme="minorHAnsi" w:cstheme="minorBidi"/>
-          <w:b w:val="0"/>
-          <w:color w:val="auto"/>
-          <w:kern w:val="2"/>
+        </w:rPr>
+        <w:t xml:space="preserve"> </w:t>
+      </w:r>
+      <w:r>
+        <w:rPr>
           <w:sz w:val="24"/>
           <w:szCs w:val="24"/>
-          <w:lang w:val="es-CO" w:eastAsia="en-US"/>
-          <w14:ligatures w14:val="standardContextual"/>
-        </w:rPr>
-        <w:t>, 2025</w:t>
-      </w:r>
-      <w:r>
-        <w:rPr>
-          <w:rFonts w:asciiTheme="minorHAnsi" w:eastAsiaTheme="minorHAnsi" w:hAnsiTheme="minorHAnsi" w:cstheme="minorBidi"/>
-          <w:b w:val="0"/>
-          <w:color w:val="auto"/>
-          <w:kern w:val="2"/>
-          <w:sz w:val="24"/>
-          <w:szCs w:val="24"/>
-          <w:lang w:val="es-CO" w:eastAsia="en-US"/>
-          <w14:ligatures w14:val="standardContextual"/>
-        </w:rPr>
-        <w:t>.</w:t>
-      </w:r>
-      <w:bookmarkEnd w:id="21"/>
+        </w:rPr>
+        <w:t>SENA, 2025.</w:t>
+      </w:r>
     </w:p>
     <w:p>
       <w:pPr>
         <w:pStyle w:val="Ttulo2"/>
       </w:pPr>
-      <w:bookmarkStart w:id="22" w:name="_Toc211353662"/>
+      <w:bookmarkStart w:id="20" w:name="_Toc211434697"/>
       <w:r>
         <w:t>5.3 Tipos</w:t>
       </w:r>
-      <w:bookmarkEnd w:id="22"/>
+      <w:bookmarkEnd w:id="20"/>
     </w:p>
     <w:p>
       <w:pPr>
@@ -16083,12 +15858,12 @@
       <w:pPr>
         <w:pStyle w:val="Titulosgenerales"/>
       </w:pPr>
-      <w:bookmarkStart w:id="23" w:name="_Toc211353663"/>
+      <w:bookmarkStart w:id="21" w:name="_Toc211434698"/>
       <w:r>
         <w:lastRenderedPageBreak/>
         <w:t>Síntesis</w:t>
       </w:r>
-      <w:bookmarkEnd w:id="23"/>
+      <w:bookmarkEnd w:id="21"/>
       <w:r>
         <w:t xml:space="preserve"> </w:t>
       </w:r>
@@ -16165,12 +15940,12 @@
       <w:pPr>
         <w:pStyle w:val="Titulosgenerales"/>
       </w:pPr>
-      <w:bookmarkStart w:id="24" w:name="_Toc211353664"/>
+      <w:bookmarkStart w:id="22" w:name="_Toc211434699"/>
       <w:r>
         <w:lastRenderedPageBreak/>
         <w:t>Glosario</w:t>
       </w:r>
-      <w:bookmarkEnd w:id="24"/>
+      <w:bookmarkEnd w:id="22"/>
     </w:p>
     <w:p>
       <w:pPr>
@@ -16952,12 +16727,12 @@
       <w:pPr>
         <w:pStyle w:val="Titulosgenerales"/>
       </w:pPr>
-      <w:bookmarkStart w:id="25" w:name="_Toc211353665"/>
+      <w:bookmarkStart w:id="23" w:name="_Toc211434700"/>
       <w:r>
         <w:lastRenderedPageBreak/>
         <w:t>Material complementario</w:t>
       </w:r>
-      <w:bookmarkEnd w:id="25"/>
+      <w:bookmarkEnd w:id="23"/>
     </w:p>
     <w:tbl>
       <w:tblPr>
@@ -17688,12 +17463,12 @@
       <w:pPr>
         <w:pStyle w:val="Titulosgenerales"/>
       </w:pPr>
-      <w:bookmarkStart w:id="26" w:name="_Toc211353666"/>
+      <w:bookmarkStart w:id="24" w:name="_Toc211434701"/>
       <w:r>
         <w:lastRenderedPageBreak/>
         <w:t>Referencias bibliográficas</w:t>
       </w:r>
-      <w:bookmarkEnd w:id="26"/>
+      <w:bookmarkEnd w:id="24"/>
       <w:r>
         <w:t xml:space="preserve"> </w:t>
       </w:r>
@@ -17869,7 +17644,7 @@
       <w:pPr>
         <w:pStyle w:val="Titulosgenerales"/>
       </w:pPr>
-      <w:bookmarkStart w:id="27" w:name="_Toc211353667"/>
+      <w:bookmarkStart w:id="25" w:name="_Toc211434702"/>
       <w:r>
         <w:lastRenderedPageBreak/>
         <w:t>C</w:t>
@@ -17877,7 +17652,7 @@
       <w:r>
         <w:t>réditos</w:t>
       </w:r>
-      <w:bookmarkEnd w:id="27"/>
+      <w:bookmarkEnd w:id="25"/>
     </w:p>
     <w:tbl>
       <w:tblPr>
@@ -49556,17 +49331,6 @@
 </file>
 
 <file path=customXml/item1.xml><?xml version="1.0" encoding="utf-8"?>
-<p:properties xmlns:p="http://schemas.microsoft.com/office/2006/metadata/properties" xmlns:xsi="http://www.w3.org/2001/XMLSchema-instance" xmlns:pc="http://schemas.microsoft.com/office/infopath/2007/PartnerControls">
-  <documentManagement>
-    <TaxCatchAll xmlns="cb45339b-ced9-4d0d-8f64-77573914d53b" xsi:nil="true"/>
-    <lcf76f155ced4ddcb4097134ff3c332f xmlns="43a3ca16-9c26-4813-b83f-4aec9927b43f">
-      <Terms xmlns="http://schemas.microsoft.com/office/infopath/2007/PartnerControls"/>
-    </lcf76f155ced4ddcb4097134ff3c332f>
-  </documentManagement>
-</p:properties>
-</file>
-
-<file path=customXml/item2.xml><?xml version="1.0" encoding="utf-8"?>
 <?mso-contentType ?>
 <FormTemplates xmlns="http://schemas.microsoft.com/sharepoint/v3/contenttype/forms">
   <Display>DocumentLibraryForm</Display>
@@ -49575,31 +49339,43 @@
 </FormTemplates>
 </file>
 
+<file path=customXml/item2.xml><?xml version="1.0" encoding="utf-8"?>
+<p:properties xmlns:p="http://schemas.microsoft.com/office/2006/metadata/properties" xmlns:xsi="http://www.w3.org/2001/XMLSchema-instance" xmlns:pc="http://schemas.microsoft.com/office/infopath/2007/PartnerControls">
+  <documentManagement>
+    <TaxCatchAll xmlns="adccf511-daff-4bcb-9072-914cedbf4c7e" xsi:nil="true"/>
+    <lcf76f155ced4ddcb4097134ff3c332f xmlns="a70d3c18-0869-45a1-9f75-4b4b8f0f32be">
+      <Terms xmlns="http://schemas.microsoft.com/office/infopath/2007/PartnerControls"/>
+    </lcf76f155ced4ddcb4097134ff3c332f>
+  </documentManagement>
+</p:properties>
+</file>
+
 <file path=customXml/item3.xml><?xml version="1.0" encoding="utf-8"?>
-<ct:contentTypeSchema xmlns:ct="http://schemas.microsoft.com/office/2006/metadata/contentType" xmlns:ma="http://schemas.microsoft.com/office/2006/metadata/properties/metaAttributes" ct:_="" ma:_="" ma:contentTypeName="Documento" ma:contentTypeID="0x01010049282E1EDBE9234EA9E6D38F720E265F" ma:contentTypeVersion="15" ma:contentTypeDescription="Crear nuevo documento." ma:contentTypeScope="" ma:versionID="b31c7aa9eaf043a08b87120b3c4916e3">
-  <xsd:schema xmlns:xsd="http://www.w3.org/2001/XMLSchema" xmlns:xs="http://www.w3.org/2001/XMLSchema" xmlns:p="http://schemas.microsoft.com/office/2006/metadata/properties" xmlns:ns2="cb45339b-ced9-4d0d-8f64-77573914d53b" xmlns:ns3="43a3ca16-9c26-4813-b83f-4aec9927b43f" targetNamespace="http://schemas.microsoft.com/office/2006/metadata/properties" ma:root="true" ma:fieldsID="3533d065b04d75c457075bc55f1f5315" ns2:_="" ns3:_="">
-    <xsd:import namespace="cb45339b-ced9-4d0d-8f64-77573914d53b"/>
-    <xsd:import namespace="43a3ca16-9c26-4813-b83f-4aec9927b43f"/>
+<b:Sources xmlns:b="http://schemas.openxmlformats.org/officeDocument/2006/bibliography" xmlns="http://schemas.openxmlformats.org/officeDocument/2006/bibliography" SelectedStyle="\APASixthEditionOfficeOnline.xsl" StyleName="APA" Version="6"/>
+</file>
+
+<file path=customXml/item4.xml><?xml version="1.0" encoding="utf-8"?>
+<ct:contentTypeSchema xmlns:ct="http://schemas.microsoft.com/office/2006/metadata/contentType" xmlns:ma="http://schemas.microsoft.com/office/2006/metadata/properties/metaAttributes" ct:_="" ma:_="" ma:contentTypeName="Documento" ma:contentTypeID="0x010100FC2B1768DD5A774EB396CCAB0DE361C1" ma:contentTypeVersion="12" ma:contentTypeDescription="Crear nuevo documento." ma:contentTypeScope="" ma:versionID="73bbb3c317121ea3087ce0564dba81cf">
+  <xsd:schema xmlns:xsd="http://www.w3.org/2001/XMLSchema" xmlns:xs="http://www.w3.org/2001/XMLSchema" xmlns:p="http://schemas.microsoft.com/office/2006/metadata/properties" xmlns:ns2="a70d3c18-0869-45a1-9f75-4b4b8f0f32be" xmlns:ns3="adccf511-daff-4bcb-9072-914cedbf4c7e" targetNamespace="http://schemas.microsoft.com/office/2006/metadata/properties" ma:root="true" ma:fieldsID="89b5199a66abea40ca7ec6b263fc5e35" ns2:_="" ns3:_="">
+    <xsd:import namespace="a70d3c18-0869-45a1-9f75-4b4b8f0f32be"/>
+    <xsd:import namespace="adccf511-daff-4bcb-9072-914cedbf4c7e"/>
     <xsd:element name="properties">
       <xsd:complexType>
         <xsd:sequence>
           <xsd:element name="documentManagement">
             <xsd:complexType>
               <xsd:all>
-                <xsd:element ref="ns2:SharedWithUsers" minOccurs="0"/>
-                <xsd:element ref="ns2:SharedWithDetails" minOccurs="0"/>
-                <xsd:element ref="ns3:MediaServiceMetadata" minOccurs="0"/>
-                <xsd:element ref="ns3:MediaServiceFastMetadata" minOccurs="0"/>
-                <xsd:element ref="ns3:MediaServiceDateTaken" minOccurs="0"/>
-                <xsd:element ref="ns3:MediaServiceObjectDetectorVersions" minOccurs="0"/>
-                <xsd:element ref="ns3:MediaLengthInSeconds" minOccurs="0"/>
-                <xsd:element ref="ns3:MediaServiceLocation" minOccurs="0"/>
-                <xsd:element ref="ns3:MediaServiceGenerationTime" minOccurs="0"/>
-                <xsd:element ref="ns3:MediaServiceEventHashCode" minOccurs="0"/>
-                <xsd:element ref="ns3:lcf76f155ced4ddcb4097134ff3c332f" minOccurs="0"/>
-                <xsd:element ref="ns2:TaxCatchAll" minOccurs="0"/>
-                <xsd:element ref="ns3:MediaServiceOCR" minOccurs="0"/>
-                <xsd:element ref="ns3:MediaServiceSearchProperties" minOccurs="0"/>
+                <xsd:element ref="ns2:MediaServiceMetadata" minOccurs="0"/>
+                <xsd:element ref="ns2:MediaServiceFastMetadata" minOccurs="0"/>
+                <xsd:element ref="ns2:MediaServiceSearchProperties" minOccurs="0"/>
+                <xsd:element ref="ns2:MediaServiceDateTaken" minOccurs="0"/>
+                <xsd:element ref="ns2:MediaServiceGenerationTime" minOccurs="0"/>
+                <xsd:element ref="ns2:MediaServiceEventHashCode" minOccurs="0"/>
+                <xsd:element ref="ns2:MediaLengthInSeconds" minOccurs="0"/>
+                <xsd:element ref="ns2:lcf76f155ced4ddcb4097134ff3c332f" minOccurs="0"/>
+                <xsd:element ref="ns3:TaxCatchAll" minOccurs="0"/>
+                <xsd:element ref="ns2:MediaServiceOCR" minOccurs="0"/>
+                <xsd:element ref="ns2:MediaServiceBillingMetadata" minOccurs="0"/>
               </xsd:all>
             </xsd:complexType>
           </xsd:element>
@@ -49607,36 +49383,68 @@
       </xsd:complexType>
     </xsd:element>
   </xsd:schema>
-  <xsd:schema xmlns:xsd="http://www.w3.org/2001/XMLSchema" xmlns:xs="http://www.w3.org/2001/XMLSchema" xmlns:dms="http://schemas.microsoft.com/office/2006/documentManagement/types" xmlns:pc="http://schemas.microsoft.com/office/infopath/2007/PartnerControls" targetNamespace="cb45339b-ced9-4d0d-8f64-77573914d53b" elementFormDefault="qualified">
+  <xsd:schema xmlns:xsd="http://www.w3.org/2001/XMLSchema" xmlns:xs="http://www.w3.org/2001/XMLSchema" xmlns:dms="http://schemas.microsoft.com/office/2006/documentManagement/types" xmlns:pc="http://schemas.microsoft.com/office/infopath/2007/PartnerControls" targetNamespace="a70d3c18-0869-45a1-9f75-4b4b8f0f32be" elementFormDefault="qualified">
     <xsd:import namespace="http://schemas.microsoft.com/office/2006/documentManagement/types"/>
     <xsd:import namespace="http://schemas.microsoft.com/office/infopath/2007/PartnerControls"/>
-    <xsd:element name="SharedWithUsers" ma:index="8" nillable="true" ma:displayName="Compartido con" ma:internalName="SharedWithUsers" ma:readOnly="true">
+    <xsd:element name="MediaServiceMetadata" ma:index="8" nillable="true" ma:displayName="MediaServiceMetadata" ma:hidden="true" ma:internalName="MediaServiceMetadata" ma:readOnly="true">
+      <xsd:simpleType>
+        <xsd:restriction base="dms:Note"/>
+      </xsd:simpleType>
+    </xsd:element>
+    <xsd:element name="MediaServiceFastMetadata" ma:index="9" nillable="true" ma:displayName="MediaServiceFastMetadata" ma:hidden="true" ma:internalName="MediaServiceFastMetadata" ma:readOnly="true">
+      <xsd:simpleType>
+        <xsd:restriction base="dms:Note"/>
+      </xsd:simpleType>
+    </xsd:element>
+    <xsd:element name="MediaServiceSearchProperties" ma:index="10" nillable="true" ma:displayName="MediaServiceSearchProperties" ma:hidden="true" ma:internalName="MediaServiceSearchProperties" ma:readOnly="true">
+      <xsd:simpleType>
+        <xsd:restriction base="dms:Note"/>
+      </xsd:simpleType>
+    </xsd:element>
+    <xsd:element name="MediaServiceDateTaken" ma:index="11" nillable="true" ma:displayName="MediaServiceDateTaken" ma:hidden="true" ma:indexed="true" ma:internalName="MediaServiceDateTaken" ma:readOnly="true">
+      <xsd:simpleType>
+        <xsd:restriction base="dms:Text"/>
+      </xsd:simpleType>
+    </xsd:element>
+    <xsd:element name="MediaServiceGenerationTime" ma:index="12" nillable="true" ma:displayName="MediaServiceGenerationTime" ma:hidden="true" ma:internalName="MediaServiceGenerationTime" ma:readOnly="true">
+      <xsd:simpleType>
+        <xsd:restriction base="dms:Text"/>
+      </xsd:simpleType>
+    </xsd:element>
+    <xsd:element name="MediaServiceEventHashCode" ma:index="13" nillable="true" ma:displayName="MediaServiceEventHashCode" ma:hidden="true" ma:internalName="MediaServiceEventHashCode" ma:readOnly="true">
+      <xsd:simpleType>
+        <xsd:restriction base="dms:Text"/>
+      </xsd:simpleType>
+    </xsd:element>
+    <xsd:element name="MediaLengthInSeconds" ma:index="14" nillable="true" ma:displayName="MediaLengthInSeconds" ma:hidden="true" ma:internalName="MediaLengthInSeconds" ma:readOnly="true">
+      <xsd:simpleType>
+        <xsd:restriction base="dms:Unknown"/>
+      </xsd:simpleType>
+    </xsd:element>
+    <xsd:element name="lcf76f155ced4ddcb4097134ff3c332f" ma:index="16" nillable="true" ma:taxonomy="true" ma:internalName="lcf76f155ced4ddcb4097134ff3c332f" ma:taxonomyFieldName="MediaServiceImageTags" ma:displayName="Etiquetas de imagen" ma:readOnly="false" ma:fieldId="{5cf76f15-5ced-4ddc-b409-7134ff3c332f}" ma:taxonomyMulti="true" ma:sspId="d33c8c81-5745-4931-bcc4-c2aeafe86780" ma:termSetId="09814cd3-568e-fe90-9814-8d621ff8fb84" ma:anchorId="fba54fb3-c3e1-fe81-a776-ca4b69148c4d" ma:open="true" ma:isKeyword="false">
       <xsd:complexType>
-        <xsd:complexContent>
-          <xsd:extension base="dms:UserMulti">
-            <xsd:sequence>
-              <xsd:element name="UserInfo" minOccurs="0" maxOccurs="unbounded">
-                <xsd:complexType>
-                  <xsd:sequence>
-                    <xsd:element name="DisplayName" type="xsd:string" minOccurs="0"/>
-                    <xsd:element name="AccountId" type="dms:UserId" minOccurs="0" nillable="true"/>
-                    <xsd:element name="AccountType" type="xsd:string" minOccurs="0"/>
-                  </xsd:sequence>
-                </xsd:complexType>
-              </xsd:element>
-            </xsd:sequence>
-          </xsd:extension>
-        </xsd:complexContent>
+        <xsd:sequence>
+          <xsd:element ref="pc:Terms" minOccurs="0" maxOccurs="1"/>
+        </xsd:sequence>
       </xsd:complexType>
     </xsd:element>
-    <xsd:element name="SharedWithDetails" ma:index="9" nillable="true" ma:displayName="Detalles de uso compartido" ma:internalName="SharedWithDetails" ma:readOnly="true">
+    <xsd:element name="MediaServiceOCR" ma:index="18" nillable="true" ma:displayName="Extracted Text" ma:internalName="MediaServiceOCR" ma:readOnly="true">
       <xsd:simpleType>
         <xsd:restriction base="dms:Note">
           <xsd:maxLength value="255"/>
         </xsd:restriction>
       </xsd:simpleType>
     </xsd:element>
-    <xsd:element name="TaxCatchAll" ma:index="20" nillable="true" ma:displayName="Taxonomy Catch All Column" ma:hidden="true" ma:list="{2f40a149-578b-41a1-8845-c88bc1831770}" ma:internalName="TaxCatchAll" ma:showField="CatchAllData" ma:web="cb45339b-ced9-4d0d-8f64-77573914d53b">
+    <xsd:element name="MediaServiceBillingMetadata" ma:index="19" nillable="true" ma:displayName="MediaServiceBillingMetadata" ma:hidden="true" ma:internalName="MediaServiceBillingMetadata" ma:readOnly="true">
+      <xsd:simpleType>
+        <xsd:restriction base="dms:Note"/>
+      </xsd:simpleType>
+    </xsd:element>
+  </xsd:schema>
+  <xsd:schema xmlns:xsd="http://www.w3.org/2001/XMLSchema" xmlns:xs="http://www.w3.org/2001/XMLSchema" xmlns:dms="http://schemas.microsoft.com/office/2006/documentManagement/types" xmlns:pc="http://schemas.microsoft.com/office/infopath/2007/PartnerControls" targetNamespace="adccf511-daff-4bcb-9072-914cedbf4c7e" elementFormDefault="qualified">
+    <xsd:import namespace="http://schemas.microsoft.com/office/2006/documentManagement/types"/>
+    <xsd:import namespace="http://schemas.microsoft.com/office/infopath/2007/PartnerControls"/>
+    <xsd:element name="TaxCatchAll" ma:index="17" nillable="true" ma:displayName="Taxonomy Catch All Column" ma:hidden="true" ma:list="{d55fdbc5-1632-489d-aeea-ba6fd7407963}" ma:internalName="TaxCatchAll" ma:showField="CatchAllData" ma:web="adccf511-daff-4bcb-9072-914cedbf4c7e">
       <xsd:complexType>
         <xsd:complexContent>
           <xsd:extension base="dms:MultiChoiceLookup">
@@ -49646,69 +49454,6 @@
           </xsd:extension>
         </xsd:complexContent>
       </xsd:complexType>
-    </xsd:element>
-  </xsd:schema>
-  <xsd:schema xmlns:xsd="http://www.w3.org/2001/XMLSchema" xmlns:xs="http://www.w3.org/2001/XMLSchema" xmlns:dms="http://schemas.microsoft.com/office/2006/documentManagement/types" xmlns:pc="http://schemas.microsoft.com/office/infopath/2007/PartnerControls" targetNamespace="43a3ca16-9c26-4813-b83f-4aec9927b43f" elementFormDefault="qualified">
-    <xsd:import namespace="http://schemas.microsoft.com/office/2006/documentManagement/types"/>
-    <xsd:import namespace="http://schemas.microsoft.com/office/infopath/2007/PartnerControls"/>
-    <xsd:element name="MediaServiceMetadata" ma:index="10" nillable="true" ma:displayName="MediaServiceMetadata" ma:hidden="true" ma:internalName="MediaServiceMetadata" ma:readOnly="true">
-      <xsd:simpleType>
-        <xsd:restriction base="dms:Note"/>
-      </xsd:simpleType>
-    </xsd:element>
-    <xsd:element name="MediaServiceFastMetadata" ma:index="11" nillable="true" ma:displayName="MediaServiceFastMetadata" ma:hidden="true" ma:internalName="MediaServiceFastMetadata" ma:readOnly="true">
-      <xsd:simpleType>
-        <xsd:restriction base="dms:Note"/>
-      </xsd:simpleType>
-    </xsd:element>
-    <xsd:element name="MediaServiceDateTaken" ma:index="12" nillable="true" ma:displayName="MediaServiceDateTaken" ma:hidden="true" ma:indexed="true" ma:internalName="MediaServiceDateTaken" ma:readOnly="true">
-      <xsd:simpleType>
-        <xsd:restriction base="dms:Text"/>
-      </xsd:simpleType>
-    </xsd:element>
-    <xsd:element name="MediaServiceObjectDetectorVersions" ma:index="13" nillable="true" ma:displayName="MediaServiceObjectDetectorVersions" ma:hidden="true" ma:indexed="true" ma:internalName="MediaServiceObjectDetectorVersions" ma:readOnly="true">
-      <xsd:simpleType>
-        <xsd:restriction base="dms:Text"/>
-      </xsd:simpleType>
-    </xsd:element>
-    <xsd:element name="MediaLengthInSeconds" ma:index="14" nillable="true" ma:displayName="MediaLengthInSeconds" ma:hidden="true" ma:internalName="MediaLengthInSeconds" ma:readOnly="true">
-      <xsd:simpleType>
-        <xsd:restriction base="dms:Unknown"/>
-      </xsd:simpleType>
-    </xsd:element>
-    <xsd:element name="MediaServiceLocation" ma:index="15" nillable="true" ma:displayName="Location" ma:indexed="true" ma:internalName="MediaServiceLocation" ma:readOnly="true">
-      <xsd:simpleType>
-        <xsd:restriction base="dms:Text"/>
-      </xsd:simpleType>
-    </xsd:element>
-    <xsd:element name="MediaServiceGenerationTime" ma:index="16" nillable="true" ma:displayName="MediaServiceGenerationTime" ma:hidden="true" ma:internalName="MediaServiceGenerationTime" ma:readOnly="true">
-      <xsd:simpleType>
-        <xsd:restriction base="dms:Text"/>
-      </xsd:simpleType>
-    </xsd:element>
-    <xsd:element name="MediaServiceEventHashCode" ma:index="17" nillable="true" ma:displayName="MediaServiceEventHashCode" ma:hidden="true" ma:internalName="MediaServiceEventHashCode" ma:readOnly="true">
-      <xsd:simpleType>
-        <xsd:restriction base="dms:Text"/>
-      </xsd:simpleType>
-    </xsd:element>
-    <xsd:element name="lcf76f155ced4ddcb4097134ff3c332f" ma:index="19" nillable="true" ma:taxonomy="true" ma:internalName="lcf76f155ced4ddcb4097134ff3c332f" ma:taxonomyFieldName="MediaServiceImageTags" ma:displayName="Etiquetas de imagen" ma:readOnly="false" ma:fieldId="{5cf76f15-5ced-4ddc-b409-7134ff3c332f}" ma:taxonomyMulti="true" ma:sspId="d33c8c81-5745-4931-bcc4-c2aeafe86780" ma:termSetId="09814cd3-568e-fe90-9814-8d621ff8fb84" ma:anchorId="fba54fb3-c3e1-fe81-a776-ca4b69148c4d" ma:open="true" ma:isKeyword="false">
-      <xsd:complexType>
-        <xsd:sequence>
-          <xsd:element ref="pc:Terms" minOccurs="0" maxOccurs="1"/>
-        </xsd:sequence>
-      </xsd:complexType>
-    </xsd:element>
-    <xsd:element name="MediaServiceOCR" ma:index="21" nillable="true" ma:displayName="Extracted Text" ma:internalName="MediaServiceOCR" ma:readOnly="true">
-      <xsd:simpleType>
-        <xsd:restriction base="dms:Note">
-          <xsd:maxLength value="255"/>
-        </xsd:restriction>
-      </xsd:simpleType>
-    </xsd:element>
-    <xsd:element name="MediaServiceSearchProperties" ma:index="22" nillable="true" ma:displayName="MediaServiceSearchProperties" ma:hidden="true" ma:internalName="MediaServiceSearchProperties" ma:readOnly="true">
-      <xsd:simpleType>
-        <xsd:restriction base="dms:Note"/>
-      </xsd:simpleType>
     </xsd:element>
   </xsd:schema>
   <xsd:schema xmlns="http://schemas.openxmlformats.org/package/2006/metadata/core-properties" xmlns:xsd="http://www.w3.org/2001/XMLSchema" xmlns:xsi="http://www.w3.org/2001/XMLSchema-instance" xmlns:dc="http://purl.org/dc/elements/1.1/" xmlns:dcterms="http://purl.org/dc/terms/" xmlns:odoc="http://schemas.microsoft.com/internal/obd" targetNamespace="http://schemas.openxmlformats.org/package/2006/metadata/core-properties" elementFormDefault="qualified" attributeFormDefault="unqualified" blockDefault="#all">
@@ -49810,11 +49555,15 @@
 </ct:contentTypeSchema>
 </file>
 
-<file path=customXml/item4.xml><?xml version="1.0" encoding="utf-8"?>
-<b:Sources xmlns:b="http://schemas.openxmlformats.org/officeDocument/2006/bibliography" xmlns="http://schemas.openxmlformats.org/officeDocument/2006/bibliography" SelectedStyle="\APASixthEditionOfficeOnline.xsl" StyleName="APA" Version="6"/>
+<file path=customXml/itemProps1.xml><?xml version="1.0" encoding="utf-8"?>
+<ds:datastoreItem xmlns:ds="http://schemas.openxmlformats.org/officeDocument/2006/customXml" ds:itemID="{81CBDEC1-3B00-44ED-AD36-0268077980BA}">
+  <ds:schemaRefs>
+    <ds:schemaRef ds:uri="http://schemas.microsoft.com/sharepoint/v3/contenttype/forms"/>
+  </ds:schemaRefs>
+</ds:datastoreItem>
 </file>
 
-<file path=customXml/itemProps1.xml><?xml version="1.0" encoding="utf-8"?>
+<file path=customXml/itemProps2.xml><?xml version="1.0" encoding="utf-8"?>
 <ds:datastoreItem xmlns:ds="http://schemas.openxmlformats.org/officeDocument/2006/customXml" ds:itemID="{6929C9FE-9F22-4B98-96EF-1B541B3BD0B2}">
   <ds:schemaRefs>
     <ds:schemaRef ds:uri="http://schemas.microsoft.com/office/2006/metadata/properties"/>
@@ -49825,37 +49574,14 @@
 </ds:datastoreItem>
 </file>
 
-<file path=customXml/itemProps2.xml><?xml version="1.0" encoding="utf-8"?>
-<ds:datastoreItem xmlns:ds="http://schemas.openxmlformats.org/officeDocument/2006/customXml" ds:itemID="{81CBDEC1-3B00-44ED-AD36-0268077980BA}">
+<file path=customXml/itemProps3.xml><?xml version="1.0" encoding="utf-8"?>
+<ds:datastoreItem xmlns:ds="http://schemas.openxmlformats.org/officeDocument/2006/customXml" ds:itemID="{E8AB44A3-7C62-4BD2-82ED-8ABC209970FA}">
   <ds:schemaRefs>
-    <ds:schemaRef ds:uri="http://schemas.microsoft.com/sharepoint/v3/contenttype/forms"/>
-  </ds:schemaRefs>
-</ds:datastoreItem>
-</file>
-
-<file path=customXml/itemProps3.xml><?xml version="1.0" encoding="utf-8"?>
-<ds:datastoreItem xmlns:ds="http://schemas.openxmlformats.org/officeDocument/2006/customXml" ds:itemID="{DF43E046-DB0C-42D1-8C73-AE38B52F1ED7}">
-  <ds:schemaRefs>
-    <ds:schemaRef ds:uri="http://schemas.microsoft.com/office/2006/metadata/contentType"/>
-    <ds:schemaRef ds:uri="http://schemas.microsoft.com/office/2006/metadata/properties/metaAttributes"/>
-    <ds:schemaRef ds:uri="http://www.w3.org/2001/XMLSchema"/>
-    <ds:schemaRef ds:uri="http://schemas.microsoft.com/office/2006/metadata/properties"/>
-    <ds:schemaRef ds:uri="cb45339b-ced9-4d0d-8f64-77573914d53b"/>
-    <ds:schemaRef ds:uri="43a3ca16-9c26-4813-b83f-4aec9927b43f"/>
-    <ds:schemaRef ds:uri="http://schemas.microsoft.com/office/2006/documentManagement/types"/>
-    <ds:schemaRef ds:uri="http://schemas.microsoft.com/office/infopath/2007/PartnerControls"/>
-    <ds:schemaRef ds:uri="http://schemas.openxmlformats.org/package/2006/metadata/core-properties"/>
-    <ds:schemaRef ds:uri="http://purl.org/dc/elements/1.1/"/>
-    <ds:schemaRef ds:uri="http://purl.org/dc/terms/"/>
-    <ds:schemaRef ds:uri="http://schemas.microsoft.com/internal/obd"/>
+    <ds:schemaRef ds:uri="http://schemas.openxmlformats.org/officeDocument/2006/bibliography"/>
   </ds:schemaRefs>
 </ds:datastoreItem>
 </file>
 
 <file path=customXml/itemProps4.xml><?xml version="1.0" encoding="utf-8"?>
-<ds:datastoreItem xmlns:ds="http://schemas.openxmlformats.org/officeDocument/2006/customXml" ds:itemID="{E8AB44A3-7C62-4BD2-82ED-8ABC209970FA}">
-  <ds:schemaRefs>
-    <ds:schemaRef ds:uri="http://schemas.openxmlformats.org/officeDocument/2006/bibliography"/>
-  </ds:schemaRefs>
-</ds:datastoreItem>
+<ds:datastoreItem xmlns:ds="http://schemas.openxmlformats.org/officeDocument/2006/customXml" ds:itemID="{72BF5F14-FBE8-4355-BED5-369398E75BC0}"/>
 </file>
</xml_diff>